<commit_message>
update UI scope 2
</commit_message>
<xml_diff>
--- a/static/VPEI_report.docx
+++ b/static/VPEI_report.docx
@@ -1,29 +1,51 @@
 
 <file path=word/document.xml><?xml version="1.0" encoding="utf-8"?>
-<w:document xmlns:wpc="http://schemas.microsoft.com/office/word/2010/wordprocessingCanvas" xmlns:cx="http://schemas.microsoft.com/office/drawing/2014/chartex" xmlns:cx1="http://schemas.microsoft.com/office/drawing/2015/9/8/chartex" xmlns:cx2="http://schemas.microsoft.com/office/drawing/2015/10/21/chartex" xmlns:cx3="http://schemas.microsoft.com/office/drawing/2016/5/9/chartex" xmlns:cx4="http://schemas.microsoft.com/office/drawing/2016/5/10/chartex" xmlns:cx5="http://schemas.microsoft.com/office/drawing/2016/5/11/chartex" xmlns:cx6="http://schemas.microsoft.com/office/drawing/2016/5/12/chartex" xmlns:cx7="http://schemas.microsoft.com/office/drawing/2016/5/13/chartex" xmlns:cx8="http://schemas.microsoft.com/office/drawing/2016/5/14/chartex" xmlns:mc="http://schemas.openxmlformats.org/markup-compatibility/2006" xmlns:aink="http://schemas.microsoft.com/office/drawing/2016/ink" xmlns:am3d="http://schemas.microsoft.com/office/drawing/2017/model3d" xmlns:o="urn:schemas-microsoft-com:office:office" xmlns:oel="http://schemas.microsoft.com/office/2019/extlst" xmlns:r="http://schemas.openxmlformats.org/officeDocument/2006/relationships" xmlns:m="http://schemas.openxmlformats.org/officeDocument/2006/math" xmlns:v="urn:schemas-microsoft-com:vml" xmlns:wp14="http://schemas.microsoft.com/office/word/2010/wordprocessingDrawing" xmlns:wp="http://schemas.openxmlformats.org/drawingml/2006/wordprocessingDrawing" xmlns:w10="urn:schemas-microsoft-com:office:word" xmlns:w="http://schemas.openxmlformats.org/wordprocessingml/2006/main" xmlns:w14="http://schemas.microsoft.com/office/word/2010/wordml" xmlns:w15="http://schemas.microsoft.com/office/word/2012/wordml" xmlns:w16cex="http://schemas.microsoft.com/office/word/2018/wordml/cex" xmlns:w16cid="http://schemas.microsoft.com/office/word/2016/wordml/cid" xmlns:w16="http://schemas.microsoft.com/office/word/2018/wordml" xmlns:w16du="http://schemas.microsoft.com/office/word/2023/wordml/word16du" xmlns:w16sdtdh="http://schemas.microsoft.com/office/word/2020/wordml/sdtdatahash" xmlns:w16sdtfl="http://schemas.microsoft.com/office/word/2024/wordml/sdtformatlock" xmlns:w16se="http://schemas.microsoft.com/office/word/2015/wordml/symex" xmlns:wpg="http://schemas.microsoft.com/office/word/2010/wordprocessingGroup" xmlns:wpi="http://schemas.microsoft.com/office/word/2010/wordprocessingInk" xmlns:wne="http://schemas.microsoft.com/office/word/2006/wordml" xmlns:wps="http://schemas.microsoft.com/office/word/2010/wordprocessingShape" mc:Ignorable="w14 w15 w16se w16cid w16 w16cex w16sdtdh w16sdtfl w16du wp14">
+<w:document xmlns:wpc="http://schemas.microsoft.com/office/word/2010/wordprocessingCanvas" xmlns:mc="http://schemas.openxmlformats.org/markup-compatibility/2006" xmlns:o="urn:schemas-microsoft-com:office:office" xmlns:r="http://schemas.openxmlformats.org/officeDocument/2006/relationships" xmlns:m="http://schemas.openxmlformats.org/officeDocument/2006/math" xmlns:v="urn:schemas-microsoft-com:vml" xmlns:wp14="http://schemas.microsoft.com/office/word/2010/wordprocessingDrawing" xmlns:wp="http://schemas.openxmlformats.org/drawingml/2006/wordprocessingDrawing" xmlns:w="http://schemas.openxmlformats.org/wordprocessingml/2006/main" xmlns:w14="http://schemas.microsoft.com/office/word/2010/wordml" xmlns:w10="urn:schemas-microsoft-com:office:word" xmlns:w15="http://schemas.microsoft.com/office/word/2012/wordml" xmlns:wpg="http://schemas.microsoft.com/office/word/2010/wordprocessingGroup" xmlns:wpi="http://schemas.microsoft.com/office/word/2010/wordprocessingInk" xmlns:wne="http://schemas.microsoft.com/office/word/2006/wordml" xmlns:wps="http://schemas.microsoft.com/office/word/2010/wordprocessingShape" xmlns:wpsCustomData="http://www.wps.cn/officeDocument/2013/wpsCustomData" mc:Ignorable="w14 w15 wp14">
   <w:body>
     <w:tbl>
       <w:tblPr>
-        <w:tblStyle w:val="TableGrid"/>
+        <w:tblStyle w:val="19"/>
         <w:tblW w:w="9923" w:type="dxa"/>
         <w:jc w:val="center"/>
         <w:tblBorders>
-          <w:top w:val="none" w:sz="0" w:space="0" w:color="auto"/>
-          <w:left w:val="none" w:sz="0" w:space="0" w:color="auto"/>
-          <w:bottom w:val="none" w:sz="0" w:space="0" w:color="auto"/>
-          <w:right w:val="none" w:sz="0" w:space="0" w:color="auto"/>
-          <w:insideH w:val="none" w:sz="0" w:space="0" w:color="auto"/>
-          <w:insideV w:val="none" w:sz="0" w:space="0" w:color="auto"/>
+          <w:top w:val="none" w:color="auto" w:sz="0" w:space="0"/>
+          <w:left w:val="none" w:color="auto" w:sz="0" w:space="0"/>
+          <w:bottom w:val="none" w:color="auto" w:sz="0" w:space="0"/>
+          <w:right w:val="none" w:color="auto" w:sz="0" w:space="0"/>
+          <w:insideH w:val="none" w:color="auto" w:sz="0" w:space="0"/>
+          <w:insideV w:val="none" w:color="auto" w:sz="0" w:space="0"/>
         </w:tblBorders>
-        <w:tblLook w:val="04A0" w:firstRow="1" w:lastRow="0" w:firstColumn="1" w:lastColumn="0" w:noHBand="0" w:noVBand="1"/>
+        <w:tblLayout w:type="autofit"/>
+        <w:tblCellMar>
+          <w:top w:w="0" w:type="dxa"/>
+          <w:left w:w="108" w:type="dxa"/>
+          <w:bottom w:w="0" w:type="dxa"/>
+          <w:right w:w="108" w:type="dxa"/>
+        </w:tblCellMar>
       </w:tblPr>
       <w:tblGrid>
         <w:gridCol w:w="4395"/>
         <w:gridCol w:w="5528"/>
       </w:tblGrid>
       <w:tr>
+        <w:tblPrEx>
+          <w:tblBorders>
+            <w:top w:val="none" w:color="auto" w:sz="0" w:space="0"/>
+            <w:left w:val="none" w:color="auto" w:sz="0" w:space="0"/>
+            <w:bottom w:val="none" w:color="auto" w:sz="0" w:space="0"/>
+            <w:right w:val="none" w:color="auto" w:sz="0" w:space="0"/>
+            <w:insideH w:val="none" w:color="auto" w:sz="0" w:space="0"/>
+            <w:insideV w:val="none" w:color="auto" w:sz="0" w:space="0"/>
+          </w:tblBorders>
+          <w:tblCellMar>
+            <w:top w:w="0" w:type="dxa"/>
+            <w:left w:w="108" w:type="dxa"/>
+            <w:bottom w:w="0" w:type="dxa"/>
+            <w:right w:w="108" w:type="dxa"/>
+          </w:tblCellMar>
+        </w:tblPrEx>
         <w:trPr>
-          <w:trHeight w:val="1124"/>
+          <w:trHeight w:val="1124" w:hRule="atLeast"/>
           <w:jc w:val="center"/>
         </w:trPr>
         <w:tc>
@@ -39,7 +61,7 @@
                 <w:rFonts w:cs="Times New Roman"/>
                 <w:b w:val="0"/>
                 <w:bCs/>
-                <w:color w:val="3A7C22" w:themeColor="accent6" w:themeShade="BF"/>
+                <w:color w:val="3B7D23" w:themeColor="accent6" w:themeShade="BF"/>
                 <w:sz w:val="24"/>
                 <w:szCs w:val="24"/>
                 <w:lang w:val="vi-VN"/>
@@ -48,22 +70,21 @@
             <w:r>
               <w:rPr>
                 <w:rFonts w:cs="Times New Roman"/>
-                <w:noProof/>
-                <w:color w:val="3A7C22" w:themeColor="accent6" w:themeShade="BF"/>
+                <w:color w:val="3B7D23" w:themeColor="accent6" w:themeShade="BF"/>
                 <w:sz w:val="26"/>
                 <w:szCs w:val="26"/>
                 <w:lang w:val="vi-VN"/>
               </w:rPr>
               <w:drawing>
-                <wp:anchor distT="0" distB="0" distL="114300" distR="114300" simplePos="0" relativeHeight="251659264" behindDoc="0" locked="0" layoutInCell="1" allowOverlap="1" wp14:anchorId="5AC34769" wp14:editId="6F0B869D">
+                <wp:anchor distT="0" distB="0" distL="114300" distR="114300" simplePos="0" relativeHeight="251660288" behindDoc="0" locked="0" layoutInCell="1" allowOverlap="1">
                   <wp:simplePos x="0" y="0"/>
                   <wp:positionH relativeFrom="column">
-                    <wp:posOffset>652579</wp:posOffset>
+                    <wp:posOffset>652145</wp:posOffset>
                   </wp:positionH>
                   <wp:positionV relativeFrom="paragraph">
                     <wp:posOffset>210820</wp:posOffset>
                   </wp:positionV>
-                  <wp:extent cx="1091435" cy="324092"/>
+                  <wp:extent cx="1091565" cy="323850"/>
                   <wp:effectExtent l="0" t="0" r="1270" b="6350"/>
                   <wp:wrapNone/>
                   <wp:docPr id="1059779800" name="Picture 1" descr="A blue letters on a white background&#10;&#10;AI-generated content may be incorrect."/>
@@ -75,10 +96,12 @@
                       <pic:pic xmlns:pic="http://schemas.openxmlformats.org/drawingml/2006/picture">
                         <pic:nvPicPr>
                           <pic:cNvPr id="1059779800" name="Picture 1" descr="A blue letters on a white background&#10;&#10;AI-generated content may be incorrect."/>
-                          <pic:cNvPicPr/>
+                          <pic:cNvPicPr>
+                            <a:picLocks noChangeAspect="1"/>
+                          </pic:cNvPicPr>
                         </pic:nvPicPr>
-                        <pic:blipFill rotWithShape="1">
-                          <a:blip r:embed="rId7" cstate="print">
+                        <pic:blipFill>
+                          <a:blip r:embed="rId9" cstate="print">
                             <a:extLst>
                               <a:ext uri="{28A0092B-C50C-407E-A947-70E740481C1C}">
                                 <a14:useLocalDpi xmlns:a14="http://schemas.microsoft.com/office/drawing/2010/main" val="0"/>
@@ -90,7 +113,7 @@
                             <a:fillRect/>
                           </a:stretch>
                         </pic:blipFill>
-                        <pic:spPr bwMode="auto">
+                        <pic:spPr>
                           <a:xfrm>
                             <a:off x="0" y="0"/>
                             <a:ext cx="1091435" cy="324092"/>
@@ -101,43 +124,31 @@
                           <a:ln>
                             <a:noFill/>
                           </a:ln>
-                          <a:extLst>
-                            <a:ext uri="{53640926-AAD7-44D8-BBD7-CCE9431645EC}">
-                              <a14:shadowObscured xmlns:a14="http://schemas.microsoft.com/office/drawing/2010/main"/>
-                            </a:ext>
-                          </a:extLst>
                         </pic:spPr>
                       </pic:pic>
                     </a:graphicData>
                   </a:graphic>
-                  <wp14:sizeRelH relativeFrom="page">
-                    <wp14:pctWidth>0</wp14:pctWidth>
-                  </wp14:sizeRelH>
-                  <wp14:sizeRelV relativeFrom="page">
-                    <wp14:pctHeight>0</wp14:pctHeight>
-                  </wp14:sizeRelV>
                 </wp:anchor>
               </w:drawing>
             </w:r>
             <w:r>
               <w:rPr>
                 <w:rFonts w:cs="Times New Roman"/>
-                <w:noProof/>
-                <w:color w:val="3A7C22" w:themeColor="accent6" w:themeShade="BF"/>
+                <w:color w:val="3B7D23" w:themeColor="accent6" w:themeShade="BF"/>
                 <w:sz w:val="26"/>
                 <w:szCs w:val="26"/>
                 <w:lang w:val="vi-VN"/>
               </w:rPr>
               <w:drawing>
-                <wp:anchor distT="0" distB="0" distL="114300" distR="114300" simplePos="0" relativeHeight="251658240" behindDoc="0" locked="0" layoutInCell="1" allowOverlap="1" wp14:anchorId="2F358999" wp14:editId="350A1647">
+                <wp:anchor distT="0" distB="0" distL="114300" distR="114300" simplePos="0" relativeHeight="251659264" behindDoc="0" locked="0" layoutInCell="1" allowOverlap="1">
                   <wp:simplePos x="0" y="0"/>
                   <wp:positionH relativeFrom="column">
-                    <wp:posOffset>-150865</wp:posOffset>
+                    <wp:posOffset>-150495</wp:posOffset>
                   </wp:positionH>
                   <wp:positionV relativeFrom="paragraph">
                     <wp:posOffset>-118110</wp:posOffset>
                   </wp:positionV>
-                  <wp:extent cx="979154" cy="706056"/>
+                  <wp:extent cx="979170" cy="706120"/>
                   <wp:effectExtent l="0" t="0" r="0" b="0"/>
                   <wp:wrapNone/>
                   <wp:docPr id="1660458712" name="Picture 1" descr="A logo of a ship with a leaf&#10;&#10;AI-generated content may be incorrect."/>
@@ -149,10 +160,12 @@
                       <pic:pic xmlns:pic="http://schemas.openxmlformats.org/drawingml/2006/picture">
                         <pic:nvPicPr>
                           <pic:cNvPr id="1660458712" name="Picture 1" descr="A logo of a ship with a leaf&#10;&#10;AI-generated content may be incorrect."/>
-                          <pic:cNvPicPr/>
+                          <pic:cNvPicPr>
+                            <a:picLocks noChangeAspect="1"/>
+                          </pic:cNvPicPr>
                         </pic:nvPicPr>
                         <pic:blipFill>
-                          <a:blip r:embed="rId8" cstate="print">
+                          <a:blip r:embed="rId10" cstate="print">
                             <a:extLst>
                               <a:ext uri="{28A0092B-C50C-407E-A947-70E740481C1C}">
                                 <a14:useLocalDpi xmlns:a14="http://schemas.microsoft.com/office/drawing/2010/main" val="0"/>
@@ -175,12 +188,6 @@
                       </pic:pic>
                     </a:graphicData>
                   </a:graphic>
-                  <wp14:sizeRelH relativeFrom="page">
-                    <wp14:pctWidth>0</wp14:pctWidth>
-                  </wp14:sizeRelH>
-                  <wp14:sizeRelV relativeFrom="page">
-                    <wp14:pctHeight>0</wp14:pctHeight>
-                  </wp14:sizeRelV>
                 </wp:anchor>
               </w:drawing>
             </w:r>
@@ -189,7 +196,7 @@
                 <w:rFonts w:cs="Times New Roman"/>
                 <w:b w:val="0"/>
                 <w:bCs/>
-                <w:color w:val="3A7C22" w:themeColor="accent6" w:themeShade="BF"/>
+                <w:color w:val="3B7D23" w:themeColor="accent6" w:themeShade="BF"/>
                 <w:sz w:val="24"/>
                 <w:szCs w:val="24"/>
                 <w:lang w:val="vi-VN"/>
@@ -270,23 +277,8 @@
           <w:lang w:val="en-US"/>
         </w:rPr>
       </w:pPr>
-      <w:r>
-        <w:rPr>
-          <w:color w:val="auto"/>
-          <w:sz w:val="26"/>
-          <w:szCs w:val="26"/>
-          <w:lang w:val="vi-VN"/>
-        </w:rPr>
-        <w:t>CÔNG TY</w:t>
-      </w:r>
-      <w:r>
-        <w:rPr>
-          <w:color w:val="auto"/>
-          <w:sz w:val="26"/>
-          <w:szCs w:val="26"/>
-        </w:rPr>
-        <w:t xml:space="preserve"> </w:t>
-      </w:r>
+      <w:bookmarkStart w:id="0" w:name="_GoBack"/>
+      <w:bookmarkEnd w:id="0"/>
       <w:r>
         <w:rPr>
           <w:color w:val="auto"/>
@@ -335,16 +327,7 @@
           <w:szCs w:val="26"/>
           <w:lang w:val="vi-VN"/>
         </w:rPr>
-        <w:t xml:space="preserve">1. </w:t>
-      </w:r>
-      <w:r>
-        <w:rPr>
-          <w:color w:val="auto"/>
-          <w:sz w:val="26"/>
-          <w:szCs w:val="26"/>
-          <w:lang w:val="vi-VN"/>
-        </w:rPr>
-        <w:t>Thông tin chung</w:t>
+        <w:t>1. Thông tin chung</w:t>
       </w:r>
     </w:p>
     <w:p>
@@ -369,51 +352,7 @@
           <w:szCs w:val="26"/>
           <w:lang w:val="vi-VN"/>
         </w:rPr>
-        <w:t xml:space="preserve">- </w:t>
-      </w:r>
-      <w:r>
-        <w:rPr>
-          <w:b w:val="0"/>
-          <w:bCs/>
-          <w:color w:val="auto"/>
-          <w:sz w:val="26"/>
-          <w:szCs w:val="26"/>
-          <w:lang w:val="vi-VN"/>
-        </w:rPr>
-        <w:t xml:space="preserve">Cơ sở </w:t>
-      </w:r>
-      <w:r>
-        <w:rPr>
-          <w:b w:val="0"/>
-          <w:bCs/>
-          <w:color w:val="auto"/>
-          <w:sz w:val="26"/>
-          <w:szCs w:val="26"/>
-          <w:lang w:val="vi-VN"/>
-        </w:rPr>
-        <w:t>kiểm kê:</w:t>
-      </w:r>
-      <w:r>
-        <w:rPr>
-          <w:b w:val="0"/>
-          <w:bCs/>
-          <w:color w:val="auto"/>
-          <w:sz w:val="26"/>
-          <w:szCs w:val="26"/>
-          <w:lang w:val="vi-VN"/>
-        </w:rPr>
-        <w:t xml:space="preserve"> </w:t>
-      </w:r>
-      <w:r>
-        <w:rPr>
-          <w:b w:val="0"/>
-          <w:bCs/>
-          <w:color w:val="auto"/>
-          <w:sz w:val="26"/>
-          <w:szCs w:val="26"/>
-          <w:lang w:val="vi-VN"/>
-        </w:rPr>
-        <w:t xml:space="preserve">{{ </w:t>
+        <w:t xml:space="preserve">- Cơ sở kiểm kê: {{ </w:t>
       </w:r>
       <w:r>
         <w:rPr>
@@ -460,18 +399,7 @@
           <w:szCs w:val="26"/>
           <w:lang w:val="vi-VN"/>
         </w:rPr>
-        <w:t xml:space="preserve">- Thời gian bắt đầu: </w:t>
-      </w:r>
-      <w:r>
-        <w:rPr>
-          <w:b w:val="0"/>
-          <w:bCs/>
-          <w:color w:val="auto"/>
-          <w:sz w:val="26"/>
-          <w:szCs w:val="26"/>
-          <w:lang w:val="vi-VN"/>
-        </w:rPr>
-        <w:t>{{</w:t>
+        <w:t>- Thời gian bắt đầu: {{</w:t>
       </w:r>
       <w:r>
         <w:rPr>
@@ -568,18 +496,7 @@
           <w:szCs w:val="26"/>
           <w:lang w:val="vi-VN"/>
         </w:rPr>
-        <w:t xml:space="preserve">- </w:t>
-      </w:r>
-      <w:r>
-        <w:rPr>
-          <w:b w:val="0"/>
-          <w:bCs/>
-          <w:color w:val="auto"/>
-          <w:sz w:val="26"/>
-          <w:szCs w:val="26"/>
-          <w:lang w:val="vi-VN"/>
-        </w:rPr>
-        <w:t>Cơ sở pháp lý &amp; Tiêu chuẩn: Tiêu chuẩn ISO 14064-1, GHG Protocol, Hướng dẫn của IPCC 2006, Hướng dẫn của Cơ quan Bảo vệ Môi trường Hoa Kỳ (US EPA).</w:t>
+        <w:t>- Cơ sở pháp lý &amp; Tiêu chuẩn: Tiêu chuẩn ISO 14064-1, GHG Protocol, Hướng dẫn của IPCC 2006, Hướng dẫn của Cơ quan Bảo vệ Môi trường Hoa Kỳ (US EPA).</w:t>
       </w:r>
     </w:p>
     <w:p>
@@ -604,62 +521,7 @@
           <w:szCs w:val="26"/>
           <w:lang w:val="vi-VN"/>
         </w:rPr>
-        <w:t xml:space="preserve">- Phạm vi </w:t>
-      </w:r>
-      <w:r>
-        <w:rPr>
-          <w:b w:val="0"/>
-          <w:bCs/>
-          <w:color w:val="auto"/>
-          <w:sz w:val="26"/>
-          <w:szCs w:val="26"/>
-          <w:lang w:val="vi-VN"/>
-        </w:rPr>
-        <w:t>kiểm kê</w:t>
-      </w:r>
-      <w:r>
-        <w:rPr>
-          <w:b w:val="0"/>
-          <w:bCs/>
-          <w:color w:val="auto"/>
-          <w:sz w:val="26"/>
-          <w:szCs w:val="26"/>
-          <w:lang w:val="vi-VN"/>
-        </w:rPr>
-        <w:t xml:space="preserve">: </w:t>
-      </w:r>
-      <w:r>
-        <w:rPr>
-          <w:b w:val="0"/>
-          <w:bCs/>
-          <w:color w:val="auto"/>
-          <w:sz w:val="26"/>
-          <w:szCs w:val="26"/>
-          <w:lang w:val="vi-VN"/>
-        </w:rPr>
-        <w:t xml:space="preserve">Cảng </w:t>
-      </w:r>
-      <w:r>
-        <w:rPr>
-          <w:b w:val="0"/>
-          <w:bCs/>
-          <w:color w:val="auto"/>
-          <w:sz w:val="26"/>
-          <w:szCs w:val="26"/>
-          <w:lang w:val="vi-VN"/>
-        </w:rPr>
-        <w:t>{</w:t>
-      </w:r>
-      <w:r>
-        <w:rPr>
-          <w:b w:val="0"/>
-          <w:bCs/>
-          <w:color w:val="auto"/>
-          <w:sz w:val="26"/>
-          <w:szCs w:val="26"/>
-          <w:lang w:val="vi-VN"/>
-        </w:rPr>
-        <w:t>{ seaport_name }}</w:t>
+        <w:t>- Phạm vi kiểm kê: Cảng {{ seaport_name }}</w:t>
       </w:r>
     </w:p>
     <w:p>
@@ -699,16 +561,7 @@
           <w:szCs w:val="26"/>
           <w:lang w:val="vi-VN"/>
         </w:rPr>
-        <w:t xml:space="preserve">2.1. </w:t>
-      </w:r>
-      <w:r>
-        <w:rPr>
-          <w:color w:val="auto"/>
-          <w:sz w:val="26"/>
-          <w:szCs w:val="26"/>
-          <w:lang w:val="vi-VN"/>
-        </w:rPr>
-        <w:t>Ranh giới kiểm kê</w:t>
+        <w:t>2.1. Ranh giới kiểm kê</w:t>
       </w:r>
     </w:p>
     <w:p>
@@ -734,40 +587,7 @@
           <w:szCs w:val="26"/>
           <w:lang w:val="vi-VN"/>
         </w:rPr>
-        <w:t>Scope 1</w:t>
-      </w:r>
-      <w:r>
-        <w:rPr>
-          <w:b w:val="0"/>
-          <w:bCs/>
-          <w:color w:val="auto"/>
-          <w:sz w:val="26"/>
-          <w:szCs w:val="26"/>
-          <w:lang w:val="vi-VN"/>
-        </w:rPr>
-        <w:t xml:space="preserve">: </w:t>
-      </w:r>
-      <w:r>
-        <w:rPr>
-          <w:b w:val="0"/>
-          <w:bCs/>
-          <w:color w:val="auto"/>
-          <w:sz w:val="26"/>
-          <w:szCs w:val="26"/>
-          <w:lang w:val="vi-VN"/>
-        </w:rPr>
-        <w:t xml:space="preserve">Bao gồm các khí nhà kính phát ra trực tiếp từ các nguồn do doanh nghiệp sở hữu hoặc kiểm soát. </w:t>
-      </w:r>
-      <w:r>
-        <w:rPr>
-          <w:b w:val="0"/>
-          <w:bCs/>
-          <w:color w:val="auto"/>
-          <w:sz w:val="26"/>
-          <w:szCs w:val="26"/>
-          <w:lang w:val="vi-VN"/>
-        </w:rPr>
-        <w:t>(Sử dụng nhiên liệu hóa thạch)</w:t>
+        <w:t>Scope 1: Bao gồm các khí nhà kính phát ra trực tiếp từ các nguồn do doanh nghiệp sở hữu hoặc kiểm soát. (Sử dụng nhiên liệu hóa thạch)</w:t>
       </w:r>
     </w:p>
     <w:p>
@@ -870,21 +690,52 @@
     </w:p>
     <w:tbl>
       <w:tblPr>
-        <w:tblStyle w:val="TableGrid"/>
+        <w:tblStyle w:val="19"/>
         <w:tblW w:w="0" w:type="auto"/>
-        <w:tblLook w:val="04A0" w:firstRow="1" w:lastRow="0" w:firstColumn="1" w:lastColumn="0" w:noHBand="0" w:noVBand="1"/>
+        <w:tblInd w:w="0" w:type="dxa"/>
+        <w:tblBorders>
+          <w:top w:val="single" w:color="auto" w:sz="4" w:space="0"/>
+          <w:left w:val="single" w:color="auto" w:sz="4" w:space="0"/>
+          <w:bottom w:val="single" w:color="auto" w:sz="4" w:space="0"/>
+          <w:right w:val="single" w:color="auto" w:sz="4" w:space="0"/>
+          <w:insideH w:val="single" w:color="auto" w:sz="4" w:space="0"/>
+          <w:insideV w:val="single" w:color="auto" w:sz="4" w:space="0"/>
+        </w:tblBorders>
+        <w:tblLayout w:type="autofit"/>
+        <w:tblCellMar>
+          <w:top w:w="0" w:type="dxa"/>
+          <w:left w:w="108" w:type="dxa"/>
+          <w:bottom w:w="0" w:type="dxa"/>
+          <w:right w:w="108" w:type="dxa"/>
+        </w:tblCellMar>
       </w:tblPr>
       <w:tblGrid>
-        <w:gridCol w:w="1503"/>
-        <w:gridCol w:w="1503"/>
-        <w:gridCol w:w="1503"/>
-        <w:gridCol w:w="1503"/>
-        <w:gridCol w:w="1503"/>
-        <w:gridCol w:w="1504"/>
+        <w:gridCol w:w="847"/>
+        <w:gridCol w:w="1674"/>
+        <w:gridCol w:w="1679"/>
+        <w:gridCol w:w="1698"/>
+        <w:gridCol w:w="2021"/>
+        <w:gridCol w:w="1326"/>
       </w:tblGrid>
       <w:tr>
+        <w:tblPrEx>
+          <w:tblBorders>
+            <w:top w:val="single" w:color="auto" w:sz="4" w:space="0"/>
+            <w:left w:val="single" w:color="auto" w:sz="4" w:space="0"/>
+            <w:bottom w:val="single" w:color="auto" w:sz="4" w:space="0"/>
+            <w:right w:val="single" w:color="auto" w:sz="4" w:space="0"/>
+            <w:insideH w:val="single" w:color="auto" w:sz="4" w:space="0"/>
+            <w:insideV w:val="single" w:color="auto" w:sz="4" w:space="0"/>
+          </w:tblBorders>
+          <w:tblCellMar>
+            <w:top w:w="0" w:type="dxa"/>
+            <w:left w:w="108" w:type="dxa"/>
+            <w:bottom w:w="0" w:type="dxa"/>
+            <w:right w:w="108" w:type="dxa"/>
+          </w:tblCellMar>
+        </w:tblPrEx>
         <w:trPr>
-          <w:trHeight w:val="585"/>
+          <w:trHeight w:val="585" w:hRule="atLeast"/>
         </w:trPr>
         <w:tc>
           <w:tcPr>
@@ -1132,6 +983,22 @@
         </w:tc>
       </w:tr>
       <w:tr>
+        <w:tblPrEx>
+          <w:tblBorders>
+            <w:top w:val="single" w:color="auto" w:sz="4" w:space="0"/>
+            <w:left w:val="single" w:color="auto" w:sz="4" w:space="0"/>
+            <w:bottom w:val="single" w:color="auto" w:sz="4" w:space="0"/>
+            <w:right w:val="single" w:color="auto" w:sz="4" w:space="0"/>
+            <w:insideH w:val="single" w:color="auto" w:sz="4" w:space="0"/>
+            <w:insideV w:val="single" w:color="auto" w:sz="4" w:space="0"/>
+          </w:tblBorders>
+          <w:tblCellMar>
+            <w:top w:w="0" w:type="dxa"/>
+            <w:left w:w="108" w:type="dxa"/>
+            <w:bottom w:w="0" w:type="dxa"/>
+            <w:right w:w="108" w:type="dxa"/>
+          </w:tblCellMar>
+        </w:tblPrEx>
         <w:tc>
           <w:tcPr>
             <w:tcW w:w="1503" w:type="dxa"/>
@@ -1295,6 +1162,22 @@
         </w:tc>
       </w:tr>
       <w:tr>
+        <w:tblPrEx>
+          <w:tblBorders>
+            <w:top w:val="single" w:color="auto" w:sz="4" w:space="0"/>
+            <w:left w:val="single" w:color="auto" w:sz="4" w:space="0"/>
+            <w:bottom w:val="single" w:color="auto" w:sz="4" w:space="0"/>
+            <w:right w:val="single" w:color="auto" w:sz="4" w:space="0"/>
+            <w:insideH w:val="single" w:color="auto" w:sz="4" w:space="0"/>
+            <w:insideV w:val="single" w:color="auto" w:sz="4" w:space="0"/>
+          </w:tblBorders>
+          <w:tblCellMar>
+            <w:top w:w="0" w:type="dxa"/>
+            <w:left w:w="108" w:type="dxa"/>
+            <w:bottom w:w="0" w:type="dxa"/>
+            <w:right w:w="108" w:type="dxa"/>
+          </w:tblCellMar>
+        </w:tblPrEx>
         <w:tc>
           <w:tcPr>
             <w:tcW w:w="1503" w:type="dxa"/>
@@ -1458,6 +1341,22 @@
         </w:tc>
       </w:tr>
       <w:tr>
+        <w:tblPrEx>
+          <w:tblBorders>
+            <w:top w:val="single" w:color="auto" w:sz="4" w:space="0"/>
+            <w:left w:val="single" w:color="auto" w:sz="4" w:space="0"/>
+            <w:bottom w:val="single" w:color="auto" w:sz="4" w:space="0"/>
+            <w:right w:val="single" w:color="auto" w:sz="4" w:space="0"/>
+            <w:insideH w:val="single" w:color="auto" w:sz="4" w:space="0"/>
+            <w:insideV w:val="single" w:color="auto" w:sz="4" w:space="0"/>
+          </w:tblBorders>
+          <w:tblCellMar>
+            <w:top w:w="0" w:type="dxa"/>
+            <w:left w:w="108" w:type="dxa"/>
+            <w:bottom w:w="0" w:type="dxa"/>
+            <w:right w:w="108" w:type="dxa"/>
+          </w:tblCellMar>
+        </w:tblPrEx>
         <w:tc>
           <w:tcPr>
             <w:tcW w:w="1503" w:type="dxa"/>
@@ -1485,7 +1384,6 @@
                 <w:szCs w:val="26"/>
                 <w:lang w:val="vi-VN"/>
               </w:rPr>
-              <w:lastRenderedPageBreak/>
               <w:t>Scope 3</w:t>
             </w:r>
           </w:p>
@@ -1622,6 +1520,22 @@
         </w:tc>
       </w:tr>
       <w:tr>
+        <w:tblPrEx>
+          <w:tblBorders>
+            <w:top w:val="single" w:color="auto" w:sz="4" w:space="0"/>
+            <w:left w:val="single" w:color="auto" w:sz="4" w:space="0"/>
+            <w:bottom w:val="single" w:color="auto" w:sz="4" w:space="0"/>
+            <w:right w:val="single" w:color="auto" w:sz="4" w:space="0"/>
+            <w:insideH w:val="single" w:color="auto" w:sz="4" w:space="0"/>
+            <w:insideV w:val="single" w:color="auto" w:sz="4" w:space="0"/>
+          </w:tblBorders>
+          <w:tblCellMar>
+            <w:top w:w="0" w:type="dxa"/>
+            <w:left w:w="108" w:type="dxa"/>
+            <w:bottom w:w="0" w:type="dxa"/>
+            <w:right w:w="108" w:type="dxa"/>
+          </w:tblCellMar>
+        </w:tblPrEx>
         <w:tc>
           <w:tcPr>
             <w:tcW w:w="6012" w:type="dxa"/>
@@ -1740,16 +1654,7 @@
           <w:szCs w:val="26"/>
           <w:lang w:val="vi-VN"/>
         </w:rPr>
-        <w:t>2.2. Báo cáo chi tiết</w:t>
-      </w:r>
-      <w:r>
-        <w:rPr>
-          <w:color w:val="auto"/>
-          <w:sz w:val="26"/>
-          <w:szCs w:val="26"/>
-          <w:lang w:val="vi-VN"/>
-        </w:rPr>
-        <w:t xml:space="preserve"> các phạm vi phát thải tại cảng</w:t>
+        <w:t>2.2. Báo cáo chi tiết các phạm vi phát thải tại cảng</w:t>
       </w:r>
     </w:p>
     <w:p>
@@ -1799,12 +1704,27 @@
     </w:p>
     <w:tbl>
       <w:tblPr>
-        <w:tblStyle w:val="TableGrid"/>
+        <w:tblStyle w:val="19"/>
         <w:tblW w:w="0" w:type="auto"/>
-        <w:tblLook w:val="04A0" w:firstRow="1" w:lastRow="0" w:firstColumn="1" w:lastColumn="0" w:noHBand="0" w:noVBand="1"/>
+        <w:tblInd w:w="0" w:type="dxa"/>
+        <w:tblBorders>
+          <w:top w:val="single" w:color="auto" w:sz="4" w:space="0"/>
+          <w:left w:val="single" w:color="auto" w:sz="4" w:space="0"/>
+          <w:bottom w:val="single" w:color="auto" w:sz="4" w:space="0"/>
+          <w:right w:val="single" w:color="auto" w:sz="4" w:space="0"/>
+          <w:insideH w:val="single" w:color="auto" w:sz="4" w:space="0"/>
+          <w:insideV w:val="single" w:color="auto" w:sz="4" w:space="0"/>
+        </w:tblBorders>
+        <w:tblLayout w:type="autofit"/>
+        <w:tblCellMar>
+          <w:top w:w="0" w:type="dxa"/>
+          <w:left w:w="108" w:type="dxa"/>
+          <w:bottom w:w="0" w:type="dxa"/>
+          <w:right w:w="108" w:type="dxa"/>
+        </w:tblCellMar>
       </w:tblPr>
       <w:tblGrid>
-        <w:gridCol w:w="709"/>
+        <w:gridCol w:w="717"/>
         <w:gridCol w:w="1838"/>
         <w:gridCol w:w="1276"/>
         <w:gridCol w:w="1332"/>
@@ -1812,6 +1732,22 @@
         <w:gridCol w:w="1701"/>
       </w:tblGrid>
       <w:tr>
+        <w:tblPrEx>
+          <w:tblBorders>
+            <w:top w:val="single" w:color="auto" w:sz="4" w:space="0"/>
+            <w:left w:val="single" w:color="auto" w:sz="4" w:space="0"/>
+            <w:bottom w:val="single" w:color="auto" w:sz="4" w:space="0"/>
+            <w:right w:val="single" w:color="auto" w:sz="4" w:space="0"/>
+            <w:insideH w:val="single" w:color="auto" w:sz="4" w:space="0"/>
+            <w:insideV w:val="single" w:color="auto" w:sz="4" w:space="0"/>
+          </w:tblBorders>
+          <w:tblCellMar>
+            <w:top w:w="0" w:type="dxa"/>
+            <w:left w:w="108" w:type="dxa"/>
+            <w:bottom w:w="0" w:type="dxa"/>
+            <w:right w:w="108" w:type="dxa"/>
+          </w:tblCellMar>
+        </w:tblPrEx>
         <w:tc>
           <w:tcPr>
             <w:tcW w:w="709" w:type="dxa"/>
@@ -2106,56 +2042,54 @@
           <w:szCs w:val="26"/>
           <w:lang w:val="vi-VN"/>
         </w:rPr>
-        <w:t xml:space="preserve">Bảng </w:t>
-      </w:r>
-      <w:r>
-        <w:rPr>
-          <w:b w:val="0"/>
-          <w:bCs/>
-          <w:color w:val="auto"/>
-          <w:sz w:val="26"/>
-          <w:szCs w:val="26"/>
-          <w:lang w:val="vi-VN"/>
-        </w:rPr>
-        <w:t>3</w:t>
-      </w:r>
-      <w:r>
-        <w:rPr>
-          <w:b w:val="0"/>
-          <w:bCs/>
-          <w:color w:val="auto"/>
-          <w:sz w:val="26"/>
-          <w:szCs w:val="26"/>
-          <w:lang w:val="vi-VN"/>
-        </w:rPr>
-        <w:t xml:space="preserve">. Lượng phát thải chi tiết từng thiết bị Scope </w:t>
-      </w:r>
-      <w:r>
-        <w:rPr>
-          <w:b w:val="0"/>
-          <w:bCs/>
-          <w:color w:val="auto"/>
-          <w:sz w:val="26"/>
-          <w:szCs w:val="26"/>
-          <w:lang w:val="vi-VN"/>
-        </w:rPr>
-        <w:t>2</w:t>
+        <w:t>Bảng 3. Lượng phát thải chi tiết từng thiết bị Scope 2</w:t>
       </w:r>
     </w:p>
     <w:tbl>
       <w:tblPr>
-        <w:tblStyle w:val="TableGrid"/>
+        <w:tblStyle w:val="19"/>
         <w:tblW w:w="0" w:type="auto"/>
-        <w:tblLook w:val="04A0" w:firstRow="1" w:lastRow="0" w:firstColumn="1" w:lastColumn="0" w:noHBand="0" w:noVBand="1"/>
+        <w:tblInd w:w="0" w:type="dxa"/>
+        <w:tblBorders>
+          <w:top w:val="single" w:color="auto" w:sz="4" w:space="0"/>
+          <w:left w:val="single" w:color="auto" w:sz="4" w:space="0"/>
+          <w:bottom w:val="single" w:color="auto" w:sz="4" w:space="0"/>
+          <w:right w:val="single" w:color="auto" w:sz="4" w:space="0"/>
+          <w:insideH w:val="single" w:color="auto" w:sz="4" w:space="0"/>
+          <w:insideV w:val="single" w:color="auto" w:sz="4" w:space="0"/>
+        </w:tblBorders>
+        <w:tblLayout w:type="autofit"/>
+        <w:tblCellMar>
+          <w:top w:w="0" w:type="dxa"/>
+          <w:left w:w="108" w:type="dxa"/>
+          <w:bottom w:w="0" w:type="dxa"/>
+          <w:right w:w="108" w:type="dxa"/>
+        </w:tblCellMar>
       </w:tblPr>
       <w:tblGrid>
-        <w:gridCol w:w="708"/>
+        <w:gridCol w:w="758"/>
         <w:gridCol w:w="2689"/>
         <w:gridCol w:w="1418"/>
         <w:gridCol w:w="1984"/>
         <w:gridCol w:w="2220"/>
       </w:tblGrid>
       <w:tr>
+        <w:tblPrEx>
+          <w:tblBorders>
+            <w:top w:val="single" w:color="auto" w:sz="4" w:space="0"/>
+            <w:left w:val="single" w:color="auto" w:sz="4" w:space="0"/>
+            <w:bottom w:val="single" w:color="auto" w:sz="4" w:space="0"/>
+            <w:right w:val="single" w:color="auto" w:sz="4" w:space="0"/>
+            <w:insideH w:val="single" w:color="auto" w:sz="4" w:space="0"/>
+            <w:insideV w:val="single" w:color="auto" w:sz="4" w:space="0"/>
+          </w:tblBorders>
+          <w:tblCellMar>
+            <w:top w:w="0" w:type="dxa"/>
+            <w:left w:w="108" w:type="dxa"/>
+            <w:bottom w:w="0" w:type="dxa"/>
+            <w:right w:w="108" w:type="dxa"/>
+          </w:tblCellMar>
+        </w:tblPrEx>
         <w:tc>
           <w:tcPr>
             <w:tcW w:w="708" w:type="dxa"/>
@@ -2328,25 +2262,7 @@
           <w:szCs w:val="26"/>
           <w:lang w:val="vi-VN"/>
         </w:rPr>
-        <w:t>2.2.</w:t>
-      </w:r>
-      <w:r>
-        <w:rPr>
-          <w:color w:val="auto"/>
-          <w:sz w:val="26"/>
-          <w:szCs w:val="26"/>
-          <w:lang w:val="vi-VN"/>
-        </w:rPr>
-        <w:t>3</w:t>
-      </w:r>
-      <w:r>
-        <w:rPr>
-          <w:color w:val="auto"/>
-          <w:sz w:val="26"/>
-          <w:szCs w:val="26"/>
-          <w:lang w:val="vi-VN"/>
-        </w:rPr>
-        <w:t>. Scope 3</w:t>
+        <w:t>2.2.3. Scope 3</w:t>
       </w:r>
     </w:p>
     <w:p>
@@ -2370,18 +2286,7 @@
           <w:szCs w:val="26"/>
           <w:lang w:val="vi-VN"/>
         </w:rPr>
-        <w:t xml:space="preserve">a) </w:t>
-      </w:r>
-      <w:r>
-        <w:rPr>
-          <w:b w:val="0"/>
-          <w:bCs/>
-          <w:color w:val="auto"/>
-          <w:sz w:val="26"/>
-          <w:szCs w:val="26"/>
-          <w:lang w:val="vi-VN"/>
-        </w:rPr>
-        <w:t>Các loại tàu biển</w:t>
+        <w:t>a) Các loại tàu biển</w:t>
       </w:r>
     </w:p>
     <w:p>
@@ -2406,58 +2311,56 @@
           <w:szCs w:val="26"/>
           <w:lang w:val="vi-VN"/>
         </w:rPr>
-        <w:t xml:space="preserve">Bảng </w:t>
-      </w:r>
-      <w:r>
-        <w:rPr>
-          <w:b w:val="0"/>
-          <w:bCs/>
-          <w:color w:val="auto"/>
-          <w:sz w:val="26"/>
-          <w:szCs w:val="26"/>
-          <w:lang w:val="vi-VN"/>
-        </w:rPr>
-        <w:t>4</w:t>
-      </w:r>
-      <w:r>
-        <w:rPr>
-          <w:b w:val="0"/>
-          <w:bCs/>
-          <w:color w:val="auto"/>
-          <w:sz w:val="26"/>
-          <w:szCs w:val="26"/>
-          <w:lang w:val="vi-VN"/>
-        </w:rPr>
-        <w:t xml:space="preserve">. Lượng phát thải chi tiết </w:t>
-      </w:r>
-      <w:r>
-        <w:rPr>
-          <w:b w:val="0"/>
-          <w:bCs/>
-          <w:color w:val="auto"/>
-          <w:sz w:val="26"/>
-          <w:szCs w:val="26"/>
-          <w:lang w:val="vi-VN"/>
-        </w:rPr>
-        <w:t>từng tàu</w:t>
+        <w:t>Bảng 4. Lượng phát thải chi tiết từng tàu</w:t>
       </w:r>
     </w:p>
     <w:tbl>
       <w:tblPr>
-        <w:tblStyle w:val="TableGrid"/>
+        <w:tblStyle w:val="19"/>
         <w:tblW w:w="9067" w:type="dxa"/>
-        <w:tblLook w:val="04A0" w:firstRow="1" w:lastRow="0" w:firstColumn="1" w:lastColumn="0" w:noHBand="0" w:noVBand="1"/>
+        <w:tblInd w:w="0" w:type="dxa"/>
+        <w:tblBorders>
+          <w:top w:val="single" w:color="auto" w:sz="4" w:space="0"/>
+          <w:left w:val="single" w:color="auto" w:sz="4" w:space="0"/>
+          <w:bottom w:val="single" w:color="auto" w:sz="4" w:space="0"/>
+          <w:right w:val="single" w:color="auto" w:sz="4" w:space="0"/>
+          <w:insideH w:val="single" w:color="auto" w:sz="4" w:space="0"/>
+          <w:insideV w:val="single" w:color="auto" w:sz="4" w:space="0"/>
+        </w:tblBorders>
+        <w:tblLayout w:type="autofit"/>
+        <w:tblCellMar>
+          <w:top w:w="0" w:type="dxa"/>
+          <w:left w:w="108" w:type="dxa"/>
+          <w:bottom w:w="0" w:type="dxa"/>
+          <w:right w:w="108" w:type="dxa"/>
+        </w:tblCellMar>
       </w:tblPr>
       <w:tblGrid>
-        <w:gridCol w:w="704"/>
-        <w:gridCol w:w="1276"/>
-        <w:gridCol w:w="1417"/>
-        <w:gridCol w:w="1276"/>
-        <w:gridCol w:w="1701"/>
-        <w:gridCol w:w="1559"/>
-        <w:gridCol w:w="1134"/>
+        <w:gridCol w:w="717"/>
+        <w:gridCol w:w="1274"/>
+        <w:gridCol w:w="1415"/>
+        <w:gridCol w:w="1274"/>
+        <w:gridCol w:w="1698"/>
+        <w:gridCol w:w="1556"/>
+        <w:gridCol w:w="1133"/>
       </w:tblGrid>
       <w:tr>
+        <w:tblPrEx>
+          <w:tblBorders>
+            <w:top w:val="single" w:color="auto" w:sz="4" w:space="0"/>
+            <w:left w:val="single" w:color="auto" w:sz="4" w:space="0"/>
+            <w:bottom w:val="single" w:color="auto" w:sz="4" w:space="0"/>
+            <w:right w:val="single" w:color="auto" w:sz="4" w:space="0"/>
+            <w:insideH w:val="single" w:color="auto" w:sz="4" w:space="0"/>
+            <w:insideV w:val="single" w:color="auto" w:sz="4" w:space="0"/>
+          </w:tblBorders>
+          <w:tblCellMar>
+            <w:top w:w="0" w:type="dxa"/>
+            <w:left w:w="108" w:type="dxa"/>
+            <w:bottom w:w="0" w:type="dxa"/>
+            <w:right w:w="108" w:type="dxa"/>
+          </w:tblCellMar>
+        </w:tblPrEx>
         <w:tc>
           <w:tcPr>
             <w:tcW w:w="704" w:type="dxa"/>
@@ -2732,57 +2635,55 @@
           <w:szCs w:val="26"/>
           <w:lang w:val="vi-VN"/>
         </w:rPr>
-        <w:t xml:space="preserve">Bảng </w:t>
-      </w:r>
-      <w:r>
-        <w:rPr>
-          <w:b w:val="0"/>
-          <w:bCs/>
-          <w:color w:val="auto"/>
-          <w:sz w:val="26"/>
-          <w:szCs w:val="26"/>
-          <w:lang w:val="vi-VN"/>
-        </w:rPr>
-        <w:t>4</w:t>
-      </w:r>
-      <w:r>
-        <w:rPr>
-          <w:b w:val="0"/>
-          <w:bCs/>
-          <w:color w:val="auto"/>
-          <w:sz w:val="26"/>
-          <w:szCs w:val="26"/>
-          <w:lang w:val="vi-VN"/>
-        </w:rPr>
-        <w:t xml:space="preserve">. Lượng phát thải chi tiết </w:t>
-      </w:r>
-      <w:r>
-        <w:rPr>
-          <w:b w:val="0"/>
-          <w:bCs/>
-          <w:color w:val="auto"/>
-          <w:sz w:val="26"/>
-          <w:szCs w:val="26"/>
-          <w:lang w:val="vi-VN"/>
-        </w:rPr>
-        <w:t>xe container</w:t>
+        <w:t>Bảng 4. Lượng phát thải chi tiết xe container</w:t>
       </w:r>
     </w:p>
     <w:tbl>
       <w:tblPr>
-        <w:tblStyle w:val="TableGrid"/>
+        <w:tblStyle w:val="19"/>
         <w:tblW w:w="9067" w:type="dxa"/>
-        <w:tblLook w:val="04A0" w:firstRow="1" w:lastRow="0" w:firstColumn="1" w:lastColumn="0" w:noHBand="0" w:noVBand="1"/>
+        <w:tblInd w:w="0" w:type="dxa"/>
+        <w:tblBorders>
+          <w:top w:val="single" w:color="auto" w:sz="4" w:space="0"/>
+          <w:left w:val="single" w:color="auto" w:sz="4" w:space="0"/>
+          <w:bottom w:val="single" w:color="auto" w:sz="4" w:space="0"/>
+          <w:right w:val="single" w:color="auto" w:sz="4" w:space="0"/>
+          <w:insideH w:val="single" w:color="auto" w:sz="4" w:space="0"/>
+          <w:insideV w:val="single" w:color="auto" w:sz="4" w:space="0"/>
+        </w:tblBorders>
+        <w:tblLayout w:type="autofit"/>
+        <w:tblCellMar>
+          <w:top w:w="0" w:type="dxa"/>
+          <w:left w:w="108" w:type="dxa"/>
+          <w:bottom w:w="0" w:type="dxa"/>
+          <w:right w:w="108" w:type="dxa"/>
+        </w:tblCellMar>
       </w:tblPr>
       <w:tblGrid>
-        <w:gridCol w:w="704"/>
-        <w:gridCol w:w="1276"/>
-        <w:gridCol w:w="2126"/>
-        <w:gridCol w:w="1843"/>
-        <w:gridCol w:w="1843"/>
-        <w:gridCol w:w="1275"/>
+        <w:gridCol w:w="717"/>
+        <w:gridCol w:w="1274"/>
+        <w:gridCol w:w="2122"/>
+        <w:gridCol w:w="1840"/>
+        <w:gridCol w:w="1840"/>
+        <w:gridCol w:w="1274"/>
       </w:tblGrid>
       <w:tr>
+        <w:tblPrEx>
+          <w:tblBorders>
+            <w:top w:val="single" w:color="auto" w:sz="4" w:space="0"/>
+            <w:left w:val="single" w:color="auto" w:sz="4" w:space="0"/>
+            <w:bottom w:val="single" w:color="auto" w:sz="4" w:space="0"/>
+            <w:right w:val="single" w:color="auto" w:sz="4" w:space="0"/>
+            <w:insideH w:val="single" w:color="auto" w:sz="4" w:space="0"/>
+            <w:insideV w:val="single" w:color="auto" w:sz="4" w:space="0"/>
+          </w:tblBorders>
+          <w:tblCellMar>
+            <w:top w:w="0" w:type="dxa"/>
+            <w:left w:w="108" w:type="dxa"/>
+            <w:bottom w:w="0" w:type="dxa"/>
+            <w:right w:w="108" w:type="dxa"/>
+          </w:tblCellMar>
+        </w:tblPrEx>
         <w:tc>
           <w:tcPr>
             <w:tcW w:w="704" w:type="dxa"/>
@@ -2932,31 +2833,22 @@
           <w:p>
             <w:pPr>
               <w:spacing w:line="240" w:lineRule="auto"/>
-              <w:jc w:val="center"/>
-              <w:rPr>
-                <w:color w:val="auto"/>
-                <w:sz w:val="24"/>
-                <w:szCs w:val="24"/>
-                <w:lang w:val="vi-VN"/>
-              </w:rPr>
-            </w:pPr>
-            <w:r>
-              <w:rPr>
-                <w:color w:val="auto"/>
-                <w:sz w:val="24"/>
-                <w:szCs w:val="24"/>
-                <w:lang w:val="vi-VN"/>
-              </w:rPr>
-              <w:t xml:space="preserve">kg </w:t>
-            </w:r>
-            <w:r>
-              <w:rPr>
-                <w:color w:val="auto"/>
-                <w:sz w:val="24"/>
-                <w:szCs w:val="24"/>
-                <w:lang w:val="vi-VN"/>
-              </w:rPr>
-              <w:t>CO</w:t>
+              <w:jc w:val="both"/>
+              <w:rPr>
+                <w:color w:val="auto"/>
+                <w:sz w:val="24"/>
+                <w:szCs w:val="24"/>
+                <w:lang w:val="vi-VN"/>
+              </w:rPr>
+            </w:pPr>
+            <w:r>
+              <w:rPr>
+                <w:color w:val="auto"/>
+                <w:sz w:val="24"/>
+                <w:szCs w:val="24"/>
+                <w:lang w:val="vi-VN"/>
+              </w:rPr>
+              <w:t xml:space="preserve"> CO</w:t>
             </w:r>
             <w:r>
               <w:rPr>
@@ -2976,6 +2868,39 @@
                 <w:lang w:val="vi-VN"/>
               </w:rPr>
               <w:t>e</w:t>
+            </w:r>
+          </w:p>
+          <w:p>
+            <w:pPr>
+              <w:spacing w:line="240" w:lineRule="auto"/>
+              <w:jc w:val="both"/>
+              <w:rPr>
+                <w:rFonts w:hint="default"/>
+                <w:color w:val="auto"/>
+                <w:sz w:val="24"/>
+                <w:szCs w:val="24"/>
+                <w:lang w:val="vi-VN"/>
+              </w:rPr>
+            </w:pPr>
+            <w:r>
+              <w:rPr>
+                <w:rFonts w:hint="default"/>
+                <w:color w:val="auto"/>
+                <w:sz w:val="24"/>
+                <w:szCs w:val="24"/>
+                <w:lang w:val="en-US"/>
+              </w:rPr>
+              <w:t>(</w:t>
+            </w:r>
+            <w:r>
+              <w:rPr>
+                <w:rFonts w:hint="default"/>
+                <w:color w:val="auto"/>
+                <w:sz w:val="24"/>
+                <w:szCs w:val="24"/>
+                <w:lang w:val="vi-VN"/>
+              </w:rPr>
+              <w:t>tấn)</w:t>
             </w:r>
           </w:p>
         </w:tc>
@@ -3032,12 +2957,27 @@
     </w:p>
     <w:tbl>
       <w:tblPr>
-        <w:tblStyle w:val="TableGrid"/>
+        <w:tblStyle w:val="19"/>
         <w:tblW w:w="0" w:type="auto"/>
-        <w:tblLook w:val="04A0" w:firstRow="1" w:lastRow="0" w:firstColumn="1" w:lastColumn="0" w:noHBand="0" w:noVBand="1"/>
+        <w:tblInd w:w="0" w:type="dxa"/>
+        <w:tblBorders>
+          <w:top w:val="single" w:color="auto" w:sz="4" w:space="0"/>
+          <w:left w:val="single" w:color="auto" w:sz="4" w:space="0"/>
+          <w:bottom w:val="single" w:color="auto" w:sz="4" w:space="0"/>
+          <w:right w:val="single" w:color="auto" w:sz="4" w:space="0"/>
+          <w:insideH w:val="single" w:color="auto" w:sz="4" w:space="0"/>
+          <w:insideV w:val="single" w:color="auto" w:sz="4" w:space="0"/>
+        </w:tblBorders>
+        <w:tblLayout w:type="autofit"/>
+        <w:tblCellMar>
+          <w:top w:w="0" w:type="dxa"/>
+          <w:left w:w="108" w:type="dxa"/>
+          <w:bottom w:w="0" w:type="dxa"/>
+          <w:right w:w="108" w:type="dxa"/>
+        </w:tblCellMar>
       </w:tblPr>
       <w:tblGrid>
-        <w:gridCol w:w="709"/>
+        <w:gridCol w:w="717"/>
         <w:gridCol w:w="1838"/>
         <w:gridCol w:w="1276"/>
         <w:gridCol w:w="1332"/>
@@ -3045,8 +2985,24 @@
         <w:gridCol w:w="1701"/>
       </w:tblGrid>
       <w:tr>
+        <w:tblPrEx>
+          <w:tblBorders>
+            <w:top w:val="single" w:color="auto" w:sz="4" w:space="0"/>
+            <w:left w:val="single" w:color="auto" w:sz="4" w:space="0"/>
+            <w:bottom w:val="single" w:color="auto" w:sz="4" w:space="0"/>
+            <w:right w:val="single" w:color="auto" w:sz="4" w:space="0"/>
+            <w:insideH w:val="single" w:color="auto" w:sz="4" w:space="0"/>
+            <w:insideV w:val="single" w:color="auto" w:sz="4" w:space="0"/>
+          </w:tblBorders>
+          <w:tblCellMar>
+            <w:top w:w="0" w:type="dxa"/>
+            <w:left w:w="108" w:type="dxa"/>
+            <w:bottom w:w="0" w:type="dxa"/>
+            <w:right w:w="108" w:type="dxa"/>
+          </w:tblCellMar>
+        </w:tblPrEx>
         <w:trPr>
-          <w:trHeight w:val="581"/>
+          <w:trHeight w:val="581" w:hRule="atLeast"/>
         </w:trPr>
         <w:tc>
           <w:tcPr>
@@ -3326,9 +3282,24 @@
     </w:p>
     <w:tbl>
       <w:tblPr>
-        <w:tblStyle w:val="TableGrid"/>
+        <w:tblStyle w:val="19"/>
         <w:tblW w:w="0" w:type="auto"/>
-        <w:tblLook w:val="04A0" w:firstRow="1" w:lastRow="0" w:firstColumn="1" w:lastColumn="0" w:noHBand="0" w:noVBand="1"/>
+        <w:tblInd w:w="0" w:type="dxa"/>
+        <w:tblBorders>
+          <w:top w:val="single" w:color="auto" w:sz="4" w:space="0"/>
+          <w:left w:val="single" w:color="auto" w:sz="4" w:space="0"/>
+          <w:bottom w:val="single" w:color="auto" w:sz="4" w:space="0"/>
+          <w:right w:val="single" w:color="auto" w:sz="4" w:space="0"/>
+          <w:insideH w:val="single" w:color="auto" w:sz="4" w:space="0"/>
+          <w:insideV w:val="single" w:color="auto" w:sz="4" w:space="0"/>
+        </w:tblBorders>
+        <w:tblLayout w:type="autofit"/>
+        <w:tblCellMar>
+          <w:top w:w="0" w:type="dxa"/>
+          <w:left w:w="108" w:type="dxa"/>
+          <w:bottom w:w="0" w:type="dxa"/>
+          <w:right w:w="108" w:type="dxa"/>
+        </w:tblCellMar>
       </w:tblPr>
       <w:tblGrid>
         <w:gridCol w:w="2254"/>
@@ -3337,6 +3308,22 @@
         <w:gridCol w:w="2255"/>
       </w:tblGrid>
       <w:tr>
+        <w:tblPrEx>
+          <w:tblBorders>
+            <w:top w:val="single" w:color="auto" w:sz="4" w:space="0"/>
+            <w:left w:val="single" w:color="auto" w:sz="4" w:space="0"/>
+            <w:bottom w:val="single" w:color="auto" w:sz="4" w:space="0"/>
+            <w:right w:val="single" w:color="auto" w:sz="4" w:space="0"/>
+            <w:insideH w:val="single" w:color="auto" w:sz="4" w:space="0"/>
+            <w:insideV w:val="single" w:color="auto" w:sz="4" w:space="0"/>
+          </w:tblBorders>
+          <w:tblCellMar>
+            <w:top w:w="0" w:type="dxa"/>
+            <w:left w:w="108" w:type="dxa"/>
+            <w:bottom w:w="0" w:type="dxa"/>
+            <w:right w:w="108" w:type="dxa"/>
+          </w:tblCellMar>
+        </w:tblPrEx>
         <w:tc>
           <w:tcPr>
             <w:tcW w:w="2254" w:type="dxa"/>
@@ -3486,6 +3473,22 @@
         </w:tc>
       </w:tr>
       <w:tr>
+        <w:tblPrEx>
+          <w:tblBorders>
+            <w:top w:val="single" w:color="auto" w:sz="4" w:space="0"/>
+            <w:left w:val="single" w:color="auto" w:sz="4" w:space="0"/>
+            <w:bottom w:val="single" w:color="auto" w:sz="4" w:space="0"/>
+            <w:right w:val="single" w:color="auto" w:sz="4" w:space="0"/>
+            <w:insideH w:val="single" w:color="auto" w:sz="4" w:space="0"/>
+            <w:insideV w:val="single" w:color="auto" w:sz="4" w:space="0"/>
+          </w:tblBorders>
+          <w:tblCellMar>
+            <w:top w:w="0" w:type="dxa"/>
+            <w:left w:w="108" w:type="dxa"/>
+            <w:bottom w:w="0" w:type="dxa"/>
+            <w:right w:w="108" w:type="dxa"/>
+          </w:tblCellMar>
+        </w:tblPrEx>
         <w:tc>
           <w:tcPr>
             <w:tcW w:w="2254" w:type="dxa"/>
@@ -3586,6 +3589,22 @@
         </w:tc>
       </w:tr>
       <w:tr>
+        <w:tblPrEx>
+          <w:tblBorders>
+            <w:top w:val="single" w:color="auto" w:sz="4" w:space="0"/>
+            <w:left w:val="single" w:color="auto" w:sz="4" w:space="0"/>
+            <w:bottom w:val="single" w:color="auto" w:sz="4" w:space="0"/>
+            <w:right w:val="single" w:color="auto" w:sz="4" w:space="0"/>
+            <w:insideH w:val="single" w:color="auto" w:sz="4" w:space="0"/>
+            <w:insideV w:val="single" w:color="auto" w:sz="4" w:space="0"/>
+          </w:tblBorders>
+          <w:tblCellMar>
+            <w:top w:w="0" w:type="dxa"/>
+            <w:left w:w="108" w:type="dxa"/>
+            <w:bottom w:w="0" w:type="dxa"/>
+            <w:right w:w="108" w:type="dxa"/>
+          </w:tblCellMar>
+        </w:tblPrEx>
         <w:tc>
           <w:tcPr>
             <w:tcW w:w="2254" w:type="dxa"/>
@@ -3700,22 +3719,22 @@
       </w:pPr>
     </w:p>
     <w:sectPr>
-      <w:headerReference w:type="even" r:id="rId9"/>
-      <w:headerReference w:type="default" r:id="rId10"/>
-      <w:headerReference w:type="first" r:id="rId11"/>
+      <w:headerReference r:id="rId7" w:type="first"/>
+      <w:headerReference r:id="rId5" w:type="default"/>
+      <w:headerReference r:id="rId6" w:type="even"/>
       <w:type w:val="nextColumn"/>
       <w:pgSz w:w="11909" w:h="16834"/>
       <w:pgMar w:top="852" w:right="1440" w:bottom="1440" w:left="1440" w:header="850" w:footer="720" w:gutter="0"/>
-      <w:cols w:space="708"/>
-      <w:docGrid w:linePitch="300"/>
+      <w:cols w:space="708" w:num="1"/>
+      <w:docGrid w:linePitch="300" w:charSpace="0"/>
     </w:sectPr>
   </w:body>
 </w:document>
 </file>
 
 <file path=word/endnotes.xml><?xml version="1.0" encoding="utf-8"?>
-<w:endnotes xmlns:wpc="http://schemas.microsoft.com/office/word/2010/wordprocessingCanvas" xmlns:cx="http://schemas.microsoft.com/office/drawing/2014/chartex" xmlns:cx1="http://schemas.microsoft.com/office/drawing/2015/9/8/chartex" xmlns:cx2="http://schemas.microsoft.com/office/drawing/2015/10/21/chartex" xmlns:cx3="http://schemas.microsoft.com/office/drawing/2016/5/9/chartex" xmlns:cx4="http://schemas.microsoft.com/office/drawing/2016/5/10/chartex" xmlns:cx5="http://schemas.microsoft.com/office/drawing/2016/5/11/chartex" xmlns:cx6="http://schemas.microsoft.com/office/drawing/2016/5/12/chartex" xmlns:cx7="http://schemas.microsoft.com/office/drawing/2016/5/13/chartex" xmlns:cx8="http://schemas.microsoft.com/office/drawing/2016/5/14/chartex" xmlns:mc="http://schemas.openxmlformats.org/markup-compatibility/2006" xmlns:aink="http://schemas.microsoft.com/office/drawing/2016/ink" xmlns:am3d="http://schemas.microsoft.com/office/drawing/2017/model3d" xmlns:o="urn:schemas-microsoft-com:office:office" xmlns:oel="http://schemas.microsoft.com/office/2019/extlst" xmlns:r="http://schemas.openxmlformats.org/officeDocument/2006/relationships" xmlns:m="http://schemas.openxmlformats.org/officeDocument/2006/math" xmlns:v="urn:schemas-microsoft-com:vml" xmlns:wp14="http://schemas.microsoft.com/office/word/2010/wordprocessingDrawing" xmlns:wp="http://schemas.openxmlformats.org/drawingml/2006/wordprocessingDrawing" xmlns:w10="urn:schemas-microsoft-com:office:word" xmlns:w="http://schemas.openxmlformats.org/wordprocessingml/2006/main" xmlns:w14="http://schemas.microsoft.com/office/word/2010/wordml" xmlns:w15="http://schemas.microsoft.com/office/word/2012/wordml" xmlns:w16cex="http://schemas.microsoft.com/office/word/2018/wordml/cex" xmlns:w16cid="http://schemas.microsoft.com/office/word/2016/wordml/cid" xmlns:w16="http://schemas.microsoft.com/office/word/2018/wordml" xmlns:w16du="http://schemas.microsoft.com/office/word/2023/wordml/word16du" xmlns:w16sdtdh="http://schemas.microsoft.com/office/word/2020/wordml/sdtdatahash" xmlns:w16sdtfl="http://schemas.microsoft.com/office/word/2024/wordml/sdtformatlock" xmlns:w16se="http://schemas.microsoft.com/office/word/2015/wordml/symex" xmlns:wpg="http://schemas.microsoft.com/office/word/2010/wordprocessingGroup" xmlns:wpi="http://schemas.microsoft.com/office/word/2010/wordprocessingInk" xmlns:wne="http://schemas.microsoft.com/office/word/2006/wordml" xmlns:wps="http://schemas.microsoft.com/office/word/2010/wordprocessingShape" mc:Ignorable="w14 w15 w16se w16cid w16 w16cex w16sdtdh w16sdtfl w16du wp14">
-  <w:endnote w:type="separator" w:id="-1">
+<w:endnotes xmlns:wpc="http://schemas.microsoft.com/office/word/2010/wordprocessingCanvas" xmlns:mc="http://schemas.openxmlformats.org/markup-compatibility/2006" xmlns:o="urn:schemas-microsoft-com:office:office" xmlns:r="http://schemas.openxmlformats.org/officeDocument/2006/relationships" xmlns:m="http://schemas.openxmlformats.org/officeDocument/2006/math" xmlns:v="urn:schemas-microsoft-com:vml" xmlns:wp14="http://schemas.microsoft.com/office/word/2010/wordprocessingDrawing" xmlns:wp="http://schemas.openxmlformats.org/drawingml/2006/wordprocessingDrawing" xmlns:w="http://schemas.openxmlformats.org/wordprocessingml/2006/main" xmlns:w14="http://schemas.microsoft.com/office/word/2010/wordml" xmlns:w15="http://schemas.microsoft.com/office/word/2012/wordml" xmlns:w10="urn:schemas-microsoft-com:office:word" xmlns:wpg="http://schemas.microsoft.com/office/word/2010/wordprocessingGroup" xmlns:wpi="http://schemas.microsoft.com/office/word/2010/wordprocessingInk" xmlns:wne="http://schemas.microsoft.com/office/word/2006/wordml" xmlns:wps="http://schemas.microsoft.com/office/word/2010/wordprocessingShape" xmlns:wpsCustomData="http://www.wps.cn/officeDocument/2013/wpsCustomData" mc:Ignorable="w14 w15 wp14">
+  <w:endnote w:type="separator" w:id="0">
     <w:p>
       <w:pPr>
         <w:spacing w:line="240" w:lineRule="auto"/>
@@ -3725,7 +3744,7 @@
       </w:r>
     </w:p>
   </w:endnote>
-  <w:endnote w:type="continuationSeparator" w:id="0">
+  <w:endnote w:type="continuationSeparator" w:id="1">
     <w:p>
       <w:pPr>
         <w:spacing w:line="240" w:lineRule="auto"/>
@@ -3739,21 +3758,21 @@
 </file>
 
 <file path=word/footnotes.xml><?xml version="1.0" encoding="utf-8"?>
-<w:footnotes xmlns:wpc="http://schemas.microsoft.com/office/word/2010/wordprocessingCanvas" xmlns:cx="http://schemas.microsoft.com/office/drawing/2014/chartex" xmlns:cx1="http://schemas.microsoft.com/office/drawing/2015/9/8/chartex" xmlns:cx2="http://schemas.microsoft.com/office/drawing/2015/10/21/chartex" xmlns:cx3="http://schemas.microsoft.com/office/drawing/2016/5/9/chartex" xmlns:cx4="http://schemas.microsoft.com/office/drawing/2016/5/10/chartex" xmlns:cx5="http://schemas.microsoft.com/office/drawing/2016/5/11/chartex" xmlns:cx6="http://schemas.microsoft.com/office/drawing/2016/5/12/chartex" xmlns:cx7="http://schemas.microsoft.com/office/drawing/2016/5/13/chartex" xmlns:cx8="http://schemas.microsoft.com/office/drawing/2016/5/14/chartex" xmlns:mc="http://schemas.openxmlformats.org/markup-compatibility/2006" xmlns:aink="http://schemas.microsoft.com/office/drawing/2016/ink" xmlns:am3d="http://schemas.microsoft.com/office/drawing/2017/model3d" xmlns:o="urn:schemas-microsoft-com:office:office" xmlns:oel="http://schemas.microsoft.com/office/2019/extlst" xmlns:r="http://schemas.openxmlformats.org/officeDocument/2006/relationships" xmlns:m="http://schemas.openxmlformats.org/officeDocument/2006/math" xmlns:v="urn:schemas-microsoft-com:vml" xmlns:wp14="http://schemas.microsoft.com/office/word/2010/wordprocessingDrawing" xmlns:wp="http://schemas.openxmlformats.org/drawingml/2006/wordprocessingDrawing" xmlns:w10="urn:schemas-microsoft-com:office:word" xmlns:w="http://schemas.openxmlformats.org/wordprocessingml/2006/main" xmlns:w14="http://schemas.microsoft.com/office/word/2010/wordml" xmlns:w15="http://schemas.microsoft.com/office/word/2012/wordml" xmlns:w16cex="http://schemas.microsoft.com/office/word/2018/wordml/cex" xmlns:w16cid="http://schemas.microsoft.com/office/word/2016/wordml/cid" xmlns:w16="http://schemas.microsoft.com/office/word/2018/wordml" xmlns:w16du="http://schemas.microsoft.com/office/word/2023/wordml/word16du" xmlns:w16sdtdh="http://schemas.microsoft.com/office/word/2020/wordml/sdtdatahash" xmlns:w16sdtfl="http://schemas.microsoft.com/office/word/2024/wordml/sdtformatlock" xmlns:w16se="http://schemas.microsoft.com/office/word/2015/wordml/symex" xmlns:wpg="http://schemas.microsoft.com/office/word/2010/wordprocessingGroup" xmlns:wpi="http://schemas.microsoft.com/office/word/2010/wordprocessingInk" xmlns:wne="http://schemas.microsoft.com/office/word/2006/wordml" xmlns:wps="http://schemas.microsoft.com/office/word/2010/wordprocessingShape" mc:Ignorable="w14 w15 w16se w16cid w16 w16cex w16sdtdh w16sdtfl w16du wp14">
-  <w:footnote w:type="separator" w:id="-1">
+<w:footnotes xmlns:wpc="http://schemas.microsoft.com/office/word/2010/wordprocessingCanvas" xmlns:mc="http://schemas.openxmlformats.org/markup-compatibility/2006" xmlns:o="urn:schemas-microsoft-com:office:office" xmlns:r="http://schemas.openxmlformats.org/officeDocument/2006/relationships" xmlns:m="http://schemas.openxmlformats.org/officeDocument/2006/math" xmlns:v="urn:schemas-microsoft-com:vml" xmlns:wp14="http://schemas.microsoft.com/office/word/2010/wordprocessingDrawing" xmlns:wp="http://schemas.openxmlformats.org/drawingml/2006/wordprocessingDrawing" xmlns:w="http://schemas.openxmlformats.org/wordprocessingml/2006/main" xmlns:w14="http://schemas.microsoft.com/office/word/2010/wordml" xmlns:w15="http://schemas.microsoft.com/office/word/2012/wordml" xmlns:w10="urn:schemas-microsoft-com:office:word" xmlns:wpg="http://schemas.microsoft.com/office/word/2010/wordprocessingGroup" xmlns:wpi="http://schemas.microsoft.com/office/word/2010/wordprocessingInk" xmlns:wne="http://schemas.microsoft.com/office/word/2006/wordml" xmlns:wps="http://schemas.microsoft.com/office/word/2010/wordprocessingShape" xmlns:wpsCustomData="http://www.wps.cn/officeDocument/2013/wpsCustomData" mc:Ignorable="w14 w15 wp14">
+  <w:footnote w:type="separator" w:id="0">
     <w:p>
       <w:pPr>
-        <w:spacing w:line="240" w:lineRule="auto"/>
+        <w:spacing w:line="276" w:lineRule="auto"/>
       </w:pPr>
       <w:r>
         <w:separator/>
       </w:r>
     </w:p>
   </w:footnote>
-  <w:footnote w:type="continuationSeparator" w:id="0">
+  <w:footnote w:type="continuationSeparator" w:id="1">
     <w:p>
       <w:pPr>
-        <w:spacing w:line="240" w:lineRule="auto"/>
+        <w:spacing w:line="276" w:lineRule="auto"/>
       </w:pPr>
       <w:r>
         <w:continuationSeparator/>
@@ -3764,39 +3783,22 @@
 </file>
 
 <file path=word/header1.xml><?xml version="1.0" encoding="utf-8"?>
-<w:hdr xmlns:wpc="http://schemas.microsoft.com/office/word/2010/wordprocessingCanvas" xmlns:cx="http://schemas.microsoft.com/office/drawing/2014/chartex" xmlns:cx1="http://schemas.microsoft.com/office/drawing/2015/9/8/chartex" xmlns:cx2="http://schemas.microsoft.com/office/drawing/2015/10/21/chartex" xmlns:cx3="http://schemas.microsoft.com/office/drawing/2016/5/9/chartex" xmlns:cx4="http://schemas.microsoft.com/office/drawing/2016/5/10/chartex" xmlns:cx5="http://schemas.microsoft.com/office/drawing/2016/5/11/chartex" xmlns:cx6="http://schemas.microsoft.com/office/drawing/2016/5/12/chartex" xmlns:cx7="http://schemas.microsoft.com/office/drawing/2016/5/13/chartex" xmlns:cx8="http://schemas.microsoft.com/office/drawing/2016/5/14/chartex" xmlns:mc="http://schemas.openxmlformats.org/markup-compatibility/2006" xmlns:aink="http://schemas.microsoft.com/office/drawing/2016/ink" xmlns:am3d="http://schemas.microsoft.com/office/drawing/2017/model3d" xmlns:o="urn:schemas-microsoft-com:office:office" xmlns:oel="http://schemas.microsoft.com/office/2019/extlst" xmlns:r="http://schemas.openxmlformats.org/officeDocument/2006/relationships" xmlns:m="http://schemas.openxmlformats.org/officeDocument/2006/math" xmlns:v="urn:schemas-microsoft-com:vml" xmlns:wp14="http://schemas.microsoft.com/office/word/2010/wordprocessingDrawing" xmlns:wp="http://schemas.openxmlformats.org/drawingml/2006/wordprocessingDrawing" xmlns:w10="urn:schemas-microsoft-com:office:word" xmlns:w="http://schemas.openxmlformats.org/wordprocessingml/2006/main" xmlns:w14="http://schemas.microsoft.com/office/word/2010/wordml" xmlns:w15="http://schemas.microsoft.com/office/word/2012/wordml" xmlns:w16cex="http://schemas.microsoft.com/office/word/2018/wordml/cex" xmlns:w16cid="http://schemas.microsoft.com/office/word/2016/wordml/cid" xmlns:w16="http://schemas.microsoft.com/office/word/2018/wordml" xmlns:w16du="http://schemas.microsoft.com/office/word/2023/wordml/word16du" xmlns:w16sdtdh="http://schemas.microsoft.com/office/word/2020/wordml/sdtdatahash" xmlns:w16sdtfl="http://schemas.microsoft.com/office/word/2024/wordml/sdtformatlock" xmlns:w16se="http://schemas.microsoft.com/office/word/2015/wordml/symex" xmlns:wpg="http://schemas.microsoft.com/office/word/2010/wordprocessingGroup" xmlns:wpi="http://schemas.microsoft.com/office/word/2010/wordprocessingInk" xmlns:wne="http://schemas.microsoft.com/office/word/2006/wordml" xmlns:wps="http://schemas.microsoft.com/office/word/2010/wordprocessingShape" mc:Ignorable="w14 w15 w16se w16cid w16 w16cex w16sdtdh w16sdtfl w16du wp14">
+<w:hdr xmlns:wpc="http://schemas.microsoft.com/office/word/2010/wordprocessingCanvas" xmlns:mc="http://schemas.openxmlformats.org/markup-compatibility/2006" xmlns:o="urn:schemas-microsoft-com:office:office" xmlns:r="http://schemas.openxmlformats.org/officeDocument/2006/relationships" xmlns:m="http://schemas.openxmlformats.org/officeDocument/2006/math" xmlns:v="urn:schemas-microsoft-com:vml" xmlns:wp14="http://schemas.microsoft.com/office/word/2010/wordprocessingDrawing" xmlns:wp="http://schemas.openxmlformats.org/drawingml/2006/wordprocessingDrawing" xmlns:w10="urn:schemas-microsoft-com:office:word" xmlns:w="http://schemas.openxmlformats.org/wordprocessingml/2006/main" xmlns:w14="http://schemas.microsoft.com/office/word/2010/wordml" xmlns:w15="http://schemas.microsoft.com/office/word/2012/wordml" xmlns:wpg="http://schemas.microsoft.com/office/word/2010/wordprocessingGroup" xmlns:wpi="http://schemas.microsoft.com/office/word/2010/wordprocessingInk" xmlns:wne="http://schemas.microsoft.com/office/word/2006/wordml" xmlns:wps="http://schemas.microsoft.com/office/word/2010/wordprocessingShape" xmlns:wpsCustomData="http://www.wps.cn/officeDocument/2013/wpsCustomData" mc:Ignorable="w14 w15 wp14">
   <w:p>
     <w:pPr>
-      <w:pStyle w:val="Header"/>
+      <w:pStyle w:val="16"/>
     </w:pPr>
     <w:r>
       <w:rPr>
-        <w:noProof/>
         <w14:ligatures w14:val="standardContextual"/>
       </w:rPr>
-      <w:pict w14:anchorId="4AF5041B">
-        <v:shapetype id="_x0000_t75" coordsize="21600,21600" o:spt="75" o:preferrelative="t" path="m@4@5l@4@11@9@11@9@5xe" filled="f" stroked="f">
-          <v:stroke joinstyle="miter"/>
-          <v:formulas>
-            <v:f eqn="if lineDrawn pixelLineWidth 0"/>
-            <v:f eqn="sum @0 1 0"/>
-            <v:f eqn="sum 0 0 @1"/>
-            <v:f eqn="prod @2 1 2"/>
-            <v:f eqn="prod @3 21600 pixelWidth"/>
-            <v:f eqn="prod @3 21600 pixelHeight"/>
-            <v:f eqn="sum @0 0 1"/>
-            <v:f eqn="prod @6 1 2"/>
-            <v:f eqn="prod @7 21600 pixelWidth"/>
-            <v:f eqn="sum @8 21600 0"/>
-            <v:f eqn="prod @7 21600 pixelHeight"/>
-            <v:f eqn="sum @10 21600 0"/>
-          </v:formulas>
-          <v:path o:extrusionok="f" gradientshapeok="t" o:connecttype="rect"/>
+      <w:pict>
+        <v:shape id="WordPictureWatermark1297456338" o:spid="_x0000_s1026" o:spt="75" type="#_x0000_t75" style="position:absolute;left:0pt;height:501.7pt;width:451.2pt;mso-position-horizontal:center;mso-position-horizontal-relative:margin;mso-position-vertical:center;mso-position-vertical-relative:margin;z-index:-251653120;mso-width-relative:page;mso-height-relative:page;" filled="f" o:preferrelative="t" stroked="f" coordsize="21600,21600" o:allowincell="f">
+          <v:path/>
+          <v:fill on="f" focussize="0,0"/>
+          <v:stroke on="f" joinstyle="miter"/>
+          <v:imagedata r:id="rId1" gain="19661f" blacklevel="22938f" o:title="VPEI-removebg-preview"/>
           <o:lock v:ext="edit" aspectratio="t"/>
-        </v:shapetype>
-        <v:shape id="WordPictureWatermark1297456337" o:spid="_x0000_s1027" type="#_x0000_t75" alt="" style="position:absolute;margin-left:0;margin-top:0;width:451.2pt;height:501.7pt;z-index:-251653120;mso-wrap-edited:f;mso-width-percent:0;mso-height-percent:0;mso-position-horizontal:center;mso-position-horizontal-relative:margin;mso-position-vertical:center;mso-position-vertical-relative:margin;mso-width-percent:0;mso-height-percent:0" o:allowincell="f">
-          <v:imagedata r:id="rId1" o:title="VPEI-removebg-preview" gain="19661f" blacklevel="22938f"/>
-          <w10:wrap anchorx="margin" anchory="margin"/>
         </v:shape>
       </w:pict>
     </w:r>
@@ -3805,39 +3807,22 @@
 </file>
 
 <file path=word/header2.xml><?xml version="1.0" encoding="utf-8"?>
-<w:hdr xmlns:wpc="http://schemas.microsoft.com/office/word/2010/wordprocessingCanvas" xmlns:cx="http://schemas.microsoft.com/office/drawing/2014/chartex" xmlns:cx1="http://schemas.microsoft.com/office/drawing/2015/9/8/chartex" xmlns:cx2="http://schemas.microsoft.com/office/drawing/2015/10/21/chartex" xmlns:cx3="http://schemas.microsoft.com/office/drawing/2016/5/9/chartex" xmlns:cx4="http://schemas.microsoft.com/office/drawing/2016/5/10/chartex" xmlns:cx5="http://schemas.microsoft.com/office/drawing/2016/5/11/chartex" xmlns:cx6="http://schemas.microsoft.com/office/drawing/2016/5/12/chartex" xmlns:cx7="http://schemas.microsoft.com/office/drawing/2016/5/13/chartex" xmlns:cx8="http://schemas.microsoft.com/office/drawing/2016/5/14/chartex" xmlns:mc="http://schemas.openxmlformats.org/markup-compatibility/2006" xmlns:aink="http://schemas.microsoft.com/office/drawing/2016/ink" xmlns:am3d="http://schemas.microsoft.com/office/drawing/2017/model3d" xmlns:o="urn:schemas-microsoft-com:office:office" xmlns:oel="http://schemas.microsoft.com/office/2019/extlst" xmlns:r="http://schemas.openxmlformats.org/officeDocument/2006/relationships" xmlns:m="http://schemas.openxmlformats.org/officeDocument/2006/math" xmlns:v="urn:schemas-microsoft-com:vml" xmlns:wp14="http://schemas.microsoft.com/office/word/2010/wordprocessingDrawing" xmlns:wp="http://schemas.openxmlformats.org/drawingml/2006/wordprocessingDrawing" xmlns:w10="urn:schemas-microsoft-com:office:word" xmlns:w="http://schemas.openxmlformats.org/wordprocessingml/2006/main" xmlns:w14="http://schemas.microsoft.com/office/word/2010/wordml" xmlns:w15="http://schemas.microsoft.com/office/word/2012/wordml" xmlns:w16cex="http://schemas.microsoft.com/office/word/2018/wordml/cex" xmlns:w16cid="http://schemas.microsoft.com/office/word/2016/wordml/cid" xmlns:w16="http://schemas.microsoft.com/office/word/2018/wordml" xmlns:w16du="http://schemas.microsoft.com/office/word/2023/wordml/word16du" xmlns:w16sdtdh="http://schemas.microsoft.com/office/word/2020/wordml/sdtdatahash" xmlns:w16sdtfl="http://schemas.microsoft.com/office/word/2024/wordml/sdtformatlock" xmlns:w16se="http://schemas.microsoft.com/office/word/2015/wordml/symex" xmlns:wpg="http://schemas.microsoft.com/office/word/2010/wordprocessingGroup" xmlns:wpi="http://schemas.microsoft.com/office/word/2010/wordprocessingInk" xmlns:wne="http://schemas.microsoft.com/office/word/2006/wordml" xmlns:wps="http://schemas.microsoft.com/office/word/2010/wordprocessingShape" mc:Ignorable="w14 w15 w16se w16cid w16 w16cex w16sdtdh w16sdtfl w16du wp14">
+<w:hdr xmlns:wpc="http://schemas.microsoft.com/office/word/2010/wordprocessingCanvas" xmlns:mc="http://schemas.openxmlformats.org/markup-compatibility/2006" xmlns:o="urn:schemas-microsoft-com:office:office" xmlns:r="http://schemas.openxmlformats.org/officeDocument/2006/relationships" xmlns:m="http://schemas.openxmlformats.org/officeDocument/2006/math" xmlns:v="urn:schemas-microsoft-com:vml" xmlns:wp14="http://schemas.microsoft.com/office/word/2010/wordprocessingDrawing" xmlns:wp="http://schemas.openxmlformats.org/drawingml/2006/wordprocessingDrawing" xmlns:w10="urn:schemas-microsoft-com:office:word" xmlns:w="http://schemas.openxmlformats.org/wordprocessingml/2006/main" xmlns:w14="http://schemas.microsoft.com/office/word/2010/wordml" xmlns:w15="http://schemas.microsoft.com/office/word/2012/wordml" xmlns:wpg="http://schemas.microsoft.com/office/word/2010/wordprocessingGroup" xmlns:wpi="http://schemas.microsoft.com/office/word/2010/wordprocessingInk" xmlns:wne="http://schemas.microsoft.com/office/word/2006/wordml" xmlns:wps="http://schemas.microsoft.com/office/word/2010/wordprocessingShape" xmlns:wpsCustomData="http://www.wps.cn/officeDocument/2013/wpsCustomData" mc:Ignorable="w14 w15 wp14">
   <w:p>
     <w:pPr>
-      <w:pStyle w:val="Header"/>
+      <w:pStyle w:val="16"/>
     </w:pPr>
     <w:r>
       <w:rPr>
-        <w:noProof/>
         <w14:ligatures w14:val="standardContextual"/>
       </w:rPr>
-      <w:pict w14:anchorId="7C6C5E0B">
-        <v:shapetype id="_x0000_t75" coordsize="21600,21600" o:spt="75" o:preferrelative="t" path="m@4@5l@4@11@9@11@9@5xe" filled="f" stroked="f">
-          <v:stroke joinstyle="miter"/>
-          <v:formulas>
-            <v:f eqn="if lineDrawn pixelLineWidth 0"/>
-            <v:f eqn="sum @0 1 0"/>
-            <v:f eqn="sum 0 0 @1"/>
-            <v:f eqn="prod @2 1 2"/>
-            <v:f eqn="prod @3 21600 pixelWidth"/>
-            <v:f eqn="prod @3 21600 pixelHeight"/>
-            <v:f eqn="sum @0 0 1"/>
-            <v:f eqn="prod @6 1 2"/>
-            <v:f eqn="prod @7 21600 pixelWidth"/>
-            <v:f eqn="sum @8 21600 0"/>
-            <v:f eqn="prod @7 21600 pixelHeight"/>
-            <v:f eqn="sum @10 21600 0"/>
-          </v:formulas>
-          <v:path o:extrusionok="f" gradientshapeok="t" o:connecttype="rect"/>
+      <w:pict>
+        <v:shape id="WordPictureWatermark1297456337" o:spid="_x0000_s1027" o:spt="75" type="#_x0000_t75" style="position:absolute;left:0pt;height:501.7pt;width:451.2pt;mso-position-horizontal:center;mso-position-horizontal-relative:margin;mso-position-vertical:center;mso-position-vertical-relative:margin;z-index:-251654144;mso-width-relative:page;mso-height-relative:page;" filled="f" o:preferrelative="t" stroked="f" coordsize="21600,21600" o:allowincell="f">
+          <v:path/>
+          <v:fill on="f" focussize="0,0"/>
+          <v:stroke on="f" joinstyle="miter"/>
+          <v:imagedata r:id="rId1" gain="19661f" blacklevel="22938f" o:title="VPEI-removebg-preview"/>
           <o:lock v:ext="edit" aspectratio="t"/>
-        </v:shapetype>
-        <v:shape id="WordPictureWatermark1297456338" o:spid="_x0000_s1026" type="#_x0000_t75" alt="" style="position:absolute;margin-left:0;margin-top:0;width:451.2pt;height:501.7pt;z-index:-251650048;mso-wrap-edited:f;mso-width-percent:0;mso-height-percent:0;mso-position-horizontal:center;mso-position-horizontal-relative:margin;mso-position-vertical:center;mso-position-vertical-relative:margin;mso-width-percent:0;mso-height-percent:0" o:allowincell="f">
-          <v:imagedata r:id="rId1" o:title="VPEI-removebg-preview" gain="19661f" blacklevel="22938f"/>
-          <w10:wrap anchorx="margin" anchory="margin"/>
         </v:shape>
       </w:pict>
     </w:r>
@@ -3846,39 +3831,22 @@
 </file>
 
 <file path=word/header3.xml><?xml version="1.0" encoding="utf-8"?>
-<w:hdr xmlns:wpc="http://schemas.microsoft.com/office/word/2010/wordprocessingCanvas" xmlns:cx="http://schemas.microsoft.com/office/drawing/2014/chartex" xmlns:cx1="http://schemas.microsoft.com/office/drawing/2015/9/8/chartex" xmlns:cx2="http://schemas.microsoft.com/office/drawing/2015/10/21/chartex" xmlns:cx3="http://schemas.microsoft.com/office/drawing/2016/5/9/chartex" xmlns:cx4="http://schemas.microsoft.com/office/drawing/2016/5/10/chartex" xmlns:cx5="http://schemas.microsoft.com/office/drawing/2016/5/11/chartex" xmlns:cx6="http://schemas.microsoft.com/office/drawing/2016/5/12/chartex" xmlns:cx7="http://schemas.microsoft.com/office/drawing/2016/5/13/chartex" xmlns:cx8="http://schemas.microsoft.com/office/drawing/2016/5/14/chartex" xmlns:mc="http://schemas.openxmlformats.org/markup-compatibility/2006" xmlns:aink="http://schemas.microsoft.com/office/drawing/2016/ink" xmlns:am3d="http://schemas.microsoft.com/office/drawing/2017/model3d" xmlns:o="urn:schemas-microsoft-com:office:office" xmlns:oel="http://schemas.microsoft.com/office/2019/extlst" xmlns:r="http://schemas.openxmlformats.org/officeDocument/2006/relationships" xmlns:m="http://schemas.openxmlformats.org/officeDocument/2006/math" xmlns:v="urn:schemas-microsoft-com:vml" xmlns:wp14="http://schemas.microsoft.com/office/word/2010/wordprocessingDrawing" xmlns:wp="http://schemas.openxmlformats.org/drawingml/2006/wordprocessingDrawing" xmlns:w10="urn:schemas-microsoft-com:office:word" xmlns:w="http://schemas.openxmlformats.org/wordprocessingml/2006/main" xmlns:w14="http://schemas.microsoft.com/office/word/2010/wordml" xmlns:w15="http://schemas.microsoft.com/office/word/2012/wordml" xmlns:w16cex="http://schemas.microsoft.com/office/word/2018/wordml/cex" xmlns:w16cid="http://schemas.microsoft.com/office/word/2016/wordml/cid" xmlns:w16="http://schemas.microsoft.com/office/word/2018/wordml" xmlns:w16du="http://schemas.microsoft.com/office/word/2023/wordml/word16du" xmlns:w16sdtdh="http://schemas.microsoft.com/office/word/2020/wordml/sdtdatahash" xmlns:w16sdtfl="http://schemas.microsoft.com/office/word/2024/wordml/sdtformatlock" xmlns:w16se="http://schemas.microsoft.com/office/word/2015/wordml/symex" xmlns:wpg="http://schemas.microsoft.com/office/word/2010/wordprocessingGroup" xmlns:wpi="http://schemas.microsoft.com/office/word/2010/wordprocessingInk" xmlns:wne="http://schemas.microsoft.com/office/word/2006/wordml" xmlns:wps="http://schemas.microsoft.com/office/word/2010/wordprocessingShape" mc:Ignorable="w14 w15 w16se w16cid w16 w16cex w16sdtdh w16sdtfl w16du wp14">
+<w:hdr xmlns:wpc="http://schemas.microsoft.com/office/word/2010/wordprocessingCanvas" xmlns:mc="http://schemas.openxmlformats.org/markup-compatibility/2006" xmlns:o="urn:schemas-microsoft-com:office:office" xmlns:r="http://schemas.openxmlformats.org/officeDocument/2006/relationships" xmlns:m="http://schemas.openxmlformats.org/officeDocument/2006/math" xmlns:v="urn:schemas-microsoft-com:vml" xmlns:wp14="http://schemas.microsoft.com/office/word/2010/wordprocessingDrawing" xmlns:wp="http://schemas.openxmlformats.org/drawingml/2006/wordprocessingDrawing" xmlns:w10="urn:schemas-microsoft-com:office:word" xmlns:w="http://schemas.openxmlformats.org/wordprocessingml/2006/main" xmlns:w14="http://schemas.microsoft.com/office/word/2010/wordml" xmlns:w15="http://schemas.microsoft.com/office/word/2012/wordml" xmlns:wpg="http://schemas.microsoft.com/office/word/2010/wordprocessingGroup" xmlns:wpi="http://schemas.microsoft.com/office/word/2010/wordprocessingInk" xmlns:wne="http://schemas.microsoft.com/office/word/2006/wordml" xmlns:wps="http://schemas.microsoft.com/office/word/2010/wordprocessingShape" xmlns:wpsCustomData="http://www.wps.cn/officeDocument/2013/wpsCustomData" mc:Ignorable="w14 w15 wp14">
   <w:p>
     <w:pPr>
-      <w:pStyle w:val="Header"/>
+      <w:pStyle w:val="16"/>
     </w:pPr>
     <w:r>
       <w:rPr>
-        <w:noProof/>
         <w14:ligatures w14:val="standardContextual"/>
       </w:rPr>
-      <w:pict w14:anchorId="16EAC09D">
-        <v:shapetype id="_x0000_t75" coordsize="21600,21600" o:spt="75" o:preferrelative="t" path="m@4@5l@4@11@9@11@9@5xe" filled="f" stroked="f">
-          <v:stroke joinstyle="miter"/>
-          <v:formulas>
-            <v:f eqn="if lineDrawn pixelLineWidth 0"/>
-            <v:f eqn="sum @0 1 0"/>
-            <v:f eqn="sum 0 0 @1"/>
-            <v:f eqn="prod @2 1 2"/>
-            <v:f eqn="prod @3 21600 pixelWidth"/>
-            <v:f eqn="prod @3 21600 pixelHeight"/>
-            <v:f eqn="sum @0 0 1"/>
-            <v:f eqn="prod @6 1 2"/>
-            <v:f eqn="prod @7 21600 pixelWidth"/>
-            <v:f eqn="sum @8 21600 0"/>
-            <v:f eqn="prod @7 21600 pixelHeight"/>
-            <v:f eqn="sum @10 21600 0"/>
-          </v:formulas>
-          <v:path o:extrusionok="f" gradientshapeok="t" o:connecttype="rect"/>
+      <w:pict>
+        <v:shape id="WordPictureWatermark1297456336" o:spid="_x0000_s1025" o:spt="75" type="#_x0000_t75" style="position:absolute;left:0pt;height:501.7pt;width:451.2pt;mso-position-horizontal:center;mso-position-horizontal-relative:margin;mso-position-vertical:center;mso-position-vertical-relative:margin;z-index:-251655168;mso-width-relative:page;mso-height-relative:page;" filled="f" o:preferrelative="t" stroked="f" coordsize="21600,21600" o:allowincell="f">
+          <v:path/>
+          <v:fill on="f" focussize="0,0"/>
+          <v:stroke on="f" joinstyle="miter"/>
+          <v:imagedata r:id="rId1" gain="19661f" blacklevel="22938f" o:title="VPEI-removebg-preview"/>
           <o:lock v:ext="edit" aspectratio="t"/>
-        </v:shapetype>
-        <v:shape id="WordPictureWatermark1297456336" o:spid="_x0000_s1025" type="#_x0000_t75" alt="" style="position:absolute;margin-left:0;margin-top:0;width:451.2pt;height:501.7pt;z-index:-251656192;mso-wrap-edited:f;mso-width-percent:0;mso-height-percent:0;mso-position-horizontal:center;mso-position-horizontal-relative:margin;mso-position-vertical:center;mso-position-vertical-relative:margin;mso-width-percent:0;mso-height-percent:0" o:allowincell="f">
-          <v:imagedata r:id="rId1" o:title="VPEI-removebg-preview" gain="19661f" blacklevel="22938f"/>
-          <w10:wrap anchorx="margin" anchory="margin"/>
         </v:shape>
       </w:pict>
     </w:r>
@@ -3886,1268 +3854,1045 @@
 </w:hdr>
 </file>
 
-<file path=word/numbering.xml><?xml version="1.0" encoding="utf-8"?>
-<w:numbering xmlns:wpc="http://schemas.microsoft.com/office/word/2010/wordprocessingCanvas" xmlns:cx="http://schemas.microsoft.com/office/drawing/2014/chartex" xmlns:cx1="http://schemas.microsoft.com/office/drawing/2015/9/8/chartex" xmlns:cx2="http://schemas.microsoft.com/office/drawing/2015/10/21/chartex" xmlns:cx3="http://schemas.microsoft.com/office/drawing/2016/5/9/chartex" xmlns:cx4="http://schemas.microsoft.com/office/drawing/2016/5/10/chartex" xmlns:cx5="http://schemas.microsoft.com/office/drawing/2016/5/11/chartex" xmlns:cx6="http://schemas.microsoft.com/office/drawing/2016/5/12/chartex" xmlns:cx7="http://schemas.microsoft.com/office/drawing/2016/5/13/chartex" xmlns:cx8="http://schemas.microsoft.com/office/drawing/2016/5/14/chartex" xmlns:mc="http://schemas.openxmlformats.org/markup-compatibility/2006" xmlns:aink="http://schemas.microsoft.com/office/drawing/2016/ink" xmlns:am3d="http://schemas.microsoft.com/office/drawing/2017/model3d" xmlns:o="urn:schemas-microsoft-com:office:office" xmlns:oel="http://schemas.microsoft.com/office/2019/extlst" xmlns:r="http://schemas.openxmlformats.org/officeDocument/2006/relationships" xmlns:m="http://schemas.openxmlformats.org/officeDocument/2006/math" xmlns:v="urn:schemas-microsoft-com:vml" xmlns:wp14="http://schemas.microsoft.com/office/word/2010/wordprocessingDrawing" xmlns:wp="http://schemas.openxmlformats.org/drawingml/2006/wordprocessingDrawing" xmlns:w10="urn:schemas-microsoft-com:office:word" xmlns:w="http://schemas.openxmlformats.org/wordprocessingml/2006/main" xmlns:w14="http://schemas.microsoft.com/office/word/2010/wordml" xmlns:w15="http://schemas.microsoft.com/office/word/2012/wordml" xmlns:w16cex="http://schemas.microsoft.com/office/word/2018/wordml/cex" xmlns:w16cid="http://schemas.microsoft.com/office/word/2016/wordml/cid" xmlns:w16="http://schemas.microsoft.com/office/word/2018/wordml" xmlns:w16du="http://schemas.microsoft.com/office/word/2023/wordml/word16du" xmlns:w16sdtdh="http://schemas.microsoft.com/office/word/2020/wordml/sdtdatahash" xmlns:w16sdtfl="http://schemas.microsoft.com/office/word/2024/wordml/sdtformatlock" xmlns:w16se="http://schemas.microsoft.com/office/word/2015/wordml/symex" xmlns:wpg="http://schemas.microsoft.com/office/word/2010/wordprocessingGroup" xmlns:wpi="http://schemas.microsoft.com/office/word/2010/wordprocessingInk" xmlns:wne="http://schemas.microsoft.com/office/word/2006/wordml" xmlns:wps="http://schemas.microsoft.com/office/word/2010/wordprocessingShape" mc:Ignorable="w14 w15 w16se w16cid w16 w16cex w16sdtdh w16sdtfl w16du wp14">
-  <w:abstractNum w:abstractNumId="0" w15:restartNumberingAfterBreak="0">
-    <w:nsid w:val="4AD17BE3"/>
-    <w:multiLevelType w:val="hybridMultilevel"/>
-    <w:tmpl w:val="08A64546"/>
-    <w:lvl w:ilvl="0" w:tplc="04090001">
-      <w:start w:val="1"/>
-      <w:numFmt w:val="bullet"/>
-      <w:lvlText w:val=""/>
-      <w:lvlJc w:val="left"/>
-      <w:pPr>
-        <w:ind w:left="1287" w:hanging="360"/>
-      </w:pPr>
-      <w:rPr>
-        <w:rFonts w:ascii="Symbol" w:hAnsi="Symbol" w:hint="default"/>
-      </w:rPr>
-    </w:lvl>
-    <w:lvl w:ilvl="1" w:tplc="04090003" w:tentative="1">
-      <w:start w:val="1"/>
-      <w:numFmt w:val="bullet"/>
-      <w:lvlText w:val="o"/>
-      <w:lvlJc w:val="left"/>
-      <w:pPr>
-        <w:ind w:left="2007" w:hanging="360"/>
-      </w:pPr>
-      <w:rPr>
-        <w:rFonts w:ascii="Courier New" w:hAnsi="Courier New" w:hint="default"/>
-      </w:rPr>
-    </w:lvl>
-    <w:lvl w:ilvl="2" w:tplc="04090005" w:tentative="1">
-      <w:start w:val="1"/>
-      <w:numFmt w:val="bullet"/>
-      <w:lvlText w:val=""/>
-      <w:lvlJc w:val="left"/>
-      <w:pPr>
-        <w:ind w:left="2727" w:hanging="360"/>
-      </w:pPr>
-      <w:rPr>
-        <w:rFonts w:ascii="Wingdings" w:hAnsi="Wingdings" w:hint="default"/>
-      </w:rPr>
-    </w:lvl>
-    <w:lvl w:ilvl="3" w:tplc="04090001" w:tentative="1">
-      <w:start w:val="1"/>
-      <w:numFmt w:val="bullet"/>
-      <w:lvlText w:val=""/>
-      <w:lvlJc w:val="left"/>
-      <w:pPr>
-        <w:ind w:left="3447" w:hanging="360"/>
-      </w:pPr>
-      <w:rPr>
-        <w:rFonts w:ascii="Symbol" w:hAnsi="Symbol" w:hint="default"/>
-      </w:rPr>
-    </w:lvl>
-    <w:lvl w:ilvl="4" w:tplc="04090003" w:tentative="1">
-      <w:start w:val="1"/>
-      <w:numFmt w:val="bullet"/>
-      <w:lvlText w:val="o"/>
-      <w:lvlJc w:val="left"/>
-      <w:pPr>
-        <w:ind w:left="4167" w:hanging="360"/>
-      </w:pPr>
-      <w:rPr>
-        <w:rFonts w:ascii="Courier New" w:hAnsi="Courier New" w:hint="default"/>
-      </w:rPr>
-    </w:lvl>
-    <w:lvl w:ilvl="5" w:tplc="04090005" w:tentative="1">
-      <w:start w:val="1"/>
-      <w:numFmt w:val="bullet"/>
-      <w:lvlText w:val=""/>
-      <w:lvlJc w:val="left"/>
-      <w:pPr>
-        <w:ind w:left="4887" w:hanging="360"/>
-      </w:pPr>
-      <w:rPr>
-        <w:rFonts w:ascii="Wingdings" w:hAnsi="Wingdings" w:hint="default"/>
-      </w:rPr>
-    </w:lvl>
-    <w:lvl w:ilvl="6" w:tplc="04090001" w:tentative="1">
-      <w:start w:val="1"/>
-      <w:numFmt w:val="bullet"/>
-      <w:lvlText w:val=""/>
-      <w:lvlJc w:val="left"/>
-      <w:pPr>
-        <w:ind w:left="5607" w:hanging="360"/>
-      </w:pPr>
-      <w:rPr>
-        <w:rFonts w:ascii="Symbol" w:hAnsi="Symbol" w:hint="default"/>
-      </w:rPr>
-    </w:lvl>
-    <w:lvl w:ilvl="7" w:tplc="04090003" w:tentative="1">
-      <w:start w:val="1"/>
-      <w:numFmt w:val="bullet"/>
-      <w:lvlText w:val="o"/>
-      <w:lvlJc w:val="left"/>
-      <w:pPr>
-        <w:ind w:left="6327" w:hanging="360"/>
-      </w:pPr>
-      <w:rPr>
-        <w:rFonts w:ascii="Courier New" w:hAnsi="Courier New" w:hint="default"/>
-      </w:rPr>
-    </w:lvl>
-    <w:lvl w:ilvl="8" w:tplc="04090005" w:tentative="1">
-      <w:start w:val="1"/>
-      <w:numFmt w:val="bullet"/>
-      <w:lvlText w:val=""/>
-      <w:lvlJc w:val="left"/>
-      <w:pPr>
-        <w:ind w:left="7047" w:hanging="360"/>
-      </w:pPr>
-      <w:rPr>
-        <w:rFonts w:ascii="Wingdings" w:hAnsi="Wingdings" w:hint="default"/>
-      </w:rPr>
-    </w:lvl>
-  </w:abstractNum>
-  <w:abstractNum w:abstractNumId="1" w15:restartNumberingAfterBreak="0">
-    <w:nsid w:val="6A517AF2"/>
-    <w:multiLevelType w:val="multilevel"/>
-    <w:tmpl w:val="E110C69C"/>
-    <w:lvl w:ilvl="0">
-      <w:start w:val="1"/>
-      <w:numFmt w:val="bullet"/>
-      <w:lvlText w:val=""/>
-      <w:lvlJc w:val="left"/>
-      <w:pPr>
-        <w:tabs>
-          <w:tab w:val="num" w:pos="720"/>
-        </w:tabs>
-        <w:ind w:left="720" w:hanging="360"/>
-      </w:pPr>
-      <w:rPr>
-        <w:rFonts w:ascii="Symbol" w:hAnsi="Symbol" w:hint="default"/>
-        <w:sz w:val="20"/>
-      </w:rPr>
-    </w:lvl>
-    <w:lvl w:ilvl="1" w:tentative="1">
-      <w:start w:val="1"/>
-      <w:numFmt w:val="bullet"/>
-      <w:lvlText w:val="o"/>
-      <w:lvlJc w:val="left"/>
-      <w:pPr>
-        <w:tabs>
-          <w:tab w:val="num" w:pos="1440"/>
-        </w:tabs>
-        <w:ind w:left="1440" w:hanging="360"/>
-      </w:pPr>
-      <w:rPr>
-        <w:rFonts w:ascii="Courier New" w:hAnsi="Courier New" w:hint="default"/>
-        <w:sz w:val="20"/>
-      </w:rPr>
-    </w:lvl>
-    <w:lvl w:ilvl="2" w:tentative="1">
-      <w:start w:val="1"/>
-      <w:numFmt w:val="bullet"/>
-      <w:lvlText w:val=""/>
-      <w:lvlJc w:val="left"/>
-      <w:pPr>
-        <w:tabs>
-          <w:tab w:val="num" w:pos="2160"/>
-        </w:tabs>
-        <w:ind w:left="2160" w:hanging="360"/>
-      </w:pPr>
-      <w:rPr>
-        <w:rFonts w:ascii="Wingdings" w:hAnsi="Wingdings" w:hint="default"/>
-        <w:sz w:val="20"/>
-      </w:rPr>
-    </w:lvl>
-    <w:lvl w:ilvl="3" w:tentative="1">
-      <w:start w:val="1"/>
-      <w:numFmt w:val="bullet"/>
-      <w:lvlText w:val=""/>
-      <w:lvlJc w:val="left"/>
-      <w:pPr>
-        <w:tabs>
-          <w:tab w:val="num" w:pos="2880"/>
-        </w:tabs>
-        <w:ind w:left="2880" w:hanging="360"/>
-      </w:pPr>
-      <w:rPr>
-        <w:rFonts w:ascii="Wingdings" w:hAnsi="Wingdings" w:hint="default"/>
-        <w:sz w:val="20"/>
-      </w:rPr>
-    </w:lvl>
-    <w:lvl w:ilvl="4" w:tentative="1">
-      <w:start w:val="1"/>
-      <w:numFmt w:val="bullet"/>
-      <w:lvlText w:val=""/>
-      <w:lvlJc w:val="left"/>
-      <w:pPr>
-        <w:tabs>
-          <w:tab w:val="num" w:pos="3600"/>
-        </w:tabs>
-        <w:ind w:left="3600" w:hanging="360"/>
-      </w:pPr>
-      <w:rPr>
-        <w:rFonts w:ascii="Wingdings" w:hAnsi="Wingdings" w:hint="default"/>
-        <w:sz w:val="20"/>
-      </w:rPr>
-    </w:lvl>
-    <w:lvl w:ilvl="5" w:tentative="1">
-      <w:start w:val="1"/>
-      <w:numFmt w:val="bullet"/>
-      <w:lvlText w:val=""/>
-      <w:lvlJc w:val="left"/>
-      <w:pPr>
-        <w:tabs>
-          <w:tab w:val="num" w:pos="4320"/>
-        </w:tabs>
-        <w:ind w:left="4320" w:hanging="360"/>
-      </w:pPr>
-      <w:rPr>
-        <w:rFonts w:ascii="Wingdings" w:hAnsi="Wingdings" w:hint="default"/>
-        <w:sz w:val="20"/>
-      </w:rPr>
-    </w:lvl>
-    <w:lvl w:ilvl="6" w:tentative="1">
-      <w:start w:val="1"/>
-      <w:numFmt w:val="bullet"/>
-      <w:lvlText w:val=""/>
-      <w:lvlJc w:val="left"/>
-      <w:pPr>
-        <w:tabs>
-          <w:tab w:val="num" w:pos="5040"/>
-        </w:tabs>
-        <w:ind w:left="5040" w:hanging="360"/>
-      </w:pPr>
-      <w:rPr>
-        <w:rFonts w:ascii="Wingdings" w:hAnsi="Wingdings" w:hint="default"/>
-        <w:sz w:val="20"/>
-      </w:rPr>
-    </w:lvl>
-    <w:lvl w:ilvl="7" w:tentative="1">
-      <w:start w:val="1"/>
-      <w:numFmt w:val="bullet"/>
-      <w:lvlText w:val=""/>
-      <w:lvlJc w:val="left"/>
-      <w:pPr>
-        <w:tabs>
-          <w:tab w:val="num" w:pos="5760"/>
-        </w:tabs>
-        <w:ind w:left="5760" w:hanging="360"/>
-      </w:pPr>
-      <w:rPr>
-        <w:rFonts w:ascii="Wingdings" w:hAnsi="Wingdings" w:hint="default"/>
-        <w:sz w:val="20"/>
-      </w:rPr>
-    </w:lvl>
-    <w:lvl w:ilvl="8" w:tentative="1">
-      <w:start w:val="1"/>
-      <w:numFmt w:val="bullet"/>
-      <w:lvlText w:val=""/>
-      <w:lvlJc w:val="left"/>
-      <w:pPr>
-        <w:tabs>
-          <w:tab w:val="num" w:pos="6480"/>
-        </w:tabs>
-        <w:ind w:left="6480" w:hanging="360"/>
-      </w:pPr>
-      <w:rPr>
-        <w:rFonts w:ascii="Wingdings" w:hAnsi="Wingdings" w:hint="default"/>
-        <w:sz w:val="20"/>
-      </w:rPr>
-    </w:lvl>
-  </w:abstractNum>
-  <w:abstractNum w:abstractNumId="2" w15:restartNumberingAfterBreak="0">
-    <w:nsid w:val="6FEB4879"/>
-    <w:multiLevelType w:val="hybridMultilevel"/>
-    <w:tmpl w:val="24426F6C"/>
-    <w:lvl w:ilvl="0" w:tplc="04090001">
-      <w:start w:val="1"/>
-      <w:numFmt w:val="bullet"/>
-      <w:lvlText w:val=""/>
-      <w:lvlJc w:val="left"/>
-      <w:pPr>
-        <w:ind w:left="720" w:hanging="360"/>
-      </w:pPr>
-      <w:rPr>
-        <w:rFonts w:ascii="Symbol" w:hAnsi="Symbol" w:hint="default"/>
-      </w:rPr>
-    </w:lvl>
-    <w:lvl w:ilvl="1" w:tplc="04090003" w:tentative="1">
-      <w:start w:val="1"/>
-      <w:numFmt w:val="bullet"/>
-      <w:lvlText w:val="o"/>
-      <w:lvlJc w:val="left"/>
-      <w:pPr>
-        <w:ind w:left="1440" w:hanging="360"/>
-      </w:pPr>
-      <w:rPr>
-        <w:rFonts w:ascii="Courier New" w:hAnsi="Courier New" w:hint="default"/>
-      </w:rPr>
-    </w:lvl>
-    <w:lvl w:ilvl="2" w:tplc="04090005" w:tentative="1">
-      <w:start w:val="1"/>
-      <w:numFmt w:val="bullet"/>
-      <w:lvlText w:val=""/>
-      <w:lvlJc w:val="left"/>
-      <w:pPr>
-        <w:ind w:left="2160" w:hanging="360"/>
-      </w:pPr>
-      <w:rPr>
-        <w:rFonts w:ascii="Wingdings" w:hAnsi="Wingdings" w:hint="default"/>
-      </w:rPr>
-    </w:lvl>
-    <w:lvl w:ilvl="3" w:tplc="04090001" w:tentative="1">
-      <w:start w:val="1"/>
-      <w:numFmt w:val="bullet"/>
-      <w:lvlText w:val=""/>
-      <w:lvlJc w:val="left"/>
-      <w:pPr>
-        <w:ind w:left="2880" w:hanging="360"/>
-      </w:pPr>
-      <w:rPr>
-        <w:rFonts w:ascii="Symbol" w:hAnsi="Symbol" w:hint="default"/>
-      </w:rPr>
-    </w:lvl>
-    <w:lvl w:ilvl="4" w:tplc="04090003" w:tentative="1">
-      <w:start w:val="1"/>
-      <w:numFmt w:val="bullet"/>
-      <w:lvlText w:val="o"/>
-      <w:lvlJc w:val="left"/>
-      <w:pPr>
-        <w:ind w:left="3600" w:hanging="360"/>
-      </w:pPr>
-      <w:rPr>
-        <w:rFonts w:ascii="Courier New" w:hAnsi="Courier New" w:hint="default"/>
-      </w:rPr>
-    </w:lvl>
-    <w:lvl w:ilvl="5" w:tplc="04090005" w:tentative="1">
-      <w:start w:val="1"/>
-      <w:numFmt w:val="bullet"/>
-      <w:lvlText w:val=""/>
-      <w:lvlJc w:val="left"/>
-      <w:pPr>
-        <w:ind w:left="4320" w:hanging="360"/>
-      </w:pPr>
-      <w:rPr>
-        <w:rFonts w:ascii="Wingdings" w:hAnsi="Wingdings" w:hint="default"/>
-      </w:rPr>
-    </w:lvl>
-    <w:lvl w:ilvl="6" w:tplc="04090001" w:tentative="1">
-      <w:start w:val="1"/>
-      <w:numFmt w:val="bullet"/>
-      <w:lvlText w:val=""/>
-      <w:lvlJc w:val="left"/>
-      <w:pPr>
-        <w:ind w:left="5040" w:hanging="360"/>
-      </w:pPr>
-      <w:rPr>
-        <w:rFonts w:ascii="Symbol" w:hAnsi="Symbol" w:hint="default"/>
-      </w:rPr>
-    </w:lvl>
-    <w:lvl w:ilvl="7" w:tplc="04090003" w:tentative="1">
-      <w:start w:val="1"/>
-      <w:numFmt w:val="bullet"/>
-      <w:lvlText w:val="o"/>
-      <w:lvlJc w:val="left"/>
-      <w:pPr>
-        <w:ind w:left="5760" w:hanging="360"/>
-      </w:pPr>
-      <w:rPr>
-        <w:rFonts w:ascii="Courier New" w:hAnsi="Courier New" w:hint="default"/>
-      </w:rPr>
-    </w:lvl>
-    <w:lvl w:ilvl="8" w:tplc="04090005" w:tentative="1">
-      <w:start w:val="1"/>
-      <w:numFmt w:val="bullet"/>
-      <w:lvlText w:val=""/>
-      <w:lvlJc w:val="left"/>
-      <w:pPr>
-        <w:ind w:left="6480" w:hanging="360"/>
-      </w:pPr>
-      <w:rPr>
-        <w:rFonts w:ascii="Wingdings" w:hAnsi="Wingdings" w:hint="default"/>
-      </w:rPr>
-    </w:lvl>
-  </w:abstractNum>
-  <w:abstractNum w:abstractNumId="3" w15:restartNumberingAfterBreak="0">
-    <w:nsid w:val="77B22E5C"/>
-    <w:multiLevelType w:val="hybridMultilevel"/>
-    <w:tmpl w:val="8F8EA026"/>
-    <w:lvl w:ilvl="0" w:tplc="04090001">
-      <w:start w:val="1"/>
-      <w:numFmt w:val="bullet"/>
-      <w:lvlText w:val=""/>
-      <w:lvlJc w:val="left"/>
-      <w:pPr>
-        <w:ind w:left="720" w:hanging="360"/>
-      </w:pPr>
-      <w:rPr>
-        <w:rFonts w:ascii="Symbol" w:hAnsi="Symbol" w:hint="default"/>
-      </w:rPr>
-    </w:lvl>
-    <w:lvl w:ilvl="1" w:tplc="04090003" w:tentative="1">
-      <w:start w:val="1"/>
-      <w:numFmt w:val="bullet"/>
-      <w:lvlText w:val="o"/>
-      <w:lvlJc w:val="left"/>
-      <w:pPr>
-        <w:ind w:left="1440" w:hanging="360"/>
-      </w:pPr>
-      <w:rPr>
-        <w:rFonts w:ascii="Courier New" w:hAnsi="Courier New" w:hint="default"/>
-      </w:rPr>
-    </w:lvl>
-    <w:lvl w:ilvl="2" w:tplc="04090005" w:tentative="1">
-      <w:start w:val="1"/>
-      <w:numFmt w:val="bullet"/>
-      <w:lvlText w:val=""/>
-      <w:lvlJc w:val="left"/>
-      <w:pPr>
-        <w:ind w:left="2160" w:hanging="360"/>
-      </w:pPr>
-      <w:rPr>
-        <w:rFonts w:ascii="Wingdings" w:hAnsi="Wingdings" w:hint="default"/>
-      </w:rPr>
-    </w:lvl>
-    <w:lvl w:ilvl="3" w:tplc="04090001" w:tentative="1">
-      <w:start w:val="1"/>
-      <w:numFmt w:val="bullet"/>
-      <w:lvlText w:val=""/>
-      <w:lvlJc w:val="left"/>
-      <w:pPr>
-        <w:ind w:left="2880" w:hanging="360"/>
-      </w:pPr>
-      <w:rPr>
-        <w:rFonts w:ascii="Symbol" w:hAnsi="Symbol" w:hint="default"/>
-      </w:rPr>
-    </w:lvl>
-    <w:lvl w:ilvl="4" w:tplc="04090003" w:tentative="1">
-      <w:start w:val="1"/>
-      <w:numFmt w:val="bullet"/>
-      <w:lvlText w:val="o"/>
-      <w:lvlJc w:val="left"/>
-      <w:pPr>
-        <w:ind w:left="3600" w:hanging="360"/>
-      </w:pPr>
-      <w:rPr>
-        <w:rFonts w:ascii="Courier New" w:hAnsi="Courier New" w:hint="default"/>
-      </w:rPr>
-    </w:lvl>
-    <w:lvl w:ilvl="5" w:tplc="04090005" w:tentative="1">
-      <w:start w:val="1"/>
-      <w:numFmt w:val="bullet"/>
-      <w:lvlText w:val=""/>
-      <w:lvlJc w:val="left"/>
-      <w:pPr>
-        <w:ind w:left="4320" w:hanging="360"/>
-      </w:pPr>
-      <w:rPr>
-        <w:rFonts w:ascii="Wingdings" w:hAnsi="Wingdings" w:hint="default"/>
-      </w:rPr>
-    </w:lvl>
-    <w:lvl w:ilvl="6" w:tplc="04090001" w:tentative="1">
-      <w:start w:val="1"/>
-      <w:numFmt w:val="bullet"/>
-      <w:lvlText w:val=""/>
-      <w:lvlJc w:val="left"/>
-      <w:pPr>
-        <w:ind w:left="5040" w:hanging="360"/>
-      </w:pPr>
-      <w:rPr>
-        <w:rFonts w:ascii="Symbol" w:hAnsi="Symbol" w:hint="default"/>
-      </w:rPr>
-    </w:lvl>
-    <w:lvl w:ilvl="7" w:tplc="04090003" w:tentative="1">
-      <w:start w:val="1"/>
-      <w:numFmt w:val="bullet"/>
-      <w:lvlText w:val="o"/>
-      <w:lvlJc w:val="left"/>
-      <w:pPr>
-        <w:ind w:left="5760" w:hanging="360"/>
-      </w:pPr>
-      <w:rPr>
-        <w:rFonts w:ascii="Courier New" w:hAnsi="Courier New" w:hint="default"/>
-      </w:rPr>
-    </w:lvl>
-    <w:lvl w:ilvl="8" w:tplc="04090005" w:tentative="1">
-      <w:start w:val="1"/>
-      <w:numFmt w:val="bullet"/>
-      <w:lvlText w:val=""/>
-      <w:lvlJc w:val="left"/>
-      <w:pPr>
-        <w:ind w:left="6480" w:hanging="360"/>
-      </w:pPr>
-      <w:rPr>
-        <w:rFonts w:ascii="Wingdings" w:hAnsi="Wingdings" w:hint="default"/>
-      </w:rPr>
-    </w:lvl>
-  </w:abstractNum>
-  <w:abstractNum w:abstractNumId="4" w15:restartNumberingAfterBreak="0">
-    <w:nsid w:val="79BF585A"/>
-    <w:multiLevelType w:val="hybridMultilevel"/>
-    <w:tmpl w:val="57F0E670"/>
-    <w:lvl w:ilvl="0" w:tplc="04090001">
-      <w:start w:val="1"/>
-      <w:numFmt w:val="bullet"/>
-      <w:lvlText w:val=""/>
-      <w:lvlJc w:val="left"/>
-      <w:pPr>
-        <w:ind w:left="1004" w:hanging="360"/>
-      </w:pPr>
-      <w:rPr>
-        <w:rFonts w:ascii="Symbol" w:hAnsi="Symbol" w:hint="default"/>
-      </w:rPr>
-    </w:lvl>
-    <w:lvl w:ilvl="1" w:tplc="04090003" w:tentative="1">
-      <w:start w:val="1"/>
-      <w:numFmt w:val="bullet"/>
-      <w:lvlText w:val="o"/>
-      <w:lvlJc w:val="left"/>
-      <w:pPr>
-        <w:ind w:left="1724" w:hanging="360"/>
-      </w:pPr>
-      <w:rPr>
-        <w:rFonts w:ascii="Courier New" w:hAnsi="Courier New" w:hint="default"/>
-      </w:rPr>
-    </w:lvl>
-    <w:lvl w:ilvl="2" w:tplc="04090005" w:tentative="1">
-      <w:start w:val="1"/>
-      <w:numFmt w:val="bullet"/>
-      <w:lvlText w:val=""/>
-      <w:lvlJc w:val="left"/>
-      <w:pPr>
-        <w:ind w:left="2444" w:hanging="360"/>
-      </w:pPr>
-      <w:rPr>
-        <w:rFonts w:ascii="Wingdings" w:hAnsi="Wingdings" w:hint="default"/>
-      </w:rPr>
-    </w:lvl>
-    <w:lvl w:ilvl="3" w:tplc="04090001" w:tentative="1">
-      <w:start w:val="1"/>
-      <w:numFmt w:val="bullet"/>
-      <w:lvlText w:val=""/>
-      <w:lvlJc w:val="left"/>
-      <w:pPr>
-        <w:ind w:left="3164" w:hanging="360"/>
-      </w:pPr>
-      <w:rPr>
-        <w:rFonts w:ascii="Symbol" w:hAnsi="Symbol" w:hint="default"/>
-      </w:rPr>
-    </w:lvl>
-    <w:lvl w:ilvl="4" w:tplc="04090003" w:tentative="1">
-      <w:start w:val="1"/>
-      <w:numFmt w:val="bullet"/>
-      <w:lvlText w:val="o"/>
-      <w:lvlJc w:val="left"/>
-      <w:pPr>
-        <w:ind w:left="3884" w:hanging="360"/>
-      </w:pPr>
-      <w:rPr>
-        <w:rFonts w:ascii="Courier New" w:hAnsi="Courier New" w:hint="default"/>
-      </w:rPr>
-    </w:lvl>
-    <w:lvl w:ilvl="5" w:tplc="04090005" w:tentative="1">
-      <w:start w:val="1"/>
-      <w:numFmt w:val="bullet"/>
-      <w:lvlText w:val=""/>
-      <w:lvlJc w:val="left"/>
-      <w:pPr>
-        <w:ind w:left="4604" w:hanging="360"/>
-      </w:pPr>
-      <w:rPr>
-        <w:rFonts w:ascii="Wingdings" w:hAnsi="Wingdings" w:hint="default"/>
-      </w:rPr>
-    </w:lvl>
-    <w:lvl w:ilvl="6" w:tplc="04090001" w:tentative="1">
-      <w:start w:val="1"/>
-      <w:numFmt w:val="bullet"/>
-      <w:lvlText w:val=""/>
-      <w:lvlJc w:val="left"/>
-      <w:pPr>
-        <w:ind w:left="5324" w:hanging="360"/>
-      </w:pPr>
-      <w:rPr>
-        <w:rFonts w:ascii="Symbol" w:hAnsi="Symbol" w:hint="default"/>
-      </w:rPr>
-    </w:lvl>
-    <w:lvl w:ilvl="7" w:tplc="04090003" w:tentative="1">
-      <w:start w:val="1"/>
-      <w:numFmt w:val="bullet"/>
-      <w:lvlText w:val="o"/>
-      <w:lvlJc w:val="left"/>
-      <w:pPr>
-        <w:ind w:left="6044" w:hanging="360"/>
-      </w:pPr>
-      <w:rPr>
-        <w:rFonts w:ascii="Courier New" w:hAnsi="Courier New" w:hint="default"/>
-      </w:rPr>
-    </w:lvl>
-    <w:lvl w:ilvl="8" w:tplc="04090005" w:tentative="1">
-      <w:start w:val="1"/>
-      <w:numFmt w:val="bullet"/>
-      <w:lvlText w:val=""/>
-      <w:lvlJc w:val="left"/>
-      <w:pPr>
-        <w:ind w:left="6764" w:hanging="360"/>
-      </w:pPr>
-      <w:rPr>
-        <w:rFonts w:ascii="Wingdings" w:hAnsi="Wingdings" w:hint="default"/>
-      </w:rPr>
-    </w:lvl>
-  </w:abstractNum>
-  <w:abstractNum w:abstractNumId="5" w15:restartNumberingAfterBreak="0">
-    <w:nsid w:val="7B390615"/>
-    <w:multiLevelType w:val="hybridMultilevel"/>
-    <w:tmpl w:val="1A48A9D6"/>
-    <w:lvl w:ilvl="0" w:tplc="04090001">
-      <w:start w:val="1"/>
-      <w:numFmt w:val="bullet"/>
-      <w:lvlText w:val=""/>
-      <w:lvlJc w:val="left"/>
-      <w:pPr>
-        <w:ind w:left="720" w:hanging="360"/>
-      </w:pPr>
-      <w:rPr>
-        <w:rFonts w:ascii="Symbol" w:hAnsi="Symbol" w:hint="default"/>
-      </w:rPr>
-    </w:lvl>
-    <w:lvl w:ilvl="1" w:tplc="04090003" w:tentative="1">
-      <w:start w:val="1"/>
-      <w:numFmt w:val="bullet"/>
-      <w:lvlText w:val="o"/>
-      <w:lvlJc w:val="left"/>
-      <w:pPr>
-        <w:ind w:left="1440" w:hanging="360"/>
-      </w:pPr>
-      <w:rPr>
-        <w:rFonts w:ascii="Courier New" w:hAnsi="Courier New" w:hint="default"/>
-      </w:rPr>
-    </w:lvl>
-    <w:lvl w:ilvl="2" w:tplc="04090005" w:tentative="1">
-      <w:start w:val="1"/>
-      <w:numFmt w:val="bullet"/>
-      <w:lvlText w:val=""/>
-      <w:lvlJc w:val="left"/>
-      <w:pPr>
-        <w:ind w:left="2160" w:hanging="360"/>
-      </w:pPr>
-      <w:rPr>
-        <w:rFonts w:ascii="Wingdings" w:hAnsi="Wingdings" w:hint="default"/>
-      </w:rPr>
-    </w:lvl>
-    <w:lvl w:ilvl="3" w:tplc="04090001" w:tentative="1">
-      <w:start w:val="1"/>
-      <w:numFmt w:val="bullet"/>
-      <w:lvlText w:val=""/>
-      <w:lvlJc w:val="left"/>
-      <w:pPr>
-        <w:ind w:left="2880" w:hanging="360"/>
-      </w:pPr>
-      <w:rPr>
-        <w:rFonts w:ascii="Symbol" w:hAnsi="Symbol" w:hint="default"/>
-      </w:rPr>
-    </w:lvl>
-    <w:lvl w:ilvl="4" w:tplc="04090003" w:tentative="1">
-      <w:start w:val="1"/>
-      <w:numFmt w:val="bullet"/>
-      <w:lvlText w:val="o"/>
-      <w:lvlJc w:val="left"/>
-      <w:pPr>
-        <w:ind w:left="3600" w:hanging="360"/>
-      </w:pPr>
-      <w:rPr>
-        <w:rFonts w:ascii="Courier New" w:hAnsi="Courier New" w:hint="default"/>
-      </w:rPr>
-    </w:lvl>
-    <w:lvl w:ilvl="5" w:tplc="04090005" w:tentative="1">
-      <w:start w:val="1"/>
-      <w:numFmt w:val="bullet"/>
-      <w:lvlText w:val=""/>
-      <w:lvlJc w:val="left"/>
-      <w:pPr>
-        <w:ind w:left="4320" w:hanging="360"/>
-      </w:pPr>
-      <w:rPr>
-        <w:rFonts w:ascii="Wingdings" w:hAnsi="Wingdings" w:hint="default"/>
-      </w:rPr>
-    </w:lvl>
-    <w:lvl w:ilvl="6" w:tplc="04090001" w:tentative="1">
-      <w:start w:val="1"/>
-      <w:numFmt w:val="bullet"/>
-      <w:lvlText w:val=""/>
-      <w:lvlJc w:val="left"/>
-      <w:pPr>
-        <w:ind w:left="5040" w:hanging="360"/>
-      </w:pPr>
-      <w:rPr>
-        <w:rFonts w:ascii="Symbol" w:hAnsi="Symbol" w:hint="default"/>
-      </w:rPr>
-    </w:lvl>
-    <w:lvl w:ilvl="7" w:tplc="04090003" w:tentative="1">
-      <w:start w:val="1"/>
-      <w:numFmt w:val="bullet"/>
-      <w:lvlText w:val="o"/>
-      <w:lvlJc w:val="left"/>
-      <w:pPr>
-        <w:ind w:left="5760" w:hanging="360"/>
-      </w:pPr>
-      <w:rPr>
-        <w:rFonts w:ascii="Courier New" w:hAnsi="Courier New" w:hint="default"/>
-      </w:rPr>
-    </w:lvl>
-    <w:lvl w:ilvl="8" w:tplc="04090005" w:tentative="1">
-      <w:start w:val="1"/>
-      <w:numFmt w:val="bullet"/>
-      <w:lvlText w:val=""/>
-      <w:lvlJc w:val="left"/>
-      <w:pPr>
-        <w:ind w:left="6480" w:hanging="360"/>
-      </w:pPr>
-      <w:rPr>
-        <w:rFonts w:ascii="Wingdings" w:hAnsi="Wingdings" w:hint="default"/>
-      </w:rPr>
-    </w:lvl>
-  </w:abstractNum>
-  <w:abstractNum w:abstractNumId="6" w15:restartNumberingAfterBreak="0">
-    <w:nsid w:val="7B39073B"/>
-    <w:multiLevelType w:val="hybridMultilevel"/>
-    <w:tmpl w:val="16FAB58A"/>
-    <w:lvl w:ilvl="0" w:tplc="04090001">
-      <w:start w:val="1"/>
-      <w:numFmt w:val="bullet"/>
-      <w:lvlText w:val=""/>
-      <w:lvlJc w:val="left"/>
-      <w:pPr>
-        <w:ind w:left="720" w:hanging="360"/>
-      </w:pPr>
-      <w:rPr>
-        <w:rFonts w:ascii="Symbol" w:hAnsi="Symbol" w:hint="default"/>
-      </w:rPr>
-    </w:lvl>
-    <w:lvl w:ilvl="1" w:tplc="04090003" w:tentative="1">
-      <w:start w:val="1"/>
-      <w:numFmt w:val="bullet"/>
-      <w:lvlText w:val="o"/>
-      <w:lvlJc w:val="left"/>
-      <w:pPr>
-        <w:ind w:left="1440" w:hanging="360"/>
-      </w:pPr>
-      <w:rPr>
-        <w:rFonts w:ascii="Courier New" w:hAnsi="Courier New" w:hint="default"/>
-      </w:rPr>
-    </w:lvl>
-    <w:lvl w:ilvl="2" w:tplc="04090005" w:tentative="1">
-      <w:start w:val="1"/>
-      <w:numFmt w:val="bullet"/>
-      <w:lvlText w:val=""/>
-      <w:lvlJc w:val="left"/>
-      <w:pPr>
-        <w:ind w:left="2160" w:hanging="360"/>
-      </w:pPr>
-      <w:rPr>
-        <w:rFonts w:ascii="Wingdings" w:hAnsi="Wingdings" w:hint="default"/>
-      </w:rPr>
-    </w:lvl>
-    <w:lvl w:ilvl="3" w:tplc="04090001" w:tentative="1">
-      <w:start w:val="1"/>
-      <w:numFmt w:val="bullet"/>
-      <w:lvlText w:val=""/>
-      <w:lvlJc w:val="left"/>
-      <w:pPr>
-        <w:ind w:left="2880" w:hanging="360"/>
-      </w:pPr>
-      <w:rPr>
-        <w:rFonts w:ascii="Symbol" w:hAnsi="Symbol" w:hint="default"/>
-      </w:rPr>
-    </w:lvl>
-    <w:lvl w:ilvl="4" w:tplc="04090003" w:tentative="1">
-      <w:start w:val="1"/>
-      <w:numFmt w:val="bullet"/>
-      <w:lvlText w:val="o"/>
-      <w:lvlJc w:val="left"/>
-      <w:pPr>
-        <w:ind w:left="3600" w:hanging="360"/>
-      </w:pPr>
-      <w:rPr>
-        <w:rFonts w:ascii="Courier New" w:hAnsi="Courier New" w:hint="default"/>
-      </w:rPr>
-    </w:lvl>
-    <w:lvl w:ilvl="5" w:tplc="04090005" w:tentative="1">
-      <w:start w:val="1"/>
-      <w:numFmt w:val="bullet"/>
-      <w:lvlText w:val=""/>
-      <w:lvlJc w:val="left"/>
-      <w:pPr>
-        <w:ind w:left="4320" w:hanging="360"/>
-      </w:pPr>
-      <w:rPr>
-        <w:rFonts w:ascii="Wingdings" w:hAnsi="Wingdings" w:hint="default"/>
-      </w:rPr>
-    </w:lvl>
-    <w:lvl w:ilvl="6" w:tplc="04090001" w:tentative="1">
-      <w:start w:val="1"/>
-      <w:numFmt w:val="bullet"/>
-      <w:lvlText w:val=""/>
-      <w:lvlJc w:val="left"/>
-      <w:pPr>
-        <w:ind w:left="5040" w:hanging="360"/>
-      </w:pPr>
-      <w:rPr>
-        <w:rFonts w:ascii="Symbol" w:hAnsi="Symbol" w:hint="default"/>
-      </w:rPr>
-    </w:lvl>
-    <w:lvl w:ilvl="7" w:tplc="04090003" w:tentative="1">
-      <w:start w:val="1"/>
-      <w:numFmt w:val="bullet"/>
-      <w:lvlText w:val="o"/>
-      <w:lvlJc w:val="left"/>
-      <w:pPr>
-        <w:ind w:left="5760" w:hanging="360"/>
-      </w:pPr>
-      <w:rPr>
-        <w:rFonts w:ascii="Courier New" w:hAnsi="Courier New" w:hint="default"/>
-      </w:rPr>
-    </w:lvl>
-    <w:lvl w:ilvl="8" w:tplc="04090005" w:tentative="1">
-      <w:start w:val="1"/>
-      <w:numFmt w:val="bullet"/>
-      <w:lvlText w:val=""/>
-      <w:lvlJc w:val="left"/>
-      <w:pPr>
-        <w:ind w:left="6480" w:hanging="360"/>
-      </w:pPr>
-      <w:rPr>
-        <w:rFonts w:ascii="Wingdings" w:hAnsi="Wingdings" w:hint="default"/>
-      </w:rPr>
-    </w:lvl>
-  </w:abstractNum>
-  <w:num w:numId="1" w16cid:durableId="2094275917">
-    <w:abstractNumId w:val="1"/>
-  </w:num>
-  <w:num w:numId="2" w16cid:durableId="1415273931">
-    <w:abstractNumId w:val="2"/>
-  </w:num>
-  <w:num w:numId="3" w16cid:durableId="20665319">
-    <w:abstractNumId w:val="5"/>
-  </w:num>
-  <w:num w:numId="4" w16cid:durableId="282159140">
-    <w:abstractNumId w:val="6"/>
-  </w:num>
-  <w:num w:numId="5" w16cid:durableId="586352131">
-    <w:abstractNumId w:val="0"/>
-  </w:num>
-  <w:num w:numId="6" w16cid:durableId="1340932882">
-    <w:abstractNumId w:val="3"/>
-  </w:num>
-  <w:num w:numId="7" w16cid:durableId="1850482852">
-    <w:abstractNumId w:val="4"/>
-  </w:num>
-</w:numbering>
-</file>
-
 <file path=word/styles.xml><?xml version="1.0" encoding="utf-8"?>
-<w:styles xmlns:mc="http://schemas.openxmlformats.org/markup-compatibility/2006" xmlns:r="http://schemas.openxmlformats.org/officeDocument/2006/relationships" xmlns:w="http://schemas.openxmlformats.org/wordprocessingml/2006/main" xmlns:w14="http://schemas.microsoft.com/office/word/2010/wordml" xmlns:w15="http://schemas.microsoft.com/office/word/2012/wordml" xmlns:w16cex="http://schemas.microsoft.com/office/word/2018/wordml/cex" xmlns:w16cid="http://schemas.microsoft.com/office/word/2016/wordml/cid" xmlns:w16="http://schemas.microsoft.com/office/word/2018/wordml" xmlns:w16du="http://schemas.microsoft.com/office/word/2023/wordml/word16du" xmlns:w16sdtdh="http://schemas.microsoft.com/office/word/2020/wordml/sdtdatahash" xmlns:w16sdtfl="http://schemas.microsoft.com/office/word/2024/wordml/sdtformatlock" xmlns:w16se="http://schemas.microsoft.com/office/word/2015/wordml/symex" mc:Ignorable="w14 w15 w16se w16cid w16 w16cex w16sdtdh w16sdtfl w16du">
+<w:styles xmlns:mc="http://schemas.openxmlformats.org/markup-compatibility/2006" xmlns:o="urn:schemas-microsoft-com:office:office" xmlns:r="http://schemas.openxmlformats.org/officeDocument/2006/relationships" xmlns:m="http://schemas.openxmlformats.org/officeDocument/2006/math" xmlns:v="urn:schemas-microsoft-com:vml" xmlns:w="http://schemas.openxmlformats.org/wordprocessingml/2006/main" xmlns:w14="http://schemas.microsoft.com/office/word/2010/wordml" xmlns:w10="urn:schemas-microsoft-com:office:word" xmlns:sl="http://schemas.openxmlformats.org/schemaLibrary/2006/main" xmlns:wpsCustomData="http://www.wps.cn/officeDocument/2013/wpsCustomData" mc:Ignorable="w14">
   <w:docDefaults>
     <w:rPrDefault>
       <w:rPr>
-        <w:rFonts w:asciiTheme="minorHAnsi" w:eastAsia="Arial" w:hAnsiTheme="minorHAnsi" w:cstheme="minorBidi"/>
-        <w:kern w:val="2"/>
-        <w:sz w:val="24"/>
-        <w:szCs w:val="24"/>
-        <w:lang w:eastAsia="en-US" w:bidi="ar-SA"/>
-        <w14:ligatures w14:val="standardContextual"/>
+        <w:rFonts w:asciiTheme="minorHAnsi" w:hAnsiTheme="minorHAnsi" w:eastAsia="Arial" w:cstheme="minorBidi"/>
       </w:rPr>
     </w:rPrDefault>
-    <w:pPrDefault>
-      <w:pPr>
-        <w:spacing w:line="-32766" w:lineRule="auto"/>
-        <w:ind w:left="57" w:right="57" w:firstLine="720"/>
-        <w:jc w:val="both"/>
-      </w:pPr>
-    </w:pPrDefault>
+    <w:pPrDefault/>
   </w:docDefaults>
-  <w:latentStyles w:defLockedState="0" w:defUIPriority="99" w:defSemiHidden="0" w:defUnhideWhenUsed="0" w:defQFormat="0" w:count="376">
-    <w:lsdException w:name="Normal" w:uiPriority="0" w:qFormat="1"/>
-    <w:lsdException w:name="heading 1" w:uiPriority="9" w:qFormat="1"/>
-    <w:lsdException w:name="heading 2" w:semiHidden="1" w:uiPriority="9" w:unhideWhenUsed="1" w:qFormat="1"/>
-    <w:lsdException w:name="heading 3" w:semiHidden="1" w:uiPriority="9" w:unhideWhenUsed="1" w:qFormat="1"/>
-    <w:lsdException w:name="heading 4" w:semiHidden="1" w:uiPriority="9" w:unhideWhenUsed="1" w:qFormat="1"/>
-    <w:lsdException w:name="heading 5" w:semiHidden="1" w:uiPriority="9" w:unhideWhenUsed="1" w:qFormat="1"/>
-    <w:lsdException w:name="heading 6" w:semiHidden="1" w:uiPriority="9" w:unhideWhenUsed="1" w:qFormat="1"/>
-    <w:lsdException w:name="heading 7" w:semiHidden="1" w:uiPriority="9" w:unhideWhenUsed="1" w:qFormat="1"/>
-    <w:lsdException w:name="heading 8" w:semiHidden="1" w:uiPriority="9" w:unhideWhenUsed="1" w:qFormat="1"/>
-    <w:lsdException w:name="heading 9" w:semiHidden="1" w:uiPriority="9" w:unhideWhenUsed="1" w:qFormat="1"/>
-    <w:lsdException w:name="index 1" w:semiHidden="1" w:unhideWhenUsed="1"/>
-    <w:lsdException w:name="index 2" w:semiHidden="1" w:unhideWhenUsed="1"/>
-    <w:lsdException w:name="index 3" w:semiHidden="1" w:unhideWhenUsed="1"/>
-    <w:lsdException w:name="index 4" w:semiHidden="1" w:unhideWhenUsed="1"/>
-    <w:lsdException w:name="index 5" w:semiHidden="1" w:unhideWhenUsed="1"/>
-    <w:lsdException w:name="index 6" w:semiHidden="1" w:unhideWhenUsed="1"/>
-    <w:lsdException w:name="index 7" w:semiHidden="1" w:unhideWhenUsed="1"/>
-    <w:lsdException w:name="index 8" w:semiHidden="1" w:unhideWhenUsed="1"/>
-    <w:lsdException w:name="index 9" w:semiHidden="1" w:unhideWhenUsed="1"/>
-    <w:lsdException w:name="toc 1" w:semiHidden="1" w:uiPriority="39" w:unhideWhenUsed="1"/>
-    <w:lsdException w:name="toc 2" w:semiHidden="1" w:uiPriority="39" w:unhideWhenUsed="1"/>
-    <w:lsdException w:name="toc 3" w:semiHidden="1" w:uiPriority="39" w:unhideWhenUsed="1"/>
-    <w:lsdException w:name="toc 4" w:semiHidden="1" w:uiPriority="39" w:unhideWhenUsed="1"/>
-    <w:lsdException w:name="toc 5" w:semiHidden="1" w:uiPriority="39" w:unhideWhenUsed="1"/>
-    <w:lsdException w:name="toc 6" w:semiHidden="1" w:uiPriority="39" w:unhideWhenUsed="1"/>
-    <w:lsdException w:name="toc 7" w:semiHidden="1" w:uiPriority="39" w:unhideWhenUsed="1"/>
-    <w:lsdException w:name="toc 8" w:semiHidden="1" w:uiPriority="39" w:unhideWhenUsed="1"/>
-    <w:lsdException w:name="toc 9" w:semiHidden="1" w:uiPriority="39" w:unhideWhenUsed="1"/>
-    <w:lsdException w:name="Normal Indent" w:semiHidden="1" w:unhideWhenUsed="1"/>
-    <w:lsdException w:name="footnote text" w:semiHidden="1" w:unhideWhenUsed="1"/>
-    <w:lsdException w:name="annotation text" w:semiHidden="1" w:unhideWhenUsed="1"/>
-    <w:lsdException w:name="header" w:semiHidden="1" w:unhideWhenUsed="1"/>
-    <w:lsdException w:name="footer" w:semiHidden="1" w:unhideWhenUsed="1"/>
-    <w:lsdException w:name="index heading" w:semiHidden="1" w:unhideWhenUsed="1"/>
-    <w:lsdException w:name="caption" w:semiHidden="1" w:uiPriority="35" w:unhideWhenUsed="1" w:qFormat="1"/>
-    <w:lsdException w:name="table of figures" w:semiHidden="1" w:unhideWhenUsed="1"/>
-    <w:lsdException w:name="envelope address" w:semiHidden="1" w:unhideWhenUsed="1"/>
-    <w:lsdException w:name="envelope return" w:semiHidden="1" w:unhideWhenUsed="1"/>
-    <w:lsdException w:name="footnote reference" w:semiHidden="1" w:unhideWhenUsed="1"/>
-    <w:lsdException w:name="annotation reference" w:semiHidden="1" w:unhideWhenUsed="1"/>
-    <w:lsdException w:name="line number" w:semiHidden="1" w:unhideWhenUsed="1"/>
-    <w:lsdException w:name="page number" w:semiHidden="1" w:unhideWhenUsed="1"/>
-    <w:lsdException w:name="endnote reference" w:semiHidden="1" w:unhideWhenUsed="1"/>
-    <w:lsdException w:name="endnote text" w:semiHidden="1" w:unhideWhenUsed="1"/>
-    <w:lsdException w:name="table of authorities" w:semiHidden="1" w:unhideWhenUsed="1"/>
-    <w:lsdException w:name="macro" w:semiHidden="1" w:unhideWhenUsed="1"/>
-    <w:lsdException w:name="toa heading" w:semiHidden="1" w:unhideWhenUsed="1"/>
-    <w:lsdException w:name="List" w:semiHidden="1" w:unhideWhenUsed="1"/>
-    <w:lsdException w:name="List Bullet" w:semiHidden="1" w:unhideWhenUsed="1"/>
-    <w:lsdException w:name="List Number" w:semiHidden="1" w:unhideWhenUsed="1"/>
-    <w:lsdException w:name="List 2" w:semiHidden="1" w:unhideWhenUsed="1"/>
-    <w:lsdException w:name="List 3" w:semiHidden="1" w:unhideWhenUsed="1"/>
-    <w:lsdException w:name="List 4" w:semiHidden="1" w:unhideWhenUsed="1"/>
-    <w:lsdException w:name="List 5" w:semiHidden="1" w:unhideWhenUsed="1"/>
-    <w:lsdException w:name="List Bullet 2" w:semiHidden="1" w:unhideWhenUsed="1"/>
-    <w:lsdException w:name="List Bullet 3" w:semiHidden="1" w:unhideWhenUsed="1"/>
-    <w:lsdException w:name="List Bullet 4" w:semiHidden="1" w:unhideWhenUsed="1"/>
-    <w:lsdException w:name="List Bullet 5" w:semiHidden="1" w:unhideWhenUsed="1"/>
-    <w:lsdException w:name="List Number 2" w:semiHidden="1" w:unhideWhenUsed="1"/>
-    <w:lsdException w:name="List Number 3" w:semiHidden="1" w:unhideWhenUsed="1"/>
-    <w:lsdException w:name="List Number 4" w:semiHidden="1" w:unhideWhenUsed="1"/>
-    <w:lsdException w:name="List Number 5" w:semiHidden="1" w:unhideWhenUsed="1"/>
-    <w:lsdException w:name="Title" w:uiPriority="10" w:qFormat="1"/>
-    <w:lsdException w:name="Closing" w:semiHidden="1" w:unhideWhenUsed="1"/>
-    <w:lsdException w:name="Signature" w:semiHidden="1" w:unhideWhenUsed="1"/>
-    <w:lsdException w:name="Default Paragraph Font" w:semiHidden="1" w:uiPriority="1" w:unhideWhenUsed="1"/>
-    <w:lsdException w:name="Body Text" w:semiHidden="1" w:unhideWhenUsed="1"/>
-    <w:lsdException w:name="Body Text Indent" w:semiHidden="1" w:unhideWhenUsed="1"/>
-    <w:lsdException w:name="List Continue" w:semiHidden="1" w:unhideWhenUsed="1"/>
-    <w:lsdException w:name="List Continue 2" w:semiHidden="1" w:unhideWhenUsed="1"/>
-    <w:lsdException w:name="List Continue 3" w:semiHidden="1" w:unhideWhenUsed="1"/>
-    <w:lsdException w:name="List Continue 4" w:semiHidden="1" w:unhideWhenUsed="1"/>
-    <w:lsdException w:name="List Continue 5" w:semiHidden="1" w:unhideWhenUsed="1"/>
-    <w:lsdException w:name="Message Header" w:semiHidden="1" w:unhideWhenUsed="1"/>
-    <w:lsdException w:name="Subtitle" w:uiPriority="11" w:qFormat="1"/>
-    <w:lsdException w:name="Salutation" w:semiHidden="1" w:unhideWhenUsed="1"/>
-    <w:lsdException w:name="Date" w:semiHidden="1" w:unhideWhenUsed="1"/>
-    <w:lsdException w:name="Body Text First Indent" w:semiHidden="1" w:unhideWhenUsed="1"/>
-    <w:lsdException w:name="Body Text First Indent 2" w:semiHidden="1" w:unhideWhenUsed="1"/>
-    <w:lsdException w:name="Note Heading" w:semiHidden="1" w:unhideWhenUsed="1"/>
-    <w:lsdException w:name="Body Text 2" w:semiHidden="1" w:unhideWhenUsed="1"/>
-    <w:lsdException w:name="Body Text 3" w:semiHidden="1" w:unhideWhenUsed="1"/>
-    <w:lsdException w:name="Body Text Indent 2" w:semiHidden="1" w:unhideWhenUsed="1"/>
-    <w:lsdException w:name="Body Text Indent 3" w:semiHidden="1" w:unhideWhenUsed="1"/>
-    <w:lsdException w:name="Block Text" w:semiHidden="1" w:unhideWhenUsed="1"/>
-    <w:lsdException w:name="Hyperlink" w:semiHidden="1" w:unhideWhenUsed="1"/>
-    <w:lsdException w:name="FollowedHyperlink" w:semiHidden="1" w:unhideWhenUsed="1"/>
-    <w:lsdException w:name="Strong" w:uiPriority="22" w:qFormat="1"/>
-    <w:lsdException w:name="Emphasis" w:uiPriority="20" w:qFormat="1"/>
-    <w:lsdException w:name="Document Map" w:semiHidden="1" w:unhideWhenUsed="1"/>
-    <w:lsdException w:name="Plain Text" w:semiHidden="1" w:unhideWhenUsed="1"/>
-    <w:lsdException w:name="E-mail Signature" w:semiHidden="1" w:unhideWhenUsed="1"/>
-    <w:lsdException w:name="HTML Top of Form" w:semiHidden="1" w:unhideWhenUsed="1"/>
-    <w:lsdException w:name="HTML Bottom of Form" w:semiHidden="1" w:unhideWhenUsed="1"/>
-    <w:lsdException w:name="Normal (Web)" w:semiHidden="1" w:unhideWhenUsed="1"/>
-    <w:lsdException w:name="HTML Acronym" w:semiHidden="1" w:unhideWhenUsed="1"/>
-    <w:lsdException w:name="HTML Address" w:semiHidden="1" w:unhideWhenUsed="1"/>
-    <w:lsdException w:name="HTML Cite" w:semiHidden="1" w:unhideWhenUsed="1"/>
-    <w:lsdException w:name="HTML Code" w:semiHidden="1" w:unhideWhenUsed="1"/>
-    <w:lsdException w:name="HTML Definition" w:semiHidden="1" w:unhideWhenUsed="1"/>
-    <w:lsdException w:name="HTML Keyboard" w:semiHidden="1" w:unhideWhenUsed="1"/>
-    <w:lsdException w:name="HTML Preformatted" w:semiHidden="1" w:unhideWhenUsed="1"/>
-    <w:lsdException w:name="HTML Sample" w:semiHidden="1" w:unhideWhenUsed="1"/>
-    <w:lsdException w:name="HTML Typewriter" w:semiHidden="1" w:unhideWhenUsed="1"/>
-    <w:lsdException w:name="HTML Variable" w:semiHidden="1" w:unhideWhenUsed="1"/>
-    <w:lsdException w:name="Normal Table" w:semiHidden="1" w:unhideWhenUsed="1"/>
-    <w:lsdException w:name="annotation subject" w:semiHidden="1" w:unhideWhenUsed="1"/>
-    <w:lsdException w:name="No List" w:semiHidden="1" w:unhideWhenUsed="1"/>
-    <w:lsdException w:name="Outline List 1" w:semiHidden="1" w:unhideWhenUsed="1"/>
-    <w:lsdException w:name="Outline List 2" w:semiHidden="1" w:unhideWhenUsed="1"/>
-    <w:lsdException w:name="Outline List 3" w:semiHidden="1" w:unhideWhenUsed="1"/>
-    <w:lsdException w:name="Table Simple 1" w:semiHidden="1" w:unhideWhenUsed="1"/>
-    <w:lsdException w:name="Table Simple 2" w:semiHidden="1" w:unhideWhenUsed="1"/>
-    <w:lsdException w:name="Table Simple 3" w:semiHidden="1" w:unhideWhenUsed="1"/>
-    <w:lsdException w:name="Table Classic 1" w:semiHidden="1" w:unhideWhenUsed="1"/>
-    <w:lsdException w:name="Table Classic 2" w:semiHidden="1" w:unhideWhenUsed="1"/>
-    <w:lsdException w:name="Table Classic 3" w:semiHidden="1" w:unhideWhenUsed="1"/>
-    <w:lsdException w:name="Table Classic 4" w:semiHidden="1" w:unhideWhenUsed="1"/>
-    <w:lsdException w:name="Table Colorful 1" w:semiHidden="1" w:unhideWhenUsed="1"/>
-    <w:lsdException w:name="Table Colorful 2" w:semiHidden="1" w:unhideWhenUsed="1"/>
-    <w:lsdException w:name="Table Colorful 3" w:semiHidden="1" w:unhideWhenUsed="1"/>
-    <w:lsdException w:name="Table Columns 1" w:semiHidden="1" w:unhideWhenUsed="1"/>
-    <w:lsdException w:name="Table Columns 2" w:semiHidden="1" w:unhideWhenUsed="1"/>
-    <w:lsdException w:name="Table Columns 3" w:semiHidden="1" w:unhideWhenUsed="1"/>
-    <w:lsdException w:name="Table Columns 4" w:semiHidden="1" w:unhideWhenUsed="1"/>
-    <w:lsdException w:name="Table Columns 5" w:semiHidden="1" w:unhideWhenUsed="1"/>
-    <w:lsdException w:name="Table Grid 1" w:semiHidden="1" w:unhideWhenUsed="1"/>
-    <w:lsdException w:name="Table Grid 2" w:semiHidden="1" w:unhideWhenUsed="1"/>
-    <w:lsdException w:name="Table Grid 3" w:semiHidden="1" w:unhideWhenUsed="1"/>
-    <w:lsdException w:name="Table Grid 4" w:semiHidden="1" w:unhideWhenUsed="1"/>
-    <w:lsdException w:name="Table Grid 5" w:semiHidden="1" w:unhideWhenUsed="1"/>
-    <w:lsdException w:name="Table Grid 6" w:semiHidden="1" w:unhideWhenUsed="1"/>
-    <w:lsdException w:name="Table Grid 7" w:semiHidden="1" w:unhideWhenUsed="1"/>
-    <w:lsdException w:name="Table Grid 8" w:semiHidden="1" w:unhideWhenUsed="1"/>
-    <w:lsdException w:name="Table List 1" w:semiHidden="1" w:unhideWhenUsed="1"/>
-    <w:lsdException w:name="Table List 2" w:semiHidden="1" w:unhideWhenUsed="1"/>
-    <w:lsdException w:name="Table List 3" w:semiHidden="1" w:unhideWhenUsed="1"/>
-    <w:lsdException w:name="Table List 4" w:semiHidden="1" w:unhideWhenUsed="1"/>
-    <w:lsdException w:name="Table List 5" w:semiHidden="1" w:unhideWhenUsed="1"/>
-    <w:lsdException w:name="Table List 6" w:semiHidden="1" w:unhideWhenUsed="1"/>
-    <w:lsdException w:name="Table List 7" w:semiHidden="1" w:unhideWhenUsed="1"/>
-    <w:lsdException w:name="Table List 8" w:semiHidden="1" w:unhideWhenUsed="1"/>
-    <w:lsdException w:name="Table 3D effects 1" w:semiHidden="1" w:unhideWhenUsed="1"/>
-    <w:lsdException w:name="Table 3D effects 2" w:semiHidden="1" w:unhideWhenUsed="1"/>
-    <w:lsdException w:name="Table 3D effects 3" w:semiHidden="1" w:unhideWhenUsed="1"/>
-    <w:lsdException w:name="Table Contemporary" w:semiHidden="1" w:unhideWhenUsed="1"/>
-    <w:lsdException w:name="Table Elegant" w:semiHidden="1" w:unhideWhenUsed="1"/>
-    <w:lsdException w:name="Table Professional" w:semiHidden="1" w:unhideWhenUsed="1"/>
-    <w:lsdException w:name="Table Subtle 1" w:semiHidden="1" w:unhideWhenUsed="1"/>
-    <w:lsdException w:name="Table Subtle 2" w:semiHidden="1" w:unhideWhenUsed="1"/>
-    <w:lsdException w:name="Table Web 1" w:semiHidden="1" w:unhideWhenUsed="1"/>
-    <w:lsdException w:name="Table Web 2" w:semiHidden="1" w:unhideWhenUsed="1"/>
-    <w:lsdException w:name="Table Web 3" w:semiHidden="1" w:unhideWhenUsed="1"/>
-    <w:lsdException w:name="Balloon Text" w:semiHidden="1" w:unhideWhenUsed="1"/>
-    <w:lsdException w:name="Table Grid" w:uiPriority="39"/>
-    <w:lsdException w:name="Table Theme" w:semiHidden="1" w:unhideWhenUsed="1"/>
-    <w:lsdException w:name="Placeholder Text" w:semiHidden="1"/>
-    <w:lsdException w:name="No Spacing" w:uiPriority="1" w:qFormat="1"/>
-    <w:lsdException w:name="Light Shading" w:uiPriority="60"/>
-    <w:lsdException w:name="Light List" w:uiPriority="61"/>
-    <w:lsdException w:name="Light Grid" w:uiPriority="62"/>
-    <w:lsdException w:name="Medium Shading 1" w:uiPriority="63"/>
-    <w:lsdException w:name="Medium Shading 2" w:uiPriority="64"/>
-    <w:lsdException w:name="Medium List 1" w:uiPriority="65"/>
-    <w:lsdException w:name="Medium List 2" w:uiPriority="66"/>
-    <w:lsdException w:name="Medium Grid 1" w:uiPriority="67"/>
-    <w:lsdException w:name="Medium Grid 2" w:uiPriority="68"/>
-    <w:lsdException w:name="Medium Grid 3" w:uiPriority="69"/>
-    <w:lsdException w:name="Dark List" w:uiPriority="70"/>
-    <w:lsdException w:name="Colorful Shading" w:uiPriority="71"/>
-    <w:lsdException w:name="Colorful List" w:uiPriority="72"/>
-    <w:lsdException w:name="Colorful Grid" w:uiPriority="73"/>
-    <w:lsdException w:name="Light Shading Accent 1" w:uiPriority="60"/>
-    <w:lsdException w:name="Light List Accent 1" w:uiPriority="61"/>
-    <w:lsdException w:name="Light Grid Accent 1" w:uiPriority="62"/>
-    <w:lsdException w:name="Medium Shading 1 Accent 1" w:uiPriority="63"/>
-    <w:lsdException w:name="Medium Shading 2 Accent 1" w:uiPriority="64"/>
-    <w:lsdException w:name="Medium List 1 Accent 1" w:uiPriority="65"/>
-    <w:lsdException w:name="Revision" w:semiHidden="1"/>
-    <w:lsdException w:name="List Paragraph" w:uiPriority="34" w:qFormat="1"/>
-    <w:lsdException w:name="Quote" w:uiPriority="29" w:qFormat="1"/>
-    <w:lsdException w:name="Intense Quote" w:uiPriority="30" w:qFormat="1"/>
-    <w:lsdException w:name="Medium List 2 Accent 1" w:uiPriority="66"/>
-    <w:lsdException w:name="Medium Grid 1 Accent 1" w:uiPriority="67"/>
-    <w:lsdException w:name="Medium Grid 2 Accent 1" w:uiPriority="68"/>
-    <w:lsdException w:name="Medium Grid 3 Accent 1" w:uiPriority="69"/>
-    <w:lsdException w:name="Dark List Accent 1" w:uiPriority="70"/>
-    <w:lsdException w:name="Colorful Shading Accent 1" w:uiPriority="71"/>
-    <w:lsdException w:name="Colorful List Accent 1" w:uiPriority="72"/>
-    <w:lsdException w:name="Colorful Grid Accent 1" w:uiPriority="73"/>
-    <w:lsdException w:name="Light Shading Accent 2" w:uiPriority="60"/>
-    <w:lsdException w:name="Light List Accent 2" w:uiPriority="61"/>
-    <w:lsdException w:name="Light Grid Accent 2" w:uiPriority="62"/>
-    <w:lsdException w:name="Medium Shading 1 Accent 2" w:uiPriority="63"/>
-    <w:lsdException w:name="Medium Shading 2 Accent 2" w:uiPriority="64"/>
-    <w:lsdException w:name="Medium List 1 Accent 2" w:uiPriority="65"/>
-    <w:lsdException w:name="Medium List 2 Accent 2" w:uiPriority="66"/>
-    <w:lsdException w:name="Medium Grid 1 Accent 2" w:uiPriority="67"/>
-    <w:lsdException w:name="Medium Grid 2 Accent 2" w:uiPriority="68"/>
-    <w:lsdException w:name="Medium Grid 3 Accent 2" w:uiPriority="69"/>
-    <w:lsdException w:name="Dark List Accent 2" w:uiPriority="70"/>
-    <w:lsdException w:name="Colorful Shading Accent 2" w:uiPriority="71"/>
-    <w:lsdException w:name="Colorful List Accent 2" w:uiPriority="72"/>
-    <w:lsdException w:name="Colorful Grid Accent 2" w:uiPriority="73"/>
-    <w:lsdException w:name="Light Shading Accent 3" w:uiPriority="60"/>
-    <w:lsdException w:name="Light List Accent 3" w:uiPriority="61"/>
-    <w:lsdException w:name="Light Grid Accent 3" w:uiPriority="62"/>
-    <w:lsdException w:name="Medium Shading 1 Accent 3" w:uiPriority="63"/>
-    <w:lsdException w:name="Medium Shading 2 Accent 3" w:uiPriority="64"/>
-    <w:lsdException w:name="Medium List 1 Accent 3" w:uiPriority="65"/>
-    <w:lsdException w:name="Medium List 2 Accent 3" w:uiPriority="66"/>
-    <w:lsdException w:name="Medium Grid 1 Accent 3" w:uiPriority="67"/>
-    <w:lsdException w:name="Medium Grid 2 Accent 3" w:uiPriority="68"/>
-    <w:lsdException w:name="Medium Grid 3 Accent 3" w:uiPriority="69"/>
-    <w:lsdException w:name="Dark List Accent 3" w:uiPriority="70"/>
-    <w:lsdException w:name="Colorful Shading Accent 3" w:uiPriority="71"/>
-    <w:lsdException w:name="Colorful List Accent 3" w:uiPriority="72"/>
-    <w:lsdException w:name="Colorful Grid Accent 3" w:uiPriority="73"/>
-    <w:lsdException w:name="Light Shading Accent 4" w:uiPriority="60"/>
-    <w:lsdException w:name="Light List Accent 4" w:uiPriority="61"/>
-    <w:lsdException w:name="Light Grid Accent 4" w:uiPriority="62"/>
-    <w:lsdException w:name="Medium Shading 1 Accent 4" w:uiPriority="63"/>
-    <w:lsdException w:name="Medium Shading 2 Accent 4" w:uiPriority="64"/>
-    <w:lsdException w:name="Medium List 1 Accent 4" w:uiPriority="65"/>
-    <w:lsdException w:name="Medium List 2 Accent 4" w:uiPriority="66"/>
-    <w:lsdException w:name="Medium Grid 1 Accent 4" w:uiPriority="67"/>
-    <w:lsdException w:name="Medium Grid 2 Accent 4" w:uiPriority="68"/>
-    <w:lsdException w:name="Medium Grid 3 Accent 4" w:uiPriority="69"/>
-    <w:lsdException w:name="Dark List Accent 4" w:uiPriority="70"/>
-    <w:lsdException w:name="Colorful Shading Accent 4" w:uiPriority="71"/>
-    <w:lsdException w:name="Colorful List Accent 4" w:uiPriority="72"/>
-    <w:lsdException w:name="Colorful Grid Accent 4" w:uiPriority="73"/>
-    <w:lsdException w:name="Light Shading Accent 5" w:uiPriority="60"/>
-    <w:lsdException w:name="Light List Accent 5" w:uiPriority="61"/>
-    <w:lsdException w:name="Light Grid Accent 5" w:uiPriority="62"/>
-    <w:lsdException w:name="Medium Shading 1 Accent 5" w:uiPriority="63"/>
-    <w:lsdException w:name="Medium Shading 2 Accent 5" w:uiPriority="64"/>
-    <w:lsdException w:name="Medium List 1 Accent 5" w:uiPriority="65"/>
-    <w:lsdException w:name="Medium List 2 Accent 5" w:uiPriority="66"/>
-    <w:lsdException w:name="Medium Grid 1 Accent 5" w:uiPriority="67"/>
-    <w:lsdException w:name="Medium Grid 2 Accent 5" w:uiPriority="68"/>
-    <w:lsdException w:name="Medium Grid 3 Accent 5" w:uiPriority="69"/>
-    <w:lsdException w:name="Dark List Accent 5" w:uiPriority="70"/>
-    <w:lsdException w:name="Colorful Shading Accent 5" w:uiPriority="71"/>
-    <w:lsdException w:name="Colorful List Accent 5" w:uiPriority="72"/>
-    <w:lsdException w:name="Colorful Grid Accent 5" w:uiPriority="73"/>
-    <w:lsdException w:name="Light Shading Accent 6" w:uiPriority="60"/>
-    <w:lsdException w:name="Light List Accent 6" w:uiPriority="61"/>
-    <w:lsdException w:name="Light Grid Accent 6" w:uiPriority="62"/>
-    <w:lsdException w:name="Medium Shading 1 Accent 6" w:uiPriority="63"/>
-    <w:lsdException w:name="Medium Shading 2 Accent 6" w:uiPriority="64"/>
-    <w:lsdException w:name="Medium List 1 Accent 6" w:uiPriority="65"/>
-    <w:lsdException w:name="Medium List 2 Accent 6" w:uiPriority="66"/>
-    <w:lsdException w:name="Medium Grid 1 Accent 6" w:uiPriority="67"/>
-    <w:lsdException w:name="Medium Grid 2 Accent 6" w:uiPriority="68"/>
-    <w:lsdException w:name="Medium Grid 3 Accent 6" w:uiPriority="69"/>
-    <w:lsdException w:name="Dark List Accent 6" w:uiPriority="70"/>
-    <w:lsdException w:name="Colorful Shading Accent 6" w:uiPriority="71"/>
-    <w:lsdException w:name="Colorful List Accent 6" w:uiPriority="72"/>
-    <w:lsdException w:name="Colorful Grid Accent 6" w:uiPriority="73"/>
-    <w:lsdException w:name="Subtle Emphasis" w:uiPriority="19" w:qFormat="1"/>
-    <w:lsdException w:name="Intense Emphasis" w:uiPriority="21" w:qFormat="1"/>
-    <w:lsdException w:name="Subtle Reference" w:uiPriority="31" w:qFormat="1"/>
-    <w:lsdException w:name="Intense Reference" w:uiPriority="32" w:qFormat="1"/>
-    <w:lsdException w:name="Book Title" w:uiPriority="33" w:qFormat="1"/>
-    <w:lsdException w:name="Bibliography" w:semiHidden="1" w:uiPriority="37" w:unhideWhenUsed="1"/>
-    <w:lsdException w:name="TOC Heading" w:semiHidden="1" w:uiPriority="39" w:unhideWhenUsed="1" w:qFormat="1"/>
-    <w:lsdException w:name="Plain Table 1" w:uiPriority="41"/>
-    <w:lsdException w:name="Plain Table 2" w:uiPriority="42"/>
-    <w:lsdException w:name="Plain Table 3" w:uiPriority="43"/>
-    <w:lsdException w:name="Plain Table 4" w:uiPriority="44"/>
-    <w:lsdException w:name="Plain Table 5" w:uiPriority="45"/>
-    <w:lsdException w:name="Grid Table Light" w:uiPriority="40"/>
-    <w:lsdException w:name="Grid Table 1 Light" w:uiPriority="46"/>
-    <w:lsdException w:name="Grid Table 2" w:uiPriority="47"/>
-    <w:lsdException w:name="Grid Table 3" w:uiPriority="48"/>
-    <w:lsdException w:name="Grid Table 4" w:uiPriority="49"/>
-    <w:lsdException w:name="Grid Table 5 Dark" w:uiPriority="50"/>
-    <w:lsdException w:name="Grid Table 6 Colorful" w:uiPriority="51"/>
-    <w:lsdException w:name="Grid Table 7 Colorful" w:uiPriority="52"/>
-    <w:lsdException w:name="Grid Table 1 Light Accent 1" w:uiPriority="46"/>
-    <w:lsdException w:name="Grid Table 2 Accent 1" w:uiPriority="47"/>
-    <w:lsdException w:name="Grid Table 3 Accent 1" w:uiPriority="48"/>
-    <w:lsdException w:name="Grid Table 4 Accent 1" w:uiPriority="49"/>
-    <w:lsdException w:name="Grid Table 5 Dark Accent 1" w:uiPriority="50"/>
-    <w:lsdException w:name="Grid Table 6 Colorful Accent 1" w:uiPriority="51"/>
-    <w:lsdException w:name="Grid Table 7 Colorful Accent 1" w:uiPriority="52"/>
-    <w:lsdException w:name="Grid Table 1 Light Accent 2" w:uiPriority="46"/>
-    <w:lsdException w:name="Grid Table 2 Accent 2" w:uiPriority="47"/>
-    <w:lsdException w:name="Grid Table 3 Accent 2" w:uiPriority="48"/>
-    <w:lsdException w:name="Grid Table 4 Accent 2" w:uiPriority="49"/>
-    <w:lsdException w:name="Grid Table 5 Dark Accent 2" w:uiPriority="50"/>
-    <w:lsdException w:name="Grid Table 6 Colorful Accent 2" w:uiPriority="51"/>
-    <w:lsdException w:name="Grid Table 7 Colorful Accent 2" w:uiPriority="52"/>
-    <w:lsdException w:name="Grid Table 1 Light Accent 3" w:uiPriority="46"/>
-    <w:lsdException w:name="Grid Table 2 Accent 3" w:uiPriority="47"/>
-    <w:lsdException w:name="Grid Table 3 Accent 3" w:uiPriority="48"/>
-    <w:lsdException w:name="Grid Table 4 Accent 3" w:uiPriority="49"/>
-    <w:lsdException w:name="Grid Table 5 Dark Accent 3" w:uiPriority="50"/>
-    <w:lsdException w:name="Grid Table 6 Colorful Accent 3" w:uiPriority="51"/>
-    <w:lsdException w:name="Grid Table 7 Colorful Accent 3" w:uiPriority="52"/>
-    <w:lsdException w:name="Grid Table 1 Light Accent 4" w:uiPriority="46"/>
-    <w:lsdException w:name="Grid Table 2 Accent 4" w:uiPriority="47"/>
-    <w:lsdException w:name="Grid Table 3 Accent 4" w:uiPriority="48"/>
-    <w:lsdException w:name="Grid Table 4 Accent 4" w:uiPriority="49"/>
-    <w:lsdException w:name="Grid Table 5 Dark Accent 4" w:uiPriority="50"/>
-    <w:lsdException w:name="Grid Table 6 Colorful Accent 4" w:uiPriority="51"/>
-    <w:lsdException w:name="Grid Table 7 Colorful Accent 4" w:uiPriority="52"/>
-    <w:lsdException w:name="Grid Table 1 Light Accent 5" w:uiPriority="46"/>
-    <w:lsdException w:name="Grid Table 2 Accent 5" w:uiPriority="47"/>
-    <w:lsdException w:name="Grid Table 3 Accent 5" w:uiPriority="48"/>
-    <w:lsdException w:name="Grid Table 4 Accent 5" w:uiPriority="49"/>
-    <w:lsdException w:name="Grid Table 5 Dark Accent 5" w:uiPriority="50"/>
-    <w:lsdException w:name="Grid Table 6 Colorful Accent 5" w:uiPriority="51"/>
-    <w:lsdException w:name="Grid Table 7 Colorful Accent 5" w:uiPriority="52"/>
-    <w:lsdException w:name="Grid Table 1 Light Accent 6" w:uiPriority="46"/>
-    <w:lsdException w:name="Grid Table 2 Accent 6" w:uiPriority="47"/>
-    <w:lsdException w:name="Grid Table 3 Accent 6" w:uiPriority="48"/>
-    <w:lsdException w:name="Grid Table 4 Accent 6" w:uiPriority="49"/>
-    <w:lsdException w:name="Grid Table 5 Dark Accent 6" w:uiPriority="50"/>
-    <w:lsdException w:name="Grid Table 6 Colorful Accent 6" w:uiPriority="51"/>
-    <w:lsdException w:name="Grid Table 7 Colorful Accent 6" w:uiPriority="52"/>
-    <w:lsdException w:name="List Table 1 Light" w:uiPriority="46"/>
-    <w:lsdException w:name="List Table 2" w:uiPriority="47"/>
-    <w:lsdException w:name="List Table 3" w:uiPriority="48"/>
-    <w:lsdException w:name="List Table 4" w:uiPriority="49"/>
-    <w:lsdException w:name="List Table 5 Dark" w:uiPriority="50"/>
-    <w:lsdException w:name="List Table 6 Colorful" w:uiPriority="51"/>
-    <w:lsdException w:name="List Table 7 Colorful" w:uiPriority="52"/>
-    <w:lsdException w:name="List Table 1 Light Accent 1" w:uiPriority="46"/>
-    <w:lsdException w:name="List Table 2 Accent 1" w:uiPriority="47"/>
-    <w:lsdException w:name="List Table 3 Accent 1" w:uiPriority="48"/>
-    <w:lsdException w:name="List Table 4 Accent 1" w:uiPriority="49"/>
-    <w:lsdException w:name="List Table 5 Dark Accent 1" w:uiPriority="50"/>
-    <w:lsdException w:name="List Table 6 Colorful Accent 1" w:uiPriority="51"/>
-    <w:lsdException w:name="List Table 7 Colorful Accent 1" w:uiPriority="52"/>
-    <w:lsdException w:name="List Table 1 Light Accent 2" w:uiPriority="46"/>
-    <w:lsdException w:name="List Table 2 Accent 2" w:uiPriority="47"/>
-    <w:lsdException w:name="List Table 3 Accent 2" w:uiPriority="48"/>
-    <w:lsdException w:name="List Table 4 Accent 2" w:uiPriority="49"/>
-    <w:lsdException w:name="List Table 5 Dark Accent 2" w:uiPriority="50"/>
-    <w:lsdException w:name="List Table 6 Colorful Accent 2" w:uiPriority="51"/>
-    <w:lsdException w:name="List Table 7 Colorful Accent 2" w:uiPriority="52"/>
-    <w:lsdException w:name="List Table 1 Light Accent 3" w:uiPriority="46"/>
-    <w:lsdException w:name="List Table 2 Accent 3" w:uiPriority="47"/>
-    <w:lsdException w:name="List Table 3 Accent 3" w:uiPriority="48"/>
-    <w:lsdException w:name="List Table 4 Accent 3" w:uiPriority="49"/>
-    <w:lsdException w:name="List Table 5 Dark Accent 3" w:uiPriority="50"/>
-    <w:lsdException w:name="List Table 6 Colorful Accent 3" w:uiPriority="51"/>
-    <w:lsdException w:name="List Table 7 Colorful Accent 3" w:uiPriority="52"/>
-    <w:lsdException w:name="List Table 1 Light Accent 4" w:uiPriority="46"/>
-    <w:lsdException w:name="List Table 2 Accent 4" w:uiPriority="47"/>
-    <w:lsdException w:name="List Table 3 Accent 4" w:uiPriority="48"/>
-    <w:lsdException w:name="List Table 4 Accent 4" w:uiPriority="49"/>
-    <w:lsdException w:name="List Table 5 Dark Accent 4" w:uiPriority="50"/>
-    <w:lsdException w:name="List Table 6 Colorful Accent 4" w:uiPriority="51"/>
-    <w:lsdException w:name="List Table 7 Colorful Accent 4" w:uiPriority="52"/>
-    <w:lsdException w:name="List Table 1 Light Accent 5" w:uiPriority="46"/>
-    <w:lsdException w:name="List Table 2 Accent 5" w:uiPriority="47"/>
-    <w:lsdException w:name="List Table 3 Accent 5" w:uiPriority="48"/>
-    <w:lsdException w:name="List Table 4 Accent 5" w:uiPriority="49"/>
-    <w:lsdException w:name="List Table 5 Dark Accent 5" w:uiPriority="50"/>
-    <w:lsdException w:name="List Table 6 Colorful Accent 5" w:uiPriority="51"/>
-    <w:lsdException w:name="List Table 7 Colorful Accent 5" w:uiPriority="52"/>
-    <w:lsdException w:name="List Table 1 Light Accent 6" w:uiPriority="46"/>
-    <w:lsdException w:name="List Table 2 Accent 6" w:uiPriority="47"/>
-    <w:lsdException w:name="List Table 3 Accent 6" w:uiPriority="48"/>
-    <w:lsdException w:name="List Table 4 Accent 6" w:uiPriority="49"/>
-    <w:lsdException w:name="List Table 5 Dark Accent 6" w:uiPriority="50"/>
-    <w:lsdException w:name="List Table 6 Colorful Accent 6" w:uiPriority="51"/>
-    <w:lsdException w:name="List Table 7 Colorful Accent 6" w:uiPriority="52"/>
-    <w:lsdException w:name="Mention" w:semiHidden="1" w:unhideWhenUsed="1"/>
-    <w:lsdException w:name="Smart Hyperlink" w:semiHidden="1" w:unhideWhenUsed="1"/>
-    <w:lsdException w:name="Hashtag" w:semiHidden="1" w:unhideWhenUsed="1"/>
-    <w:lsdException w:name="Unresolved Mention" w:semiHidden="1" w:unhideWhenUsed="1"/>
-    <w:lsdException w:name="Smart Link" w:semiHidden="1" w:unhideWhenUsed="1"/>
+  <w:latentStyles w:count="260" w:defQFormat="0" w:defUnhideWhenUsed="1" w:defSemiHidden="1" w:defUIPriority="99" w:defLockedState="0">
+    <w:lsdException w:qFormat="1" w:unhideWhenUsed="0" w:uiPriority="0" w:semiHidden="0" w:name="Normal"/>
+    <w:lsdException w:qFormat="1" w:unhideWhenUsed="0" w:uiPriority="9" w:semiHidden="0" w:name="heading 1"/>
+    <w:lsdException w:qFormat="1" w:uiPriority="9" w:semiHidden="0" w:name="heading 2"/>
+    <w:lsdException w:qFormat="1" w:uiPriority="9" w:name="heading 3"/>
+    <w:lsdException w:qFormat="1" w:uiPriority="9" w:name="heading 4"/>
+    <w:lsdException w:qFormat="1" w:uiPriority="9" w:name="heading 5"/>
+    <w:lsdException w:qFormat="1" w:uiPriority="9" w:name="heading 6"/>
+    <w:lsdException w:qFormat="1" w:uiPriority="9" w:name="heading 7"/>
+    <w:lsdException w:qFormat="1" w:uiPriority="9" w:name="heading 8"/>
+    <w:lsdException w:qFormat="1" w:uiPriority="9" w:name="heading 9"/>
+    <w:lsdException w:uiPriority="99" w:name="index 1"/>
+    <w:lsdException w:uiPriority="99" w:name="index 2"/>
+    <w:lsdException w:uiPriority="99" w:name="index 3"/>
+    <w:lsdException w:uiPriority="99" w:name="index 4"/>
+    <w:lsdException w:uiPriority="99" w:name="index 5"/>
+    <w:lsdException w:uiPriority="99" w:name="index 6"/>
+    <w:lsdException w:uiPriority="99" w:name="index 7"/>
+    <w:lsdException w:uiPriority="99" w:name="index 8"/>
+    <w:lsdException w:uiPriority="99" w:name="index 9"/>
+    <w:lsdException w:uiPriority="39" w:name="toc 1"/>
+    <w:lsdException w:uiPriority="39" w:name="toc 2"/>
+    <w:lsdException w:uiPriority="39" w:name="toc 3"/>
+    <w:lsdException w:uiPriority="39" w:name="toc 4"/>
+    <w:lsdException w:uiPriority="39" w:name="toc 5"/>
+    <w:lsdException w:uiPriority="39" w:name="toc 6"/>
+    <w:lsdException w:uiPriority="39" w:name="toc 7"/>
+    <w:lsdException w:uiPriority="39" w:name="toc 8"/>
+    <w:lsdException w:uiPriority="39" w:name="toc 9"/>
+    <w:lsdException w:uiPriority="99" w:name="Normal Indent"/>
+    <w:lsdException w:uiPriority="99" w:name="footnote text"/>
+    <w:lsdException w:qFormat="1" w:uiPriority="99" w:name="annotation text"/>
+    <w:lsdException w:qFormat="1" w:uiPriority="99" w:semiHidden="0" w:name="header"/>
+    <w:lsdException w:qFormat="1" w:uiPriority="99" w:semiHidden="0" w:name="footer"/>
+    <w:lsdException w:uiPriority="99" w:name="index heading"/>
+    <w:lsdException w:qFormat="1" w:uiPriority="35" w:name="caption"/>
+    <w:lsdException w:uiPriority="99" w:name="table of figures"/>
+    <w:lsdException w:uiPriority="99" w:name="envelope address"/>
+    <w:lsdException w:uiPriority="99" w:name="envelope return"/>
+    <w:lsdException w:uiPriority="99" w:name="footnote reference"/>
+    <w:lsdException w:qFormat="1" w:uiPriority="99" w:name="annotation reference"/>
+    <w:lsdException w:uiPriority="99" w:name="line number"/>
+    <w:lsdException w:uiPriority="99" w:name="page number"/>
+    <w:lsdException w:uiPriority="99" w:name="endnote reference"/>
+    <w:lsdException w:uiPriority="99" w:name="endnote text"/>
+    <w:lsdException w:uiPriority="99" w:name="table of authorities"/>
+    <w:lsdException w:uiPriority="99" w:name="macro"/>
+    <w:lsdException w:uiPriority="99" w:name="toa heading"/>
+    <w:lsdException w:uiPriority="99" w:name="List"/>
+    <w:lsdException w:uiPriority="99" w:name="List Bullet"/>
+    <w:lsdException w:uiPriority="99" w:name="List Number"/>
+    <w:lsdException w:uiPriority="99" w:name="List 2"/>
+    <w:lsdException w:uiPriority="99" w:name="List 3"/>
+    <w:lsdException w:uiPriority="99" w:name="List 4"/>
+    <w:lsdException w:uiPriority="99" w:name="List 5"/>
+    <w:lsdException w:uiPriority="99" w:name="List Bullet 2"/>
+    <w:lsdException w:uiPriority="99" w:name="List Bullet 3"/>
+    <w:lsdException w:uiPriority="99" w:name="List Bullet 4"/>
+    <w:lsdException w:uiPriority="99" w:name="List Bullet 5"/>
+    <w:lsdException w:uiPriority="99" w:name="List Number 2"/>
+    <w:lsdException w:uiPriority="99" w:name="List Number 3"/>
+    <w:lsdException w:uiPriority="99" w:name="List Number 4"/>
+    <w:lsdException w:uiPriority="99" w:name="List Number 5"/>
+    <w:lsdException w:qFormat="1" w:unhideWhenUsed="0" w:uiPriority="10" w:semiHidden="0" w:name="Title"/>
+    <w:lsdException w:uiPriority="99" w:name="Closing"/>
+    <w:lsdException w:uiPriority="99" w:name="Signature"/>
+    <w:lsdException w:qFormat="1" w:uiPriority="1" w:name="Default Paragraph Font"/>
+    <w:lsdException w:uiPriority="99" w:name="Body Text"/>
+    <w:lsdException w:uiPriority="99" w:name="Body Text Indent"/>
+    <w:lsdException w:uiPriority="99" w:name="List Continue"/>
+    <w:lsdException w:uiPriority="99" w:name="List Continue 2"/>
+    <w:lsdException w:uiPriority="99" w:name="List Continue 3"/>
+    <w:lsdException w:uiPriority="99" w:name="List Continue 4"/>
+    <w:lsdException w:uiPriority="99" w:name="List Continue 5"/>
+    <w:lsdException w:uiPriority="99" w:name="Message Header"/>
+    <w:lsdException w:qFormat="1" w:unhideWhenUsed="0" w:uiPriority="11" w:semiHidden="0" w:name="Subtitle"/>
+    <w:lsdException w:uiPriority="99" w:name="Salutation"/>
+    <w:lsdException w:uiPriority="99" w:name="Date"/>
+    <w:lsdException w:uiPriority="99" w:name="Body Text First Indent"/>
+    <w:lsdException w:uiPriority="99" w:name="Body Text First Indent 2"/>
+    <w:lsdException w:uiPriority="99" w:name="Note Heading"/>
+    <w:lsdException w:uiPriority="99" w:name="Body Text 2"/>
+    <w:lsdException w:uiPriority="99" w:name="Body Text 3"/>
+    <w:lsdException w:uiPriority="99" w:name="Body Text Indent 2"/>
+    <w:lsdException w:uiPriority="99" w:name="Body Text Indent 3"/>
+    <w:lsdException w:uiPriority="99" w:name="Block Text"/>
+    <w:lsdException w:uiPriority="99" w:name="Hyperlink"/>
+    <w:lsdException w:uiPriority="99" w:name="FollowedHyperlink"/>
+    <w:lsdException w:qFormat="1" w:unhideWhenUsed="0" w:uiPriority="22" w:semiHidden="0" w:name="Strong"/>
+    <w:lsdException w:qFormat="1" w:unhideWhenUsed="0" w:uiPriority="20" w:semiHidden="0" w:name="Emphasis"/>
+    <w:lsdException w:uiPriority="99" w:name="Document Map"/>
+    <w:lsdException w:uiPriority="99" w:name="Plain Text"/>
+    <w:lsdException w:uiPriority="99" w:name="E-mail Signature"/>
+    <w:lsdException w:qFormat="1" w:uiPriority="99" w:semiHidden="0" w:name="Normal (Web)"/>
+    <w:lsdException w:uiPriority="99" w:name="HTML Acronym"/>
+    <w:lsdException w:uiPriority="99" w:name="HTML Address"/>
+    <w:lsdException w:uiPriority="99" w:name="HTML Cite"/>
+    <w:lsdException w:uiPriority="99" w:name="HTML Code"/>
+    <w:lsdException w:uiPriority="99" w:name="HTML Definition"/>
+    <w:lsdException w:uiPriority="99" w:name="HTML Keyboard"/>
+    <w:lsdException w:uiPriority="99" w:name="HTML Preformatted"/>
+    <w:lsdException w:uiPriority="99" w:name="HTML Sample"/>
+    <w:lsdException w:uiPriority="99" w:name="HTML Typewriter"/>
+    <w:lsdException w:uiPriority="99" w:name="HTML Variable"/>
+    <w:lsdException w:qFormat="1" w:uiPriority="99" w:name="Normal Table"/>
+    <w:lsdException w:uiPriority="99" w:name="annotation subject"/>
+    <w:lsdException w:uiPriority="99" w:name="Table Simple 1"/>
+    <w:lsdException w:uiPriority="99" w:name="Table Simple 2"/>
+    <w:lsdException w:uiPriority="99" w:name="Table Simple 3"/>
+    <w:lsdException w:uiPriority="99" w:name="Table Classic 1"/>
+    <w:lsdException w:uiPriority="99" w:name="Table Classic 2"/>
+    <w:lsdException w:uiPriority="99" w:name="Table Classic 3"/>
+    <w:lsdException w:uiPriority="99" w:name="Table Classic 4"/>
+    <w:lsdException w:uiPriority="99" w:name="Table Colorful 1"/>
+    <w:lsdException w:uiPriority="99" w:name="Table Colorful 2"/>
+    <w:lsdException w:uiPriority="99" w:name="Table Colorful 3"/>
+    <w:lsdException w:uiPriority="99" w:name="Table Columns 1"/>
+    <w:lsdException w:uiPriority="99" w:name="Table Columns 2"/>
+    <w:lsdException w:uiPriority="99" w:name="Table Columns 3"/>
+    <w:lsdException w:uiPriority="99" w:name="Table Columns 4"/>
+    <w:lsdException w:uiPriority="99" w:name="Table Columns 5"/>
+    <w:lsdException w:uiPriority="99" w:name="Table Grid 1"/>
+    <w:lsdException w:uiPriority="99" w:name="Table Grid 2"/>
+    <w:lsdException w:uiPriority="99" w:name="Table Grid 3"/>
+    <w:lsdException w:uiPriority="99" w:name="Table Grid 4"/>
+    <w:lsdException w:uiPriority="99" w:name="Table Grid 5"/>
+    <w:lsdException w:uiPriority="99" w:name="Table Grid 6"/>
+    <w:lsdException w:uiPriority="99" w:name="Table Grid 7"/>
+    <w:lsdException w:uiPriority="99" w:name="Table Grid 8"/>
+    <w:lsdException w:uiPriority="99" w:name="Table List 1"/>
+    <w:lsdException w:uiPriority="99" w:name="Table List 2"/>
+    <w:lsdException w:uiPriority="99" w:name="Table List 3"/>
+    <w:lsdException w:uiPriority="99" w:name="Table List 4"/>
+    <w:lsdException w:uiPriority="99" w:name="Table List 5"/>
+    <w:lsdException w:uiPriority="99" w:name="Table List 6"/>
+    <w:lsdException w:uiPriority="99" w:name="Table List 7"/>
+    <w:lsdException w:uiPriority="99" w:name="Table List 8"/>
+    <w:lsdException w:uiPriority="99" w:name="Table 3D effects 1"/>
+    <w:lsdException w:uiPriority="99" w:name="Table 3D effects 2"/>
+    <w:lsdException w:uiPriority="99" w:name="Table 3D effects 3"/>
+    <w:lsdException w:uiPriority="99" w:name="Table Contemporary"/>
+    <w:lsdException w:uiPriority="99" w:name="Table Elegant"/>
+    <w:lsdException w:uiPriority="99" w:name="Table Professional"/>
+    <w:lsdException w:uiPriority="99" w:name="Table Subtle 1"/>
+    <w:lsdException w:uiPriority="99" w:name="Table Subtle 2"/>
+    <w:lsdException w:uiPriority="99" w:name="Table Web 1"/>
+    <w:lsdException w:uiPriority="99" w:name="Table Web 2"/>
+    <w:lsdException w:uiPriority="99" w:name="Table Web 3"/>
+    <w:lsdException w:uiPriority="99" w:name="Balloon Text"/>
+    <w:lsdException w:qFormat="1" w:unhideWhenUsed="0" w:uiPriority="39" w:semiHidden="0" w:name="Table Grid"/>
+    <w:lsdException w:uiPriority="99" w:name="Table Theme"/>
+    <w:lsdException w:unhideWhenUsed="0" w:uiPriority="60" w:semiHidden="0" w:name="Light Shading"/>
+    <w:lsdException w:unhideWhenUsed="0" w:uiPriority="61" w:semiHidden="0" w:name="Light List"/>
+    <w:lsdException w:unhideWhenUsed="0" w:uiPriority="62" w:semiHidden="0" w:name="Light Grid"/>
+    <w:lsdException w:unhideWhenUsed="0" w:uiPriority="63" w:semiHidden="0" w:name="Medium Shading 1"/>
+    <w:lsdException w:unhideWhenUsed="0" w:uiPriority="64" w:semiHidden="0" w:name="Medium Shading 2"/>
+    <w:lsdException w:unhideWhenUsed="0" w:uiPriority="65" w:semiHidden="0" w:name="Medium List 1"/>
+    <w:lsdException w:unhideWhenUsed="0" w:uiPriority="66" w:semiHidden="0" w:name="Medium List 2"/>
+    <w:lsdException w:unhideWhenUsed="0" w:uiPriority="67" w:semiHidden="0" w:name="Medium Grid 1"/>
+    <w:lsdException w:unhideWhenUsed="0" w:uiPriority="68" w:semiHidden="0" w:name="Medium Grid 2"/>
+    <w:lsdException w:unhideWhenUsed="0" w:uiPriority="69" w:semiHidden="0" w:name="Medium Grid 3"/>
+    <w:lsdException w:unhideWhenUsed="0" w:uiPriority="70" w:semiHidden="0" w:name="Dark List"/>
+    <w:lsdException w:unhideWhenUsed="0" w:uiPriority="71" w:semiHidden="0" w:name="Colorful Shading"/>
+    <w:lsdException w:unhideWhenUsed="0" w:uiPriority="72" w:semiHidden="0" w:name="Colorful List"/>
+    <w:lsdException w:unhideWhenUsed="0" w:uiPriority="73" w:semiHidden="0" w:name="Colorful Grid"/>
+    <w:lsdException w:unhideWhenUsed="0" w:uiPriority="60" w:semiHidden="0" w:name="Light Shading Accent 1"/>
+    <w:lsdException w:unhideWhenUsed="0" w:uiPriority="61" w:semiHidden="0" w:name="Light List Accent 1"/>
+    <w:lsdException w:unhideWhenUsed="0" w:uiPriority="62" w:semiHidden="0" w:name="Light Grid Accent 1"/>
+    <w:lsdException w:unhideWhenUsed="0" w:uiPriority="63" w:semiHidden="0" w:name="Medium Shading 1 Accent 1"/>
+    <w:lsdException w:unhideWhenUsed="0" w:uiPriority="64" w:semiHidden="0" w:name="Medium Shading 2 Accent 1"/>
+    <w:lsdException w:unhideWhenUsed="0" w:uiPriority="65" w:semiHidden="0" w:name="Medium List 1 Accent 1"/>
+    <w:lsdException w:qFormat="1" w:unhideWhenUsed="0" w:uiPriority="34" w:semiHidden="0" w:name="List Paragraph"/>
+    <w:lsdException w:qFormat="1" w:unhideWhenUsed="0" w:uiPriority="29" w:semiHidden="0" w:name="Quote"/>
+    <w:lsdException w:qFormat="1" w:unhideWhenUsed="0" w:uiPriority="30" w:semiHidden="0" w:name="Intense Quote"/>
+    <w:lsdException w:unhideWhenUsed="0" w:uiPriority="66" w:semiHidden="0" w:name="Medium List 2 Accent 1"/>
+    <w:lsdException w:unhideWhenUsed="0" w:uiPriority="67" w:semiHidden="0" w:name="Medium Grid 1 Accent 1"/>
+    <w:lsdException w:unhideWhenUsed="0" w:uiPriority="68" w:semiHidden="0" w:name="Medium Grid 2 Accent 1"/>
+    <w:lsdException w:unhideWhenUsed="0" w:uiPriority="69" w:semiHidden="0" w:name="Medium Grid 3 Accent 1"/>
+    <w:lsdException w:unhideWhenUsed="0" w:uiPriority="70" w:semiHidden="0" w:name="Dark List Accent 1"/>
+    <w:lsdException w:unhideWhenUsed="0" w:uiPriority="71" w:semiHidden="0" w:name="Colorful Shading Accent 1"/>
+    <w:lsdException w:unhideWhenUsed="0" w:uiPriority="72" w:semiHidden="0" w:name="Colorful List Accent 1"/>
+    <w:lsdException w:unhideWhenUsed="0" w:uiPriority="73" w:semiHidden="0" w:name="Colorful Grid Accent 1"/>
+    <w:lsdException w:unhideWhenUsed="0" w:uiPriority="60" w:semiHidden="0" w:name="Light Shading Accent 2"/>
+    <w:lsdException w:unhideWhenUsed="0" w:uiPriority="61" w:semiHidden="0" w:name="Light List Accent 2"/>
+    <w:lsdException w:unhideWhenUsed="0" w:uiPriority="62" w:semiHidden="0" w:name="Light Grid Accent 2"/>
+    <w:lsdException w:unhideWhenUsed="0" w:uiPriority="63" w:semiHidden="0" w:name="Medium Shading 1 Accent 2"/>
+    <w:lsdException w:unhideWhenUsed="0" w:uiPriority="64" w:semiHidden="0" w:name="Medium Shading 2 Accent 2"/>
+    <w:lsdException w:unhideWhenUsed="0" w:uiPriority="65" w:semiHidden="0" w:name="Medium List 1 Accent 2"/>
+    <w:lsdException w:unhideWhenUsed="0" w:uiPriority="66" w:semiHidden="0" w:name="Medium List 2 Accent 2"/>
+    <w:lsdException w:unhideWhenUsed="0" w:uiPriority="67" w:semiHidden="0" w:name="Medium Grid 1 Accent 2"/>
+    <w:lsdException w:unhideWhenUsed="0" w:uiPriority="68" w:semiHidden="0" w:name="Medium Grid 2 Accent 2"/>
+    <w:lsdException w:unhideWhenUsed="0" w:uiPriority="69" w:semiHidden="0" w:name="Medium Grid 3 Accent 2"/>
+    <w:lsdException w:unhideWhenUsed="0" w:uiPriority="70" w:semiHidden="0" w:name="Dark List Accent 2"/>
+    <w:lsdException w:unhideWhenUsed="0" w:uiPriority="71" w:semiHidden="0" w:name="Colorful Shading Accent 2"/>
+    <w:lsdException w:unhideWhenUsed="0" w:uiPriority="72" w:semiHidden="0" w:name="Colorful List Accent 2"/>
+    <w:lsdException w:unhideWhenUsed="0" w:uiPriority="73" w:semiHidden="0" w:name="Colorful Grid Accent 2"/>
+    <w:lsdException w:unhideWhenUsed="0" w:uiPriority="60" w:semiHidden="0" w:name="Light Shading Accent 3"/>
+    <w:lsdException w:unhideWhenUsed="0" w:uiPriority="61" w:semiHidden="0" w:name="Light List Accent 3"/>
+    <w:lsdException w:unhideWhenUsed="0" w:uiPriority="62" w:semiHidden="0" w:name="Light Grid Accent 3"/>
+    <w:lsdException w:unhideWhenUsed="0" w:uiPriority="63" w:semiHidden="0" w:name="Medium Shading 1 Accent 3"/>
+    <w:lsdException w:unhideWhenUsed="0" w:uiPriority="64" w:semiHidden="0" w:name="Medium Shading 2 Accent 3"/>
+    <w:lsdException w:unhideWhenUsed="0" w:uiPriority="65" w:semiHidden="0" w:name="Medium List 1 Accent 3"/>
+    <w:lsdException w:unhideWhenUsed="0" w:uiPriority="66" w:semiHidden="0" w:name="Medium List 2 Accent 3"/>
+    <w:lsdException w:unhideWhenUsed="0" w:uiPriority="67" w:semiHidden="0" w:name="Medium Grid 1 Accent 3"/>
+    <w:lsdException w:unhideWhenUsed="0" w:uiPriority="68" w:semiHidden="0" w:name="Medium Grid 2 Accent 3"/>
+    <w:lsdException w:unhideWhenUsed="0" w:uiPriority="69" w:semiHidden="0" w:name="Medium Grid 3 Accent 3"/>
+    <w:lsdException w:unhideWhenUsed="0" w:uiPriority="70" w:semiHidden="0" w:name="Dark List Accent 3"/>
+    <w:lsdException w:unhideWhenUsed="0" w:uiPriority="71" w:semiHidden="0" w:name="Colorful Shading Accent 3"/>
+    <w:lsdException w:unhideWhenUsed="0" w:uiPriority="72" w:semiHidden="0" w:name="Colorful List Accent 3"/>
+    <w:lsdException w:unhideWhenUsed="0" w:uiPriority="73" w:semiHidden="0" w:name="Colorful Grid Accent 3"/>
+    <w:lsdException w:unhideWhenUsed="0" w:uiPriority="60" w:semiHidden="0" w:name="Light Shading Accent 4"/>
+    <w:lsdException w:unhideWhenUsed="0" w:uiPriority="61" w:semiHidden="0" w:name="Light List Accent 4"/>
+    <w:lsdException w:unhideWhenUsed="0" w:uiPriority="62" w:semiHidden="0" w:name="Light Grid Accent 4"/>
+    <w:lsdException w:unhideWhenUsed="0" w:uiPriority="63" w:semiHidden="0" w:name="Medium Shading 1 Accent 4"/>
+    <w:lsdException w:unhideWhenUsed="0" w:uiPriority="64" w:semiHidden="0" w:name="Medium Shading 2 Accent 4"/>
+    <w:lsdException w:unhideWhenUsed="0" w:uiPriority="65" w:semiHidden="0" w:name="Medium List 1 Accent 4"/>
+    <w:lsdException w:unhideWhenUsed="0" w:uiPriority="66" w:semiHidden="0" w:name="Medium List 2 Accent 4"/>
+    <w:lsdException w:unhideWhenUsed="0" w:uiPriority="67" w:semiHidden="0" w:name="Medium Grid 1 Accent 4"/>
+    <w:lsdException w:unhideWhenUsed="0" w:uiPriority="68" w:semiHidden="0" w:name="Medium Grid 2 Accent 4"/>
+    <w:lsdException w:unhideWhenUsed="0" w:uiPriority="69" w:semiHidden="0" w:name="Medium Grid 3 Accent 4"/>
+    <w:lsdException w:unhideWhenUsed="0" w:uiPriority="70" w:semiHidden="0" w:name="Dark List Accent 4"/>
+    <w:lsdException w:unhideWhenUsed="0" w:uiPriority="71" w:semiHidden="0" w:name="Colorful Shading Accent 4"/>
+    <w:lsdException w:unhideWhenUsed="0" w:uiPriority="72" w:semiHidden="0" w:name="Colorful List Accent 4"/>
+    <w:lsdException w:unhideWhenUsed="0" w:uiPriority="73" w:semiHidden="0" w:name="Colorful Grid Accent 4"/>
+    <w:lsdException w:unhideWhenUsed="0" w:uiPriority="60" w:semiHidden="0" w:name="Light Shading Accent 5"/>
+    <w:lsdException w:unhideWhenUsed="0" w:uiPriority="61" w:semiHidden="0" w:name="Light List Accent 5"/>
+    <w:lsdException w:unhideWhenUsed="0" w:uiPriority="62" w:semiHidden="0" w:name="Light Grid Accent 5"/>
+    <w:lsdException w:unhideWhenUsed="0" w:uiPriority="63" w:semiHidden="0" w:name="Medium Shading 1 Accent 5"/>
+    <w:lsdException w:unhideWhenUsed="0" w:uiPriority="64" w:semiHidden="0" w:name="Medium Shading 2 Accent 5"/>
+    <w:lsdException w:unhideWhenUsed="0" w:uiPriority="65" w:semiHidden="0" w:name="Medium List 1 Accent 5"/>
+    <w:lsdException w:unhideWhenUsed="0" w:uiPriority="66" w:semiHidden="0" w:name="Medium List 2 Accent 5"/>
+    <w:lsdException w:unhideWhenUsed="0" w:uiPriority="67" w:semiHidden="0" w:name="Medium Grid 1 Accent 5"/>
+    <w:lsdException w:unhideWhenUsed="0" w:uiPriority="68" w:semiHidden="0" w:name="Medium Grid 2 Accent 5"/>
+    <w:lsdException w:unhideWhenUsed="0" w:uiPriority="69" w:semiHidden="0" w:name="Medium Grid 3 Accent 5"/>
+    <w:lsdException w:unhideWhenUsed="0" w:uiPriority="70" w:semiHidden="0" w:name="Dark List Accent 5"/>
+    <w:lsdException w:unhideWhenUsed="0" w:uiPriority="71" w:semiHidden="0" w:name="Colorful Shading Accent 5"/>
+    <w:lsdException w:unhideWhenUsed="0" w:uiPriority="72" w:semiHidden="0" w:name="Colorful List Accent 5"/>
+    <w:lsdException w:unhideWhenUsed="0" w:uiPriority="73" w:semiHidden="0" w:name="Colorful Grid Accent 5"/>
+    <w:lsdException w:unhideWhenUsed="0" w:uiPriority="60" w:semiHidden="0" w:name="Light Shading Accent 6"/>
+    <w:lsdException w:unhideWhenUsed="0" w:uiPriority="61" w:semiHidden="0" w:name="Light List Accent 6"/>
+    <w:lsdException w:unhideWhenUsed="0" w:uiPriority="62" w:semiHidden="0" w:name="Light Grid Accent 6"/>
+    <w:lsdException w:unhideWhenUsed="0" w:uiPriority="63" w:semiHidden="0" w:name="Medium Shading 1 Accent 6"/>
+    <w:lsdException w:unhideWhenUsed="0" w:uiPriority="64" w:semiHidden="0" w:name="Medium Shading 2 Accent 6"/>
+    <w:lsdException w:unhideWhenUsed="0" w:uiPriority="65" w:semiHidden="0" w:name="Medium List 1 Accent 6"/>
+    <w:lsdException w:unhideWhenUsed="0" w:uiPriority="66" w:semiHidden="0" w:name="Medium List 2 Accent 6"/>
+    <w:lsdException w:unhideWhenUsed="0" w:uiPriority="67" w:semiHidden="0" w:name="Medium Grid 1 Accent 6"/>
+    <w:lsdException w:unhideWhenUsed="0" w:uiPriority="68" w:semiHidden="0" w:name="Medium Grid 2 Accent 6"/>
+    <w:lsdException w:unhideWhenUsed="0" w:uiPriority="69" w:semiHidden="0" w:name="Medium Grid 3 Accent 6"/>
+    <w:lsdException w:unhideWhenUsed="0" w:uiPriority="70" w:semiHidden="0" w:name="Dark List Accent 6"/>
+    <w:lsdException w:unhideWhenUsed="0" w:uiPriority="71" w:semiHidden="0" w:name="Colorful Shading Accent 6"/>
+    <w:lsdException w:unhideWhenUsed="0" w:uiPriority="72" w:semiHidden="0" w:name="Colorful List Accent 6"/>
+    <w:lsdException w:unhideWhenUsed="0" w:uiPriority="73" w:semiHidden="0" w:name="Colorful Grid Accent 6"/>
   </w:latentStyles>
-  <w:style w:type="paragraph" w:default="1" w:styleId="Normal">
+  <w:style w:type="paragraph" w:default="1" w:styleId="1">
     <w:name w:val="Normal"/>
-    <w:aliases w:val="Tiêu đề dịch báo"/>
     <w:qFormat/>
-    <w:rsid w:val="000620DA"/>
+    <w:uiPriority w:val="0"/>
     <w:pPr>
       <w:spacing w:line="276" w:lineRule="auto"/>
       <w:ind w:left="0" w:right="0" w:firstLine="0"/>
       <w:jc w:val="left"/>
     </w:pPr>
+    <w:rPr>
+      <w:rFonts w:ascii="Times New Roman" w:hAnsi="Times New Roman" w:eastAsia="Arial" w:cs="Arial"/>
+      <w:b/>
+      <w:color w:val="FF0000"/>
+      <w:kern w:val="0"/>
+      <w:sz w:val="22"/>
+      <w:szCs w:val="22"/>
+      <w:lang w:val="vi" w:eastAsia="en-US" w:bidi="ar-SA"/>
+      <w14:ligatures w14:val="none"/>
+    </w:rPr>
+  </w:style>
+  <w:style w:type="paragraph" w:styleId="2">
+    <w:name w:val="heading 1"/>
+    <w:basedOn w:val="1"/>
+    <w:next w:val="1"/>
+    <w:link w:val="21"/>
+    <w:qFormat/>
+    <w:uiPriority w:val="9"/>
+    <w:pPr>
+      <w:keepNext/>
+      <w:keepLines/>
+      <w:spacing w:before="360" w:after="80"/>
+      <w:outlineLvl w:val="0"/>
+    </w:pPr>
+    <w:rPr>
+      <w:rFonts w:asciiTheme="majorHAnsi" w:hAnsiTheme="majorHAnsi" w:eastAsiaTheme="majorEastAsia" w:cstheme="majorBidi"/>
+      <w:color w:val="104862" w:themeColor="accent1" w:themeShade="BF"/>
+      <w:sz w:val="40"/>
+      <w:szCs w:val="40"/>
+    </w:rPr>
+  </w:style>
+  <w:style w:type="paragraph" w:styleId="3">
+    <w:name w:val="heading 2"/>
+    <w:basedOn w:val="1"/>
+    <w:next w:val="1"/>
+    <w:link w:val="22"/>
+    <w:unhideWhenUsed/>
+    <w:qFormat/>
+    <w:uiPriority w:val="9"/>
+    <w:pPr>
+      <w:keepNext/>
+      <w:keepLines/>
+      <w:spacing w:before="160" w:after="80"/>
+      <w:outlineLvl w:val="1"/>
+    </w:pPr>
+    <w:rPr>
+      <w:rFonts w:asciiTheme="majorHAnsi" w:hAnsiTheme="majorHAnsi" w:eastAsiaTheme="majorEastAsia" w:cstheme="majorBidi"/>
+      <w:color w:val="104862" w:themeColor="accent1" w:themeShade="BF"/>
+      <w:sz w:val="32"/>
+      <w:szCs w:val="32"/>
+    </w:rPr>
+  </w:style>
+  <w:style w:type="paragraph" w:styleId="4">
+    <w:name w:val="heading 3"/>
+    <w:basedOn w:val="1"/>
+    <w:next w:val="1"/>
+    <w:link w:val="23"/>
+    <w:semiHidden/>
+    <w:unhideWhenUsed/>
+    <w:qFormat/>
+    <w:uiPriority w:val="9"/>
+    <w:pPr>
+      <w:keepNext/>
+      <w:keepLines/>
+      <w:spacing w:before="160" w:after="80"/>
+      <w:outlineLvl w:val="2"/>
+    </w:pPr>
+    <w:rPr>
+      <w:rFonts w:asciiTheme="minorHAnsi" w:hAnsiTheme="minorHAnsi" w:eastAsiaTheme="majorEastAsia" w:cstheme="majorBidi"/>
+      <w:color w:val="104862" w:themeColor="accent1" w:themeShade="BF"/>
+      <w:sz w:val="28"/>
+      <w:szCs w:val="28"/>
+    </w:rPr>
+  </w:style>
+  <w:style w:type="paragraph" w:styleId="5">
+    <w:name w:val="heading 4"/>
+    <w:basedOn w:val="1"/>
+    <w:next w:val="1"/>
+    <w:link w:val="24"/>
+    <w:semiHidden/>
+    <w:unhideWhenUsed/>
+    <w:qFormat/>
+    <w:uiPriority w:val="9"/>
+    <w:pPr>
+      <w:keepNext/>
+      <w:keepLines/>
+      <w:spacing w:before="80" w:after="40"/>
+      <w:outlineLvl w:val="3"/>
+    </w:pPr>
+    <w:rPr>
+      <w:rFonts w:asciiTheme="minorHAnsi" w:hAnsiTheme="minorHAnsi" w:eastAsiaTheme="majorEastAsia" w:cstheme="majorBidi"/>
+      <w:i/>
+      <w:iCs/>
+      <w:color w:val="104862" w:themeColor="accent1" w:themeShade="BF"/>
+    </w:rPr>
+  </w:style>
+  <w:style w:type="paragraph" w:styleId="6">
+    <w:name w:val="heading 5"/>
+    <w:basedOn w:val="1"/>
+    <w:next w:val="1"/>
+    <w:link w:val="25"/>
+    <w:semiHidden/>
+    <w:unhideWhenUsed/>
+    <w:qFormat/>
+    <w:uiPriority w:val="9"/>
+    <w:pPr>
+      <w:keepNext/>
+      <w:keepLines/>
+      <w:spacing w:before="80" w:after="40"/>
+      <w:outlineLvl w:val="4"/>
+    </w:pPr>
+    <w:rPr>
+      <w:rFonts w:asciiTheme="minorHAnsi" w:hAnsiTheme="minorHAnsi" w:eastAsiaTheme="majorEastAsia" w:cstheme="majorBidi"/>
+      <w:color w:val="104862" w:themeColor="accent1" w:themeShade="BF"/>
+    </w:rPr>
+  </w:style>
+  <w:style w:type="paragraph" w:styleId="7">
+    <w:name w:val="heading 6"/>
+    <w:basedOn w:val="1"/>
+    <w:next w:val="1"/>
+    <w:link w:val="26"/>
+    <w:semiHidden/>
+    <w:unhideWhenUsed/>
+    <w:qFormat/>
+    <w:uiPriority w:val="9"/>
+    <w:pPr>
+      <w:keepNext/>
+      <w:keepLines/>
+      <w:spacing w:before="40"/>
+      <w:outlineLvl w:val="5"/>
+    </w:pPr>
+    <w:rPr>
+      <w:rFonts w:asciiTheme="minorHAnsi" w:hAnsiTheme="minorHAnsi" w:eastAsiaTheme="majorEastAsia" w:cstheme="majorBidi"/>
+      <w:i/>
+      <w:iCs/>
+      <w:color w:val="595959" w:themeColor="text1" w:themeTint="A6"/>
+      <w14:textFill>
+        <w14:solidFill>
+          <w14:schemeClr w14:val="tx1">
+            <w14:lumMod w14:val="65000"/>
+            <w14:lumOff w14:val="35000"/>
+          </w14:schemeClr>
+        </w14:solidFill>
+      </w14:textFill>
+    </w:rPr>
+  </w:style>
+  <w:style w:type="paragraph" w:styleId="8">
+    <w:name w:val="heading 7"/>
+    <w:basedOn w:val="1"/>
+    <w:next w:val="1"/>
+    <w:link w:val="27"/>
+    <w:semiHidden/>
+    <w:unhideWhenUsed/>
+    <w:qFormat/>
+    <w:uiPriority w:val="9"/>
+    <w:pPr>
+      <w:keepNext/>
+      <w:keepLines/>
+      <w:spacing w:before="40"/>
+      <w:outlineLvl w:val="6"/>
+    </w:pPr>
+    <w:rPr>
+      <w:rFonts w:asciiTheme="minorHAnsi" w:hAnsiTheme="minorHAnsi" w:eastAsiaTheme="majorEastAsia" w:cstheme="majorBidi"/>
+      <w:color w:val="595959" w:themeColor="text1" w:themeTint="A6"/>
+      <w14:textFill>
+        <w14:solidFill>
+          <w14:schemeClr w14:val="tx1">
+            <w14:lumMod w14:val="65000"/>
+            <w14:lumOff w14:val="35000"/>
+          </w14:schemeClr>
+        </w14:solidFill>
+      </w14:textFill>
+    </w:rPr>
+  </w:style>
+  <w:style w:type="paragraph" w:styleId="9">
+    <w:name w:val="heading 8"/>
+    <w:basedOn w:val="1"/>
+    <w:next w:val="1"/>
+    <w:link w:val="28"/>
+    <w:semiHidden/>
+    <w:unhideWhenUsed/>
+    <w:qFormat/>
+    <w:uiPriority w:val="9"/>
+    <w:pPr>
+      <w:keepNext/>
+      <w:keepLines/>
+      <w:outlineLvl w:val="7"/>
+    </w:pPr>
+    <w:rPr>
+      <w:rFonts w:asciiTheme="minorHAnsi" w:hAnsiTheme="minorHAnsi" w:eastAsiaTheme="majorEastAsia" w:cstheme="majorBidi"/>
+      <w:i/>
+      <w:iCs/>
+      <w:color w:val="262626" w:themeColor="text1" w:themeTint="D9"/>
+      <w14:textFill>
+        <w14:solidFill>
+          <w14:schemeClr w14:val="tx1">
+            <w14:lumMod w14:val="85000"/>
+            <w14:lumOff w14:val="15000"/>
+          </w14:schemeClr>
+        </w14:solidFill>
+      </w14:textFill>
+    </w:rPr>
+  </w:style>
+  <w:style w:type="paragraph" w:styleId="10">
+    <w:name w:val="heading 9"/>
+    <w:basedOn w:val="1"/>
+    <w:next w:val="1"/>
+    <w:link w:val="29"/>
+    <w:semiHidden/>
+    <w:unhideWhenUsed/>
+    <w:qFormat/>
+    <w:uiPriority w:val="9"/>
+    <w:pPr>
+      <w:keepNext/>
+      <w:keepLines/>
+      <w:outlineLvl w:val="8"/>
+    </w:pPr>
+    <w:rPr>
+      <w:rFonts w:asciiTheme="minorHAnsi" w:hAnsiTheme="minorHAnsi" w:eastAsiaTheme="majorEastAsia" w:cstheme="majorBidi"/>
+      <w:color w:val="262626" w:themeColor="text1" w:themeTint="D9"/>
+      <w14:textFill>
+        <w14:solidFill>
+          <w14:schemeClr w14:val="tx1">
+            <w14:lumMod w14:val="85000"/>
+            <w14:lumOff w14:val="15000"/>
+          </w14:schemeClr>
+        </w14:solidFill>
+      </w14:textFill>
+    </w:rPr>
+  </w:style>
+  <w:style w:type="character" w:default="1" w:styleId="11">
+    <w:name w:val="Default Paragraph Font"/>
+    <w:semiHidden/>
+    <w:unhideWhenUsed/>
+    <w:qFormat/>
+    <w:uiPriority w:val="1"/>
+  </w:style>
+  <w:style w:type="table" w:default="1" w:styleId="12">
+    <w:name w:val="Normal Table"/>
+    <w:semiHidden/>
+    <w:unhideWhenUsed/>
+    <w:qFormat/>
+    <w:uiPriority w:val="99"/>
+    <w:tblPr>
+      <w:tblCellMar>
+        <w:top w:w="0" w:type="dxa"/>
+        <w:left w:w="108" w:type="dxa"/>
+        <w:bottom w:w="0" w:type="dxa"/>
+        <w:right w:w="108" w:type="dxa"/>
+      </w:tblCellMar>
+    </w:tblPr>
+  </w:style>
+  <w:style w:type="character" w:styleId="13">
+    <w:name w:val="annotation reference"/>
+    <w:basedOn w:val="11"/>
+    <w:semiHidden/>
+    <w:unhideWhenUsed/>
+    <w:qFormat/>
+    <w:uiPriority w:val="99"/>
+    <w:rPr>
+      <w:sz w:val="16"/>
+      <w:szCs w:val="16"/>
+    </w:rPr>
+  </w:style>
+  <w:style w:type="paragraph" w:styleId="14">
+    <w:name w:val="annotation text"/>
+    <w:basedOn w:val="1"/>
+    <w:link w:val="44"/>
+    <w:semiHidden/>
+    <w:unhideWhenUsed/>
+    <w:qFormat/>
+    <w:uiPriority w:val="99"/>
+    <w:pPr>
+      <w:spacing w:line="240" w:lineRule="auto"/>
+    </w:pPr>
+    <w:rPr>
+      <w:sz w:val="20"/>
+      <w:szCs w:val="20"/>
+    </w:rPr>
+  </w:style>
+  <w:style w:type="paragraph" w:styleId="15">
+    <w:name w:val="footer"/>
+    <w:basedOn w:val="1"/>
+    <w:link w:val="40"/>
+    <w:unhideWhenUsed/>
+    <w:qFormat/>
+    <w:uiPriority w:val="99"/>
+    <w:pPr>
+      <w:tabs>
+        <w:tab w:val="center" w:pos="4680"/>
+        <w:tab w:val="right" w:pos="9360"/>
+      </w:tabs>
+      <w:spacing w:line="240" w:lineRule="auto"/>
+    </w:pPr>
+  </w:style>
+  <w:style w:type="paragraph" w:styleId="16">
+    <w:name w:val="header"/>
+    <w:basedOn w:val="1"/>
+    <w:link w:val="39"/>
+    <w:unhideWhenUsed/>
+    <w:qFormat/>
+    <w:uiPriority w:val="99"/>
+    <w:pPr>
+      <w:tabs>
+        <w:tab w:val="center" w:pos="4680"/>
+        <w:tab w:val="right" w:pos="9360"/>
+      </w:tabs>
+      <w:spacing w:line="240" w:lineRule="auto"/>
+    </w:pPr>
+  </w:style>
+  <w:style w:type="paragraph" w:styleId="17">
+    <w:name w:val="Normal (Web)"/>
+    <w:basedOn w:val="1"/>
+    <w:unhideWhenUsed/>
+    <w:qFormat/>
+    <w:uiPriority w:val="99"/>
+    <w:pPr>
+      <w:spacing w:before="100" w:beforeAutospacing="1" w:after="100" w:afterAutospacing="1" w:line="240" w:lineRule="auto"/>
+    </w:pPr>
+    <w:rPr>
+      <w:rFonts w:eastAsia="Times New Roman" w:cs="Times New Roman"/>
+      <w:b w:val="0"/>
+      <w:color w:val="auto"/>
+      <w:sz w:val="24"/>
+      <w:szCs w:val="24"/>
+    </w:rPr>
+  </w:style>
+  <w:style w:type="paragraph" w:styleId="18">
+    <w:name w:val="Subtitle"/>
+    <w:basedOn w:val="1"/>
+    <w:next w:val="1"/>
+    <w:link w:val="31"/>
+    <w:qFormat/>
+    <w:uiPriority w:val="11"/>
+    <w:pPr>
+      <w:spacing w:after="160"/>
+    </w:pPr>
+    <w:rPr>
+      <w:rFonts w:asciiTheme="minorHAnsi" w:hAnsiTheme="minorHAnsi" w:eastAsiaTheme="majorEastAsia" w:cstheme="majorBidi"/>
+      <w:color w:val="595959" w:themeColor="text1" w:themeTint="A6"/>
+      <w:spacing w:val="15"/>
+      <w:sz w:val="28"/>
+      <w:szCs w:val="28"/>
+      <w14:textFill>
+        <w14:solidFill>
+          <w14:schemeClr w14:val="tx1">
+            <w14:lumMod w14:val="65000"/>
+            <w14:lumOff w14:val="35000"/>
+          </w14:schemeClr>
+        </w14:solidFill>
+      </w14:textFill>
+    </w:rPr>
+  </w:style>
+  <w:style w:type="table" w:styleId="19">
+    <w:name w:val="Table Grid"/>
+    <w:basedOn w:val="12"/>
+    <w:qFormat/>
+    <w:uiPriority w:val="39"/>
+    <w:pPr>
+      <w:spacing w:line="240" w:lineRule="auto"/>
+    </w:pPr>
+    <w:tblPr>
+      <w:tblBorders>
+        <w:top w:val="single" w:color="auto" w:sz="4" w:space="0"/>
+        <w:left w:val="single" w:color="auto" w:sz="4" w:space="0"/>
+        <w:bottom w:val="single" w:color="auto" w:sz="4" w:space="0"/>
+        <w:right w:val="single" w:color="auto" w:sz="4" w:space="0"/>
+        <w:insideH w:val="single" w:color="auto" w:sz="4" w:space="0"/>
+        <w:insideV w:val="single" w:color="auto" w:sz="4" w:space="0"/>
+      </w:tblBorders>
+    </w:tblPr>
+  </w:style>
+  <w:style w:type="paragraph" w:styleId="20">
+    <w:name w:val="Title"/>
+    <w:basedOn w:val="1"/>
+    <w:next w:val="1"/>
+    <w:link w:val="30"/>
+    <w:qFormat/>
+    <w:uiPriority w:val="10"/>
+    <w:pPr>
+      <w:spacing w:after="80" w:line="240" w:lineRule="auto"/>
+      <w:contextualSpacing/>
+    </w:pPr>
+    <w:rPr>
+      <w:rFonts w:asciiTheme="majorHAnsi" w:hAnsiTheme="majorHAnsi" w:eastAsiaTheme="majorEastAsia" w:cstheme="majorBidi"/>
+      <w:color w:val="auto"/>
+      <w:spacing w:val="-10"/>
+      <w:kern w:val="28"/>
+      <w:sz w:val="56"/>
+      <w:szCs w:val="56"/>
+    </w:rPr>
+  </w:style>
+  <w:style w:type="character" w:customStyle="1" w:styleId="21">
+    <w:name w:val="Heading 1 Char"/>
+    <w:basedOn w:val="11"/>
+    <w:link w:val="2"/>
+    <w:qFormat/>
+    <w:uiPriority w:val="9"/>
+    <w:rPr>
+      <w:rFonts w:asciiTheme="majorHAnsi" w:hAnsiTheme="majorHAnsi" w:eastAsiaTheme="majorEastAsia" w:cstheme="majorBidi"/>
+      <w:b/>
+      <w:color w:val="104862" w:themeColor="accent1" w:themeShade="BF"/>
+      <w:kern w:val="0"/>
+      <w:sz w:val="40"/>
+      <w:szCs w:val="40"/>
+      <w:lang w:val="vi"/>
+      <w14:ligatures w14:val="none"/>
+    </w:rPr>
+  </w:style>
+  <w:style w:type="character" w:customStyle="1" w:styleId="22">
+    <w:name w:val="Heading 2 Char"/>
+    <w:basedOn w:val="11"/>
+    <w:link w:val="3"/>
+    <w:semiHidden/>
+    <w:qFormat/>
+    <w:uiPriority w:val="9"/>
+    <w:rPr>
+      <w:rFonts w:asciiTheme="majorHAnsi" w:hAnsiTheme="majorHAnsi" w:eastAsiaTheme="majorEastAsia" w:cstheme="majorBidi"/>
+      <w:b/>
+      <w:color w:val="104862" w:themeColor="accent1" w:themeShade="BF"/>
+      <w:kern w:val="0"/>
+      <w:sz w:val="32"/>
+      <w:szCs w:val="32"/>
+      <w:lang w:val="vi"/>
+      <w14:ligatures w14:val="none"/>
+    </w:rPr>
+  </w:style>
+  <w:style w:type="character" w:customStyle="1" w:styleId="23">
+    <w:name w:val="Heading 3 Char"/>
+    <w:basedOn w:val="11"/>
+    <w:link w:val="4"/>
+    <w:semiHidden/>
+    <w:qFormat/>
+    <w:uiPriority w:val="9"/>
+    <w:rPr>
+      <w:rFonts w:eastAsiaTheme="majorEastAsia" w:cstheme="majorBidi"/>
+      <w:b/>
+      <w:color w:val="104862" w:themeColor="accent1" w:themeShade="BF"/>
+      <w:kern w:val="0"/>
+      <w:sz w:val="28"/>
+      <w:szCs w:val="28"/>
+      <w:lang w:val="vi"/>
+      <w14:ligatures w14:val="none"/>
+    </w:rPr>
+  </w:style>
+  <w:style w:type="character" w:customStyle="1" w:styleId="24">
+    <w:name w:val="Heading 4 Char"/>
+    <w:basedOn w:val="11"/>
+    <w:link w:val="5"/>
+    <w:semiHidden/>
+    <w:qFormat/>
+    <w:uiPriority w:val="9"/>
+    <w:rPr>
+      <w:rFonts w:eastAsiaTheme="majorEastAsia" w:cstheme="majorBidi"/>
+      <w:b/>
+      <w:i/>
+      <w:iCs/>
+      <w:color w:val="104862" w:themeColor="accent1" w:themeShade="BF"/>
+      <w:kern w:val="0"/>
+      <w:sz w:val="22"/>
+      <w:szCs w:val="22"/>
+      <w:lang w:val="vi"/>
+      <w14:ligatures w14:val="none"/>
+    </w:rPr>
+  </w:style>
+  <w:style w:type="character" w:customStyle="1" w:styleId="25">
+    <w:name w:val="Heading 5 Char"/>
+    <w:basedOn w:val="11"/>
+    <w:link w:val="6"/>
+    <w:semiHidden/>
+    <w:qFormat/>
+    <w:uiPriority w:val="9"/>
+    <w:rPr>
+      <w:rFonts w:eastAsiaTheme="majorEastAsia" w:cstheme="majorBidi"/>
+      <w:b/>
+      <w:color w:val="104862" w:themeColor="accent1" w:themeShade="BF"/>
+      <w:kern w:val="0"/>
+      <w:sz w:val="22"/>
+      <w:szCs w:val="22"/>
+      <w:lang w:val="vi"/>
+      <w14:ligatures w14:val="none"/>
+    </w:rPr>
+  </w:style>
+  <w:style w:type="character" w:customStyle="1" w:styleId="26">
+    <w:name w:val="Heading 6 Char"/>
+    <w:basedOn w:val="11"/>
+    <w:link w:val="7"/>
+    <w:semiHidden/>
+    <w:qFormat/>
+    <w:uiPriority w:val="9"/>
+    <w:rPr>
+      <w:rFonts w:eastAsiaTheme="majorEastAsia" w:cstheme="majorBidi"/>
+      <w:b/>
+      <w:i/>
+      <w:iCs/>
+      <w:color w:val="595959" w:themeColor="text1" w:themeTint="A6"/>
+      <w:kern w:val="0"/>
+      <w:sz w:val="22"/>
+      <w:szCs w:val="22"/>
+      <w:lang w:val="vi"/>
+      <w14:textFill>
+        <w14:solidFill>
+          <w14:schemeClr w14:val="tx1">
+            <w14:lumMod w14:val="65000"/>
+            <w14:lumOff w14:val="35000"/>
+          </w14:schemeClr>
+        </w14:solidFill>
+      </w14:textFill>
+      <w14:ligatures w14:val="none"/>
+    </w:rPr>
+  </w:style>
+  <w:style w:type="character" w:customStyle="1" w:styleId="27">
+    <w:name w:val="Heading 7 Char"/>
+    <w:basedOn w:val="11"/>
+    <w:link w:val="8"/>
+    <w:semiHidden/>
+    <w:qFormat/>
+    <w:uiPriority w:val="9"/>
+    <w:rPr>
+      <w:rFonts w:eastAsiaTheme="majorEastAsia" w:cstheme="majorBidi"/>
+      <w:b/>
+      <w:color w:val="595959" w:themeColor="text1" w:themeTint="A6"/>
+      <w:kern w:val="0"/>
+      <w:sz w:val="22"/>
+      <w:szCs w:val="22"/>
+      <w:lang w:val="vi"/>
+      <w14:textFill>
+        <w14:solidFill>
+          <w14:schemeClr w14:val="tx1">
+            <w14:lumMod w14:val="65000"/>
+            <w14:lumOff w14:val="35000"/>
+          </w14:schemeClr>
+        </w14:solidFill>
+      </w14:textFill>
+      <w14:ligatures w14:val="none"/>
+    </w:rPr>
+  </w:style>
+  <w:style w:type="character" w:customStyle="1" w:styleId="28">
+    <w:name w:val="Heading 8 Char"/>
+    <w:basedOn w:val="11"/>
+    <w:link w:val="9"/>
+    <w:semiHidden/>
+    <w:qFormat/>
+    <w:uiPriority w:val="9"/>
+    <w:rPr>
+      <w:rFonts w:eastAsiaTheme="majorEastAsia" w:cstheme="majorBidi"/>
+      <w:b/>
+      <w:i/>
+      <w:iCs/>
+      <w:color w:val="262626" w:themeColor="text1" w:themeTint="D9"/>
+      <w:kern w:val="0"/>
+      <w:sz w:val="22"/>
+      <w:szCs w:val="22"/>
+      <w:lang w:val="vi"/>
+      <w14:textFill>
+        <w14:solidFill>
+          <w14:schemeClr w14:val="tx1">
+            <w14:lumMod w14:val="85000"/>
+            <w14:lumOff w14:val="15000"/>
+          </w14:schemeClr>
+        </w14:solidFill>
+      </w14:textFill>
+      <w14:ligatures w14:val="none"/>
+    </w:rPr>
+  </w:style>
+  <w:style w:type="character" w:customStyle="1" w:styleId="29">
+    <w:name w:val="Heading 9 Char"/>
+    <w:basedOn w:val="11"/>
+    <w:link w:val="10"/>
+    <w:semiHidden/>
+    <w:qFormat/>
+    <w:uiPriority w:val="9"/>
+    <w:rPr>
+      <w:rFonts w:eastAsiaTheme="majorEastAsia" w:cstheme="majorBidi"/>
+      <w:b/>
+      <w:color w:val="262626" w:themeColor="text1" w:themeTint="D9"/>
+      <w:kern w:val="0"/>
+      <w:sz w:val="22"/>
+      <w:szCs w:val="22"/>
+      <w:lang w:val="vi"/>
+      <w14:textFill>
+        <w14:solidFill>
+          <w14:schemeClr w14:val="tx1">
+            <w14:lumMod w14:val="85000"/>
+            <w14:lumOff w14:val="15000"/>
+          </w14:schemeClr>
+        </w14:solidFill>
+      </w14:textFill>
+      <w14:ligatures w14:val="none"/>
+    </w:rPr>
+  </w:style>
+  <w:style w:type="character" w:customStyle="1" w:styleId="30">
+    <w:name w:val="Title Char"/>
+    <w:basedOn w:val="11"/>
+    <w:link w:val="20"/>
+    <w:qFormat/>
+    <w:uiPriority w:val="10"/>
+    <w:rPr>
+      <w:rFonts w:asciiTheme="majorHAnsi" w:hAnsiTheme="majorHAnsi" w:eastAsiaTheme="majorEastAsia" w:cstheme="majorBidi"/>
+      <w:b/>
+      <w:spacing w:val="-10"/>
+      <w:kern w:val="28"/>
+      <w:sz w:val="56"/>
+      <w:szCs w:val="56"/>
+      <w:lang w:val="vi"/>
+      <w14:ligatures w14:val="none"/>
+    </w:rPr>
+  </w:style>
+  <w:style w:type="character" w:customStyle="1" w:styleId="31">
+    <w:name w:val="Subtitle Char"/>
+    <w:basedOn w:val="11"/>
+    <w:link w:val="18"/>
+    <w:qFormat/>
+    <w:uiPriority w:val="11"/>
+    <w:rPr>
+      <w:rFonts w:eastAsiaTheme="majorEastAsia" w:cstheme="majorBidi"/>
+      <w:b/>
+      <w:color w:val="595959" w:themeColor="text1" w:themeTint="A6"/>
+      <w:spacing w:val="15"/>
+      <w:kern w:val="0"/>
+      <w:sz w:val="28"/>
+      <w:szCs w:val="28"/>
+      <w:lang w:val="vi"/>
+      <w14:textFill>
+        <w14:solidFill>
+          <w14:schemeClr w14:val="tx1">
+            <w14:lumMod w14:val="65000"/>
+            <w14:lumOff w14:val="35000"/>
+          </w14:schemeClr>
+        </w14:solidFill>
+      </w14:textFill>
+      <w14:ligatures w14:val="none"/>
+    </w:rPr>
+  </w:style>
+  <w:style w:type="paragraph" w:styleId="32">
+    <w:name w:val="Quote"/>
+    <w:basedOn w:val="1"/>
+    <w:next w:val="1"/>
+    <w:link w:val="33"/>
+    <w:qFormat/>
+    <w:uiPriority w:val="29"/>
+    <w:pPr>
+      <w:spacing w:before="160" w:after="160"/>
+      <w:jc w:val="center"/>
+    </w:pPr>
+    <w:rPr>
+      <w:i/>
+      <w:iCs/>
+      <w:color w:val="404040" w:themeColor="text1" w:themeTint="BF"/>
+      <w14:textFill>
+        <w14:solidFill>
+          <w14:schemeClr w14:val="tx1">
+            <w14:lumMod w14:val="75000"/>
+            <w14:lumOff w14:val="25000"/>
+          </w14:schemeClr>
+        </w14:solidFill>
+      </w14:textFill>
+    </w:rPr>
+  </w:style>
+  <w:style w:type="character" w:customStyle="1" w:styleId="33">
+    <w:name w:val="Quote Char"/>
+    <w:basedOn w:val="11"/>
+    <w:link w:val="32"/>
+    <w:qFormat/>
+    <w:uiPriority w:val="29"/>
+    <w:rPr>
+      <w:rFonts w:ascii="Times New Roman" w:hAnsi="Times New Roman" w:cs="Arial"/>
+      <w:b/>
+      <w:i/>
+      <w:iCs/>
+      <w:color w:val="404040" w:themeColor="text1" w:themeTint="BF"/>
+      <w:kern w:val="0"/>
+      <w:sz w:val="22"/>
+      <w:szCs w:val="22"/>
+      <w:lang w:val="vi"/>
+      <w14:textFill>
+        <w14:solidFill>
+          <w14:schemeClr w14:val="tx1">
+            <w14:lumMod w14:val="75000"/>
+            <w14:lumOff w14:val="25000"/>
+          </w14:schemeClr>
+        </w14:solidFill>
+      </w14:textFill>
+      <w14:ligatures w14:val="none"/>
+    </w:rPr>
+  </w:style>
+  <w:style w:type="paragraph" w:styleId="34">
+    <w:name w:val="List Paragraph"/>
+    <w:basedOn w:val="1"/>
+    <w:qFormat/>
+    <w:uiPriority w:val="34"/>
+    <w:pPr>
+      <w:ind w:left="720"/>
+      <w:contextualSpacing/>
+    </w:pPr>
+  </w:style>
+  <w:style w:type="character" w:customStyle="1" w:styleId="35">
+    <w:name w:val="Intense Emphasis"/>
+    <w:basedOn w:val="11"/>
+    <w:qFormat/>
+    <w:uiPriority w:val="21"/>
+    <w:rPr>
+      <w:i/>
+      <w:iCs/>
+      <w:color w:val="104862" w:themeColor="accent1" w:themeShade="BF"/>
+    </w:rPr>
+  </w:style>
+  <w:style w:type="paragraph" w:styleId="36">
+    <w:name w:val="Intense Quote"/>
+    <w:basedOn w:val="1"/>
+    <w:next w:val="1"/>
+    <w:link w:val="37"/>
+    <w:qFormat/>
+    <w:uiPriority w:val="30"/>
+    <w:pPr>
+      <w:pBdr>
+        <w:top w:val="single" w:color="0F4761" w:themeColor="accent1" w:themeShade="BF" w:sz="4" w:space="10"/>
+        <w:bottom w:val="single" w:color="0F4761" w:themeColor="accent1" w:themeShade="BF" w:sz="4" w:space="10"/>
+      </w:pBdr>
+      <w:spacing w:before="360" w:after="360"/>
+      <w:ind w:left="864" w:right="864"/>
+      <w:jc w:val="center"/>
+    </w:pPr>
+    <w:rPr>
+      <w:i/>
+      <w:iCs/>
+      <w:color w:val="104862" w:themeColor="accent1" w:themeShade="BF"/>
+    </w:rPr>
+  </w:style>
+  <w:style w:type="character" w:customStyle="1" w:styleId="37">
+    <w:name w:val="Intense Quote Char"/>
+    <w:basedOn w:val="11"/>
+    <w:link w:val="36"/>
+    <w:qFormat/>
+    <w:uiPriority w:val="30"/>
+    <w:rPr>
+      <w:rFonts w:ascii="Times New Roman" w:hAnsi="Times New Roman" w:cs="Arial"/>
+      <w:b/>
+      <w:i/>
+      <w:iCs/>
+      <w:color w:val="104862" w:themeColor="accent1" w:themeShade="BF"/>
+      <w:kern w:val="0"/>
+      <w:sz w:val="22"/>
+      <w:szCs w:val="22"/>
+      <w:lang w:val="vi"/>
+      <w14:ligatures w14:val="none"/>
+    </w:rPr>
+  </w:style>
+  <w:style w:type="character" w:customStyle="1" w:styleId="38">
+    <w:name w:val="Intense Reference"/>
+    <w:basedOn w:val="11"/>
+    <w:qFormat/>
+    <w:uiPriority w:val="32"/>
+    <w:rPr>
+      <w:b/>
+      <w:bCs/>
+      <w:smallCaps/>
+      <w:color w:val="104862" w:themeColor="accent1" w:themeShade="BF"/>
+      <w:spacing w:val="5"/>
+    </w:rPr>
+  </w:style>
+  <w:style w:type="character" w:customStyle="1" w:styleId="39">
+    <w:name w:val="Header Char"/>
+    <w:basedOn w:val="11"/>
+    <w:link w:val="16"/>
+    <w:qFormat/>
+    <w:uiPriority w:val="99"/>
     <w:rPr>
       <w:rFonts w:ascii="Times New Roman" w:hAnsi="Times New Roman" w:cs="Arial"/>
       <w:b/>
@@ -5159,611 +4904,12 @@
       <w14:ligatures w14:val="none"/>
     </w:rPr>
   </w:style>
-  <w:style w:type="paragraph" w:styleId="Heading1">
-    <w:name w:val="heading 1"/>
-    <w:basedOn w:val="Normal"/>
-    <w:next w:val="Normal"/>
-    <w:link w:val="Heading1Char"/>
-    <w:uiPriority w:val="9"/>
+  <w:style w:type="character" w:customStyle="1" w:styleId="40">
+    <w:name w:val="Footer Char"/>
+    <w:basedOn w:val="11"/>
+    <w:link w:val="15"/>
     <w:qFormat/>
-    <w:rsid w:val="005A112C"/>
-    <w:pPr>
-      <w:keepNext/>
-      <w:keepLines/>
-      <w:spacing w:before="360" w:after="80"/>
-      <w:outlineLvl w:val="0"/>
-    </w:pPr>
-    <w:rPr>
-      <w:rFonts w:asciiTheme="majorHAnsi" w:eastAsiaTheme="majorEastAsia" w:hAnsiTheme="majorHAnsi" w:cstheme="majorBidi"/>
-      <w:color w:val="0F4761" w:themeColor="accent1" w:themeShade="BF"/>
-      <w:sz w:val="40"/>
-      <w:szCs w:val="40"/>
-    </w:rPr>
-  </w:style>
-  <w:style w:type="paragraph" w:styleId="Heading2">
-    <w:name w:val="heading 2"/>
-    <w:basedOn w:val="Normal"/>
-    <w:next w:val="Normal"/>
-    <w:link w:val="Heading2Char"/>
-    <w:uiPriority w:val="9"/>
-    <w:unhideWhenUsed/>
-    <w:qFormat/>
-    <w:rsid w:val="005A112C"/>
-    <w:pPr>
-      <w:keepNext/>
-      <w:keepLines/>
-      <w:spacing w:before="160" w:after="80"/>
-      <w:outlineLvl w:val="1"/>
-    </w:pPr>
-    <w:rPr>
-      <w:rFonts w:asciiTheme="majorHAnsi" w:eastAsiaTheme="majorEastAsia" w:hAnsiTheme="majorHAnsi" w:cstheme="majorBidi"/>
-      <w:color w:val="0F4761" w:themeColor="accent1" w:themeShade="BF"/>
-      <w:sz w:val="32"/>
-      <w:szCs w:val="32"/>
-    </w:rPr>
-  </w:style>
-  <w:style w:type="paragraph" w:styleId="Heading3">
-    <w:name w:val="heading 3"/>
-    <w:basedOn w:val="Normal"/>
-    <w:next w:val="Normal"/>
-    <w:link w:val="Heading3Char"/>
-    <w:uiPriority w:val="9"/>
-    <w:semiHidden/>
-    <w:unhideWhenUsed/>
-    <w:qFormat/>
-    <w:rsid w:val="005A112C"/>
-    <w:pPr>
-      <w:keepNext/>
-      <w:keepLines/>
-      <w:spacing w:before="160" w:after="80"/>
-      <w:outlineLvl w:val="2"/>
-    </w:pPr>
-    <w:rPr>
-      <w:rFonts w:asciiTheme="minorHAnsi" w:eastAsiaTheme="majorEastAsia" w:hAnsiTheme="minorHAnsi" w:cstheme="majorBidi"/>
-      <w:color w:val="0F4761" w:themeColor="accent1" w:themeShade="BF"/>
-      <w:sz w:val="28"/>
-      <w:szCs w:val="28"/>
-    </w:rPr>
-  </w:style>
-  <w:style w:type="paragraph" w:styleId="Heading4">
-    <w:name w:val="heading 4"/>
-    <w:basedOn w:val="Normal"/>
-    <w:next w:val="Normal"/>
-    <w:link w:val="Heading4Char"/>
-    <w:uiPriority w:val="9"/>
-    <w:semiHidden/>
-    <w:unhideWhenUsed/>
-    <w:qFormat/>
-    <w:rsid w:val="005A112C"/>
-    <w:pPr>
-      <w:keepNext/>
-      <w:keepLines/>
-      <w:spacing w:before="80" w:after="40"/>
-      <w:outlineLvl w:val="3"/>
-    </w:pPr>
-    <w:rPr>
-      <w:rFonts w:asciiTheme="minorHAnsi" w:eastAsiaTheme="majorEastAsia" w:hAnsiTheme="minorHAnsi" w:cstheme="majorBidi"/>
-      <w:i/>
-      <w:iCs/>
-      <w:color w:val="0F4761" w:themeColor="accent1" w:themeShade="BF"/>
-    </w:rPr>
-  </w:style>
-  <w:style w:type="paragraph" w:styleId="Heading5">
-    <w:name w:val="heading 5"/>
-    <w:basedOn w:val="Normal"/>
-    <w:next w:val="Normal"/>
-    <w:link w:val="Heading5Char"/>
-    <w:uiPriority w:val="9"/>
-    <w:semiHidden/>
-    <w:unhideWhenUsed/>
-    <w:qFormat/>
-    <w:rsid w:val="005A112C"/>
-    <w:pPr>
-      <w:keepNext/>
-      <w:keepLines/>
-      <w:spacing w:before="80" w:after="40"/>
-      <w:outlineLvl w:val="4"/>
-    </w:pPr>
-    <w:rPr>
-      <w:rFonts w:asciiTheme="minorHAnsi" w:eastAsiaTheme="majorEastAsia" w:hAnsiTheme="minorHAnsi" w:cstheme="majorBidi"/>
-      <w:color w:val="0F4761" w:themeColor="accent1" w:themeShade="BF"/>
-    </w:rPr>
-  </w:style>
-  <w:style w:type="paragraph" w:styleId="Heading6">
-    <w:name w:val="heading 6"/>
-    <w:basedOn w:val="Normal"/>
-    <w:next w:val="Normal"/>
-    <w:link w:val="Heading6Char"/>
-    <w:uiPriority w:val="9"/>
-    <w:semiHidden/>
-    <w:unhideWhenUsed/>
-    <w:qFormat/>
-    <w:rsid w:val="005A112C"/>
-    <w:pPr>
-      <w:keepNext/>
-      <w:keepLines/>
-      <w:spacing w:before="40"/>
-      <w:outlineLvl w:val="5"/>
-    </w:pPr>
-    <w:rPr>
-      <w:rFonts w:asciiTheme="minorHAnsi" w:eastAsiaTheme="majorEastAsia" w:hAnsiTheme="minorHAnsi" w:cstheme="majorBidi"/>
-      <w:i/>
-      <w:iCs/>
-      <w:color w:val="595959" w:themeColor="text1" w:themeTint="A6"/>
-    </w:rPr>
-  </w:style>
-  <w:style w:type="paragraph" w:styleId="Heading7">
-    <w:name w:val="heading 7"/>
-    <w:basedOn w:val="Normal"/>
-    <w:next w:val="Normal"/>
-    <w:link w:val="Heading7Char"/>
-    <w:uiPriority w:val="9"/>
-    <w:semiHidden/>
-    <w:unhideWhenUsed/>
-    <w:qFormat/>
-    <w:rsid w:val="005A112C"/>
-    <w:pPr>
-      <w:keepNext/>
-      <w:keepLines/>
-      <w:spacing w:before="40"/>
-      <w:outlineLvl w:val="6"/>
-    </w:pPr>
-    <w:rPr>
-      <w:rFonts w:asciiTheme="minorHAnsi" w:eastAsiaTheme="majorEastAsia" w:hAnsiTheme="minorHAnsi" w:cstheme="majorBidi"/>
-      <w:color w:val="595959" w:themeColor="text1" w:themeTint="A6"/>
-    </w:rPr>
-  </w:style>
-  <w:style w:type="paragraph" w:styleId="Heading8">
-    <w:name w:val="heading 8"/>
-    <w:basedOn w:val="Normal"/>
-    <w:next w:val="Normal"/>
-    <w:link w:val="Heading8Char"/>
-    <w:uiPriority w:val="9"/>
-    <w:semiHidden/>
-    <w:unhideWhenUsed/>
-    <w:qFormat/>
-    <w:rsid w:val="005A112C"/>
-    <w:pPr>
-      <w:keepNext/>
-      <w:keepLines/>
-      <w:outlineLvl w:val="7"/>
-    </w:pPr>
-    <w:rPr>
-      <w:rFonts w:asciiTheme="minorHAnsi" w:eastAsiaTheme="majorEastAsia" w:hAnsiTheme="minorHAnsi" w:cstheme="majorBidi"/>
-      <w:i/>
-      <w:iCs/>
-      <w:color w:val="272727" w:themeColor="text1" w:themeTint="D8"/>
-    </w:rPr>
-  </w:style>
-  <w:style w:type="paragraph" w:styleId="Heading9">
-    <w:name w:val="heading 9"/>
-    <w:basedOn w:val="Normal"/>
-    <w:next w:val="Normal"/>
-    <w:link w:val="Heading9Char"/>
-    <w:uiPriority w:val="9"/>
-    <w:semiHidden/>
-    <w:unhideWhenUsed/>
-    <w:qFormat/>
-    <w:rsid w:val="005A112C"/>
-    <w:pPr>
-      <w:keepNext/>
-      <w:keepLines/>
-      <w:outlineLvl w:val="8"/>
-    </w:pPr>
-    <w:rPr>
-      <w:rFonts w:asciiTheme="minorHAnsi" w:eastAsiaTheme="majorEastAsia" w:hAnsiTheme="minorHAnsi" w:cstheme="majorBidi"/>
-      <w:color w:val="272727" w:themeColor="text1" w:themeTint="D8"/>
-    </w:rPr>
-  </w:style>
-  <w:style w:type="character" w:default="1" w:styleId="DefaultParagraphFont">
-    <w:name w:val="Default Paragraph Font"/>
-    <w:uiPriority w:val="1"/>
-    <w:semiHidden/>
-    <w:unhideWhenUsed/>
-  </w:style>
-  <w:style w:type="table" w:default="1" w:styleId="TableNormal">
-    <w:name w:val="Normal Table"/>
     <w:uiPriority w:val="99"/>
-    <w:semiHidden/>
-    <w:unhideWhenUsed/>
-    <w:tblPr>
-      <w:tblInd w:w="0" w:type="dxa"/>
-      <w:tblCellMar>
-        <w:top w:w="0" w:type="dxa"/>
-        <w:left w:w="108" w:type="dxa"/>
-        <w:bottom w:w="0" w:type="dxa"/>
-        <w:right w:w="108" w:type="dxa"/>
-      </w:tblCellMar>
-    </w:tblPr>
-  </w:style>
-  <w:style w:type="numbering" w:default="1" w:styleId="NoList">
-    <w:name w:val="No List"/>
-    <w:uiPriority w:val="99"/>
-    <w:semiHidden/>
-    <w:unhideWhenUsed/>
-  </w:style>
-  <w:style w:type="character" w:customStyle="1" w:styleId="Heading1Char">
-    <w:name w:val="Heading 1 Char"/>
-    <w:basedOn w:val="DefaultParagraphFont"/>
-    <w:link w:val="Heading1"/>
-    <w:uiPriority w:val="9"/>
-    <w:rsid w:val="005A112C"/>
-    <w:rPr>
-      <w:rFonts w:asciiTheme="majorHAnsi" w:eastAsiaTheme="majorEastAsia" w:hAnsiTheme="majorHAnsi" w:cstheme="majorBidi"/>
-      <w:b/>
-      <w:color w:val="0F4761" w:themeColor="accent1" w:themeShade="BF"/>
-      <w:kern w:val="0"/>
-      <w:sz w:val="40"/>
-      <w:szCs w:val="40"/>
-      <w:lang w:val="vi"/>
-      <w14:ligatures w14:val="none"/>
-    </w:rPr>
-  </w:style>
-  <w:style w:type="character" w:customStyle="1" w:styleId="Heading2Char">
-    <w:name w:val="Heading 2 Char"/>
-    <w:basedOn w:val="DefaultParagraphFont"/>
-    <w:link w:val="Heading2"/>
-    <w:uiPriority w:val="9"/>
-    <w:semiHidden/>
-    <w:rsid w:val="005A112C"/>
-    <w:rPr>
-      <w:rFonts w:asciiTheme="majorHAnsi" w:eastAsiaTheme="majorEastAsia" w:hAnsiTheme="majorHAnsi" w:cstheme="majorBidi"/>
-      <w:b/>
-      <w:color w:val="0F4761" w:themeColor="accent1" w:themeShade="BF"/>
-      <w:kern w:val="0"/>
-      <w:sz w:val="32"/>
-      <w:szCs w:val="32"/>
-      <w:lang w:val="vi"/>
-      <w14:ligatures w14:val="none"/>
-    </w:rPr>
-  </w:style>
-  <w:style w:type="character" w:customStyle="1" w:styleId="Heading3Char">
-    <w:name w:val="Heading 3 Char"/>
-    <w:basedOn w:val="DefaultParagraphFont"/>
-    <w:link w:val="Heading3"/>
-    <w:uiPriority w:val="9"/>
-    <w:semiHidden/>
-    <w:rsid w:val="005A112C"/>
-    <w:rPr>
-      <w:rFonts w:eastAsiaTheme="majorEastAsia" w:cstheme="majorBidi"/>
-      <w:b/>
-      <w:color w:val="0F4761" w:themeColor="accent1" w:themeShade="BF"/>
-      <w:kern w:val="0"/>
-      <w:sz w:val="28"/>
-      <w:szCs w:val="28"/>
-      <w:lang w:val="vi"/>
-      <w14:ligatures w14:val="none"/>
-    </w:rPr>
-  </w:style>
-  <w:style w:type="character" w:customStyle="1" w:styleId="Heading4Char">
-    <w:name w:val="Heading 4 Char"/>
-    <w:basedOn w:val="DefaultParagraphFont"/>
-    <w:link w:val="Heading4"/>
-    <w:uiPriority w:val="9"/>
-    <w:semiHidden/>
-    <w:rsid w:val="005A112C"/>
-    <w:rPr>
-      <w:rFonts w:eastAsiaTheme="majorEastAsia" w:cstheme="majorBidi"/>
-      <w:b/>
-      <w:i/>
-      <w:iCs/>
-      <w:color w:val="0F4761" w:themeColor="accent1" w:themeShade="BF"/>
-      <w:kern w:val="0"/>
-      <w:sz w:val="22"/>
-      <w:szCs w:val="22"/>
-      <w:lang w:val="vi"/>
-      <w14:ligatures w14:val="none"/>
-    </w:rPr>
-  </w:style>
-  <w:style w:type="character" w:customStyle="1" w:styleId="Heading5Char">
-    <w:name w:val="Heading 5 Char"/>
-    <w:basedOn w:val="DefaultParagraphFont"/>
-    <w:link w:val="Heading5"/>
-    <w:uiPriority w:val="9"/>
-    <w:semiHidden/>
-    <w:rsid w:val="005A112C"/>
-    <w:rPr>
-      <w:rFonts w:eastAsiaTheme="majorEastAsia" w:cstheme="majorBidi"/>
-      <w:b/>
-      <w:color w:val="0F4761" w:themeColor="accent1" w:themeShade="BF"/>
-      <w:kern w:val="0"/>
-      <w:sz w:val="22"/>
-      <w:szCs w:val="22"/>
-      <w:lang w:val="vi"/>
-      <w14:ligatures w14:val="none"/>
-    </w:rPr>
-  </w:style>
-  <w:style w:type="character" w:customStyle="1" w:styleId="Heading6Char">
-    <w:name w:val="Heading 6 Char"/>
-    <w:basedOn w:val="DefaultParagraphFont"/>
-    <w:link w:val="Heading6"/>
-    <w:uiPriority w:val="9"/>
-    <w:semiHidden/>
-    <w:rsid w:val="005A112C"/>
-    <w:rPr>
-      <w:rFonts w:eastAsiaTheme="majorEastAsia" w:cstheme="majorBidi"/>
-      <w:b/>
-      <w:i/>
-      <w:iCs/>
-      <w:color w:val="595959" w:themeColor="text1" w:themeTint="A6"/>
-      <w:kern w:val="0"/>
-      <w:sz w:val="22"/>
-      <w:szCs w:val="22"/>
-      <w:lang w:val="vi"/>
-      <w14:ligatures w14:val="none"/>
-    </w:rPr>
-  </w:style>
-  <w:style w:type="character" w:customStyle="1" w:styleId="Heading7Char">
-    <w:name w:val="Heading 7 Char"/>
-    <w:basedOn w:val="DefaultParagraphFont"/>
-    <w:link w:val="Heading7"/>
-    <w:uiPriority w:val="9"/>
-    <w:semiHidden/>
-    <w:rsid w:val="005A112C"/>
-    <w:rPr>
-      <w:rFonts w:eastAsiaTheme="majorEastAsia" w:cstheme="majorBidi"/>
-      <w:b/>
-      <w:color w:val="595959" w:themeColor="text1" w:themeTint="A6"/>
-      <w:kern w:val="0"/>
-      <w:sz w:val="22"/>
-      <w:szCs w:val="22"/>
-      <w:lang w:val="vi"/>
-      <w14:ligatures w14:val="none"/>
-    </w:rPr>
-  </w:style>
-  <w:style w:type="character" w:customStyle="1" w:styleId="Heading8Char">
-    <w:name w:val="Heading 8 Char"/>
-    <w:basedOn w:val="DefaultParagraphFont"/>
-    <w:link w:val="Heading8"/>
-    <w:uiPriority w:val="9"/>
-    <w:semiHidden/>
-    <w:rsid w:val="005A112C"/>
-    <w:rPr>
-      <w:rFonts w:eastAsiaTheme="majorEastAsia" w:cstheme="majorBidi"/>
-      <w:b/>
-      <w:i/>
-      <w:iCs/>
-      <w:color w:val="272727" w:themeColor="text1" w:themeTint="D8"/>
-      <w:kern w:val="0"/>
-      <w:sz w:val="22"/>
-      <w:szCs w:val="22"/>
-      <w:lang w:val="vi"/>
-      <w14:ligatures w14:val="none"/>
-    </w:rPr>
-  </w:style>
-  <w:style w:type="character" w:customStyle="1" w:styleId="Heading9Char">
-    <w:name w:val="Heading 9 Char"/>
-    <w:basedOn w:val="DefaultParagraphFont"/>
-    <w:link w:val="Heading9"/>
-    <w:uiPriority w:val="9"/>
-    <w:semiHidden/>
-    <w:rsid w:val="005A112C"/>
-    <w:rPr>
-      <w:rFonts w:eastAsiaTheme="majorEastAsia" w:cstheme="majorBidi"/>
-      <w:b/>
-      <w:color w:val="272727" w:themeColor="text1" w:themeTint="D8"/>
-      <w:kern w:val="0"/>
-      <w:sz w:val="22"/>
-      <w:szCs w:val="22"/>
-      <w:lang w:val="vi"/>
-      <w14:ligatures w14:val="none"/>
-    </w:rPr>
-  </w:style>
-  <w:style w:type="paragraph" w:styleId="Title">
-    <w:name w:val="Title"/>
-    <w:basedOn w:val="Normal"/>
-    <w:next w:val="Normal"/>
-    <w:link w:val="TitleChar"/>
-    <w:uiPriority w:val="10"/>
-    <w:qFormat/>
-    <w:rsid w:val="005A112C"/>
-    <w:pPr>
-      <w:spacing w:after="80" w:line="240" w:lineRule="auto"/>
-      <w:contextualSpacing/>
-    </w:pPr>
-    <w:rPr>
-      <w:rFonts w:asciiTheme="majorHAnsi" w:eastAsiaTheme="majorEastAsia" w:hAnsiTheme="majorHAnsi" w:cstheme="majorBidi"/>
-      <w:color w:val="auto"/>
-      <w:spacing w:val="-10"/>
-      <w:kern w:val="28"/>
-      <w:sz w:val="56"/>
-      <w:szCs w:val="56"/>
-    </w:rPr>
-  </w:style>
-  <w:style w:type="character" w:customStyle="1" w:styleId="TitleChar">
-    <w:name w:val="Title Char"/>
-    <w:basedOn w:val="DefaultParagraphFont"/>
-    <w:link w:val="Title"/>
-    <w:uiPriority w:val="10"/>
-    <w:rsid w:val="005A112C"/>
-    <w:rPr>
-      <w:rFonts w:asciiTheme="majorHAnsi" w:eastAsiaTheme="majorEastAsia" w:hAnsiTheme="majorHAnsi" w:cstheme="majorBidi"/>
-      <w:b/>
-      <w:spacing w:val="-10"/>
-      <w:kern w:val="28"/>
-      <w:sz w:val="56"/>
-      <w:szCs w:val="56"/>
-      <w:lang w:val="vi"/>
-      <w14:ligatures w14:val="none"/>
-    </w:rPr>
-  </w:style>
-  <w:style w:type="paragraph" w:styleId="Subtitle">
-    <w:name w:val="Subtitle"/>
-    <w:basedOn w:val="Normal"/>
-    <w:next w:val="Normal"/>
-    <w:link w:val="SubtitleChar"/>
-    <w:uiPriority w:val="11"/>
-    <w:qFormat/>
-    <w:rsid w:val="005A112C"/>
-    <w:pPr>
-      <w:numPr>
-        <w:ilvl w:val="1"/>
-      </w:numPr>
-      <w:spacing w:after="160"/>
-    </w:pPr>
-    <w:rPr>
-      <w:rFonts w:asciiTheme="minorHAnsi" w:eastAsiaTheme="majorEastAsia" w:hAnsiTheme="minorHAnsi" w:cstheme="majorBidi"/>
-      <w:color w:val="595959" w:themeColor="text1" w:themeTint="A6"/>
-      <w:spacing w:val="15"/>
-      <w:sz w:val="28"/>
-      <w:szCs w:val="28"/>
-    </w:rPr>
-  </w:style>
-  <w:style w:type="character" w:customStyle="1" w:styleId="SubtitleChar">
-    <w:name w:val="Subtitle Char"/>
-    <w:basedOn w:val="DefaultParagraphFont"/>
-    <w:link w:val="Subtitle"/>
-    <w:uiPriority w:val="11"/>
-    <w:rsid w:val="005A112C"/>
-    <w:rPr>
-      <w:rFonts w:eastAsiaTheme="majorEastAsia" w:cstheme="majorBidi"/>
-      <w:b/>
-      <w:color w:val="595959" w:themeColor="text1" w:themeTint="A6"/>
-      <w:spacing w:val="15"/>
-      <w:kern w:val="0"/>
-      <w:sz w:val="28"/>
-      <w:szCs w:val="28"/>
-      <w:lang w:val="vi"/>
-      <w14:ligatures w14:val="none"/>
-    </w:rPr>
-  </w:style>
-  <w:style w:type="paragraph" w:styleId="Quote">
-    <w:name w:val="Quote"/>
-    <w:basedOn w:val="Normal"/>
-    <w:next w:val="Normal"/>
-    <w:link w:val="QuoteChar"/>
-    <w:uiPriority w:val="29"/>
-    <w:qFormat/>
-    <w:rsid w:val="005A112C"/>
-    <w:pPr>
-      <w:spacing w:before="160" w:after="160"/>
-      <w:jc w:val="center"/>
-    </w:pPr>
-    <w:rPr>
-      <w:i/>
-      <w:iCs/>
-      <w:color w:val="404040" w:themeColor="text1" w:themeTint="BF"/>
-    </w:rPr>
-  </w:style>
-  <w:style w:type="character" w:customStyle="1" w:styleId="QuoteChar">
-    <w:name w:val="Quote Char"/>
-    <w:basedOn w:val="DefaultParagraphFont"/>
-    <w:link w:val="Quote"/>
-    <w:uiPriority w:val="29"/>
-    <w:rsid w:val="005A112C"/>
-    <w:rPr>
-      <w:rFonts w:ascii="Times New Roman" w:hAnsi="Times New Roman" w:cs="Arial"/>
-      <w:b/>
-      <w:i/>
-      <w:iCs/>
-      <w:color w:val="404040" w:themeColor="text1" w:themeTint="BF"/>
-      <w:kern w:val="0"/>
-      <w:sz w:val="22"/>
-      <w:szCs w:val="22"/>
-      <w:lang w:val="vi"/>
-      <w14:ligatures w14:val="none"/>
-    </w:rPr>
-  </w:style>
-  <w:style w:type="paragraph" w:styleId="ListParagraph">
-    <w:name w:val="List Paragraph"/>
-    <w:basedOn w:val="Normal"/>
-    <w:uiPriority w:val="34"/>
-    <w:qFormat/>
-    <w:rsid w:val="005A112C"/>
-    <w:pPr>
-      <w:ind w:left="720"/>
-      <w:contextualSpacing/>
-    </w:pPr>
-  </w:style>
-  <w:style w:type="character" w:styleId="IntenseEmphasis">
-    <w:name w:val="Intense Emphasis"/>
-    <w:basedOn w:val="DefaultParagraphFont"/>
-    <w:uiPriority w:val="21"/>
-    <w:qFormat/>
-    <w:rsid w:val="005A112C"/>
-    <w:rPr>
-      <w:i/>
-      <w:iCs/>
-      <w:color w:val="0F4761" w:themeColor="accent1" w:themeShade="BF"/>
-    </w:rPr>
-  </w:style>
-  <w:style w:type="paragraph" w:styleId="IntenseQuote">
-    <w:name w:val="Intense Quote"/>
-    <w:basedOn w:val="Normal"/>
-    <w:next w:val="Normal"/>
-    <w:link w:val="IntenseQuoteChar"/>
-    <w:uiPriority w:val="30"/>
-    <w:qFormat/>
-    <w:rsid w:val="005A112C"/>
-    <w:pPr>
-      <w:pBdr>
-        <w:top w:val="single" w:sz="4" w:space="10" w:color="0F4761" w:themeColor="accent1" w:themeShade="BF"/>
-        <w:bottom w:val="single" w:sz="4" w:space="10" w:color="0F4761" w:themeColor="accent1" w:themeShade="BF"/>
-      </w:pBdr>
-      <w:spacing w:before="360" w:after="360"/>
-      <w:ind w:left="864" w:right="864"/>
-      <w:jc w:val="center"/>
-    </w:pPr>
-    <w:rPr>
-      <w:i/>
-      <w:iCs/>
-      <w:color w:val="0F4761" w:themeColor="accent1" w:themeShade="BF"/>
-    </w:rPr>
-  </w:style>
-  <w:style w:type="character" w:customStyle="1" w:styleId="IntenseQuoteChar">
-    <w:name w:val="Intense Quote Char"/>
-    <w:basedOn w:val="DefaultParagraphFont"/>
-    <w:link w:val="IntenseQuote"/>
-    <w:uiPriority w:val="30"/>
-    <w:rsid w:val="005A112C"/>
-    <w:rPr>
-      <w:rFonts w:ascii="Times New Roman" w:hAnsi="Times New Roman" w:cs="Arial"/>
-      <w:b/>
-      <w:i/>
-      <w:iCs/>
-      <w:color w:val="0F4761" w:themeColor="accent1" w:themeShade="BF"/>
-      <w:kern w:val="0"/>
-      <w:sz w:val="22"/>
-      <w:szCs w:val="22"/>
-      <w:lang w:val="vi"/>
-      <w14:ligatures w14:val="none"/>
-    </w:rPr>
-  </w:style>
-  <w:style w:type="character" w:styleId="IntenseReference">
-    <w:name w:val="Intense Reference"/>
-    <w:basedOn w:val="DefaultParagraphFont"/>
-    <w:uiPriority w:val="32"/>
-    <w:qFormat/>
-    <w:rsid w:val="005A112C"/>
-    <w:rPr>
-      <w:b/>
-      <w:bCs/>
-      <w:smallCaps/>
-      <w:color w:val="0F4761" w:themeColor="accent1" w:themeShade="BF"/>
-      <w:spacing w:val="5"/>
-    </w:rPr>
-  </w:style>
-  <w:style w:type="paragraph" w:styleId="Header">
-    <w:name w:val="header"/>
-    <w:basedOn w:val="Normal"/>
-    <w:link w:val="HeaderChar"/>
-    <w:uiPriority w:val="99"/>
-    <w:unhideWhenUsed/>
-    <w:rsid w:val="005A112C"/>
-    <w:pPr>
-      <w:tabs>
-        <w:tab w:val="center" w:pos="4680"/>
-        <w:tab w:val="right" w:pos="9360"/>
-      </w:tabs>
-      <w:spacing w:line="240" w:lineRule="auto"/>
-    </w:pPr>
-  </w:style>
-  <w:style w:type="character" w:customStyle="1" w:styleId="HeaderChar">
-    <w:name w:val="Header Char"/>
-    <w:basedOn w:val="DefaultParagraphFont"/>
-    <w:link w:val="Header"/>
-    <w:uiPriority w:val="99"/>
-    <w:rsid w:val="005A112C"/>
     <w:rPr>
       <w:rFonts w:ascii="Times New Roman" w:hAnsi="Times New Roman" w:cs="Arial"/>
       <w:b/>
@@ -5775,63 +4921,12 @@
       <w14:ligatures w14:val="none"/>
     </w:rPr>
   </w:style>
-  <w:style w:type="paragraph" w:styleId="Footer">
-    <w:name w:val="footer"/>
-    <w:basedOn w:val="Normal"/>
-    <w:link w:val="FooterChar"/>
-    <w:uiPriority w:val="99"/>
-    <w:unhideWhenUsed/>
-    <w:rsid w:val="005A112C"/>
-    <w:pPr>
-      <w:tabs>
-        <w:tab w:val="center" w:pos="4680"/>
-        <w:tab w:val="right" w:pos="9360"/>
-      </w:tabs>
-      <w:spacing w:line="240" w:lineRule="auto"/>
-    </w:pPr>
-  </w:style>
-  <w:style w:type="character" w:customStyle="1" w:styleId="FooterChar">
-    <w:name w:val="Footer Char"/>
-    <w:basedOn w:val="DefaultParagraphFont"/>
-    <w:link w:val="Footer"/>
-    <w:uiPriority w:val="99"/>
-    <w:rsid w:val="005A112C"/>
-    <w:rPr>
-      <w:rFonts w:ascii="Times New Roman" w:hAnsi="Times New Roman" w:cs="Arial"/>
-      <w:b/>
-      <w:color w:val="FF0000"/>
-      <w:kern w:val="0"/>
-      <w:sz w:val="22"/>
-      <w:szCs w:val="22"/>
-      <w:lang w:val="vi"/>
-      <w14:ligatures w14:val="none"/>
-    </w:rPr>
-  </w:style>
-  <w:style w:type="table" w:styleId="TableGrid">
-    <w:name w:val="Table Grid"/>
-    <w:basedOn w:val="TableNormal"/>
-    <w:uiPriority w:val="39"/>
-    <w:rsid w:val="005A112C"/>
-    <w:pPr>
-      <w:spacing w:line="240" w:lineRule="auto"/>
-    </w:pPr>
-    <w:tblPr>
-      <w:tblBorders>
-        <w:top w:val="single" w:sz="4" w:space="0" w:color="auto"/>
-        <w:left w:val="single" w:sz="4" w:space="0" w:color="auto"/>
-        <w:bottom w:val="single" w:sz="4" w:space="0" w:color="auto"/>
-        <w:right w:val="single" w:sz="4" w:space="0" w:color="auto"/>
-        <w:insideH w:val="single" w:sz="4" w:space="0" w:color="auto"/>
-        <w:insideV w:val="single" w:sz="4" w:space="0" w:color="auto"/>
-      </w:tblBorders>
-    </w:tblPr>
-  </w:style>
-  <w:style w:type="paragraph" w:customStyle="1" w:styleId="JMSTContent">
+  <w:style w:type="paragraph" w:customStyle="1" w:styleId="41">
     <w:name w:val="JMST_Content"/>
-    <w:basedOn w:val="Normal"/>
-    <w:link w:val="JMSTContentChar"/>
+    <w:basedOn w:val="1"/>
+    <w:link w:val="42"/>
     <w:qFormat/>
-    <w:rsid w:val="00612489"/>
+    <w:uiPriority w:val="0"/>
     <w:pPr>
       <w:widowControl w:val="0"/>
       <w:spacing w:before="40" w:after="40" w:line="260" w:lineRule="exact"/>
@@ -5848,74 +4943,32 @@
       <w:lang w:val="vi-VN" w:eastAsia="ja-JP"/>
     </w:rPr>
   </w:style>
-  <w:style w:type="character" w:customStyle="1" w:styleId="JMSTContentChar">
+  <w:style w:type="character" w:customStyle="1" w:styleId="42">
     <w:name w:val="JMST_Content Char"/>
-    <w:link w:val="JMSTContent"/>
-    <w:rsid w:val="00612489"/>
+    <w:link w:val="41"/>
+    <w:qFormat/>
+    <w:uiPriority w:val="0"/>
     <w:rPr>
-      <w:rFonts w:ascii="Times New Roman" w:eastAsia="MS Mincho" w:hAnsi="Times New Roman" w:cs="Arial"/>
+      <w:rFonts w:ascii="Times New Roman" w:hAnsi="Times New Roman" w:eastAsia="MS Mincho" w:cs="Arial"/>
       <w:sz w:val="20"/>
       <w:szCs w:val="20"/>
       <w:lang w:val="vi-VN" w:eastAsia="ja-JP"/>
       <w14:ligatures w14:val="none"/>
     </w:rPr>
   </w:style>
-  <w:style w:type="character" w:styleId="CommentReference">
-    <w:name w:val="annotation reference"/>
-    <w:basedOn w:val="DefaultParagraphFont"/>
+  <w:style w:type="character" w:customStyle="1" w:styleId="43">
+    <w:name w:val="math-inline"/>
+    <w:basedOn w:val="11"/>
+    <w:qFormat/>
+    <w:uiPriority w:val="0"/>
+  </w:style>
+  <w:style w:type="character" w:customStyle="1" w:styleId="44">
+    <w:name w:val="Comment Text Char"/>
+    <w:basedOn w:val="11"/>
+    <w:link w:val="14"/>
+    <w:semiHidden/>
+    <w:qFormat/>
     <w:uiPriority w:val="99"/>
-    <w:semiHidden/>
-    <w:unhideWhenUsed/>
-    <w:rsid w:val="00612489"/>
-    <w:rPr>
-      <w:sz w:val="16"/>
-      <w:szCs w:val="16"/>
-    </w:rPr>
-  </w:style>
-  <w:style w:type="paragraph" w:styleId="NormalWeb">
-    <w:name w:val="Normal (Web)"/>
-    <w:basedOn w:val="Normal"/>
-    <w:uiPriority w:val="99"/>
-    <w:unhideWhenUsed/>
-    <w:rsid w:val="0017790E"/>
-    <w:pPr>
-      <w:spacing w:before="100" w:beforeAutospacing="1" w:after="100" w:afterAutospacing="1" w:line="240" w:lineRule="auto"/>
-    </w:pPr>
-    <w:rPr>
-      <w:rFonts w:eastAsia="Times New Roman" w:cs="Times New Roman"/>
-      <w:b w:val="0"/>
-      <w:color w:val="auto"/>
-      <w:sz w:val="24"/>
-      <w:szCs w:val="24"/>
-      <w:lang/>
-    </w:rPr>
-  </w:style>
-  <w:style w:type="character" w:customStyle="1" w:styleId="math-inline">
-    <w:name w:val="math-inline"/>
-    <w:basedOn w:val="DefaultParagraphFont"/>
-    <w:rsid w:val="0017790E"/>
-  </w:style>
-  <w:style w:type="paragraph" w:styleId="CommentText">
-    <w:name w:val="annotation text"/>
-    <w:basedOn w:val="Normal"/>
-    <w:link w:val="CommentTextChar"/>
-    <w:uiPriority w:val="99"/>
-    <w:semiHidden/>
-    <w:unhideWhenUsed/>
-    <w:pPr>
-      <w:spacing w:line="240" w:lineRule="auto"/>
-    </w:pPr>
-    <w:rPr>
-      <w:sz w:val="20"/>
-      <w:szCs w:val="20"/>
-    </w:rPr>
-  </w:style>
-  <w:style w:type="character" w:customStyle="1" w:styleId="CommentTextChar">
-    <w:name w:val="Comment Text Char"/>
-    <w:basedOn w:val="DefaultParagraphFont"/>
-    <w:link w:val="CommentText"/>
-    <w:uiPriority w:val="99"/>
-    <w:semiHidden/>
     <w:rPr>
       <w:rFonts w:ascii="Times New Roman" w:hAnsi="Times New Roman" w:cs="Arial"/>
       <w:b/>
@@ -5973,7 +5026,7 @@
     </a:clrScheme>
     <a:fontScheme name="Office">
       <a:majorFont>
-        <a:latin typeface="Aptos Display" panose="02110004020202020204"/>
+        <a:latin typeface="Aptos Display"/>
         <a:ea typeface=""/>
         <a:cs typeface=""/>
         <a:font script="Jpan" typeface="游ゴシック Light"/>
@@ -6006,26 +5059,9 @@
         <a:font script="Viet" typeface="Times New Roman"/>
         <a:font script="Uigh" typeface="Microsoft Uighur"/>
         <a:font script="Geor" typeface="Sylfaen"/>
-        <a:font script="Armn" typeface="Arial"/>
-        <a:font script="Bugi" typeface="Leelawadee UI"/>
-        <a:font script="Bopo" typeface="Microsoft JhengHei"/>
-        <a:font script="Java" typeface="Javanese Text"/>
-        <a:font script="Lisu" typeface="Segoe UI"/>
-        <a:font script="Mymr" typeface="Myanmar Text"/>
-        <a:font script="Nkoo" typeface="Ebrima"/>
-        <a:font script="Olck" typeface="Nirmala UI"/>
-        <a:font script="Osma" typeface="Ebrima"/>
-        <a:font script="Phag" typeface="Phagspa"/>
-        <a:font script="Syrn" typeface="Estrangelo Edessa"/>
-        <a:font script="Syrj" typeface="Estrangelo Edessa"/>
-        <a:font script="Syre" typeface="Estrangelo Edessa"/>
-        <a:font script="Sora" typeface="Nirmala UI"/>
-        <a:font script="Tale" typeface="Microsoft Tai Le"/>
-        <a:font script="Talu" typeface="Microsoft New Tai Lue"/>
-        <a:font script="Tfng" typeface="Ebrima"/>
       </a:majorFont>
       <a:minorFont>
-        <a:latin typeface="Aptos" panose="02110004020202020204"/>
+        <a:latin typeface="Aptos"/>
         <a:ea typeface=""/>
         <a:cs typeface=""/>
         <a:font script="Jpan" typeface="游明朝"/>
@@ -6058,23 +5094,6 @@
         <a:font script="Viet" typeface="Arial"/>
         <a:font script="Uigh" typeface="Microsoft Uighur"/>
         <a:font script="Geor" typeface="Sylfaen"/>
-        <a:font script="Armn" typeface="Arial"/>
-        <a:font script="Bugi" typeface="Leelawadee UI"/>
-        <a:font script="Bopo" typeface="Microsoft JhengHei"/>
-        <a:font script="Java" typeface="Javanese Text"/>
-        <a:font script="Lisu" typeface="Segoe UI"/>
-        <a:font script="Mymr" typeface="Myanmar Text"/>
-        <a:font script="Nkoo" typeface="Ebrima"/>
-        <a:font script="Olck" typeface="Nirmala UI"/>
-        <a:font script="Osma" typeface="Ebrima"/>
-        <a:font script="Phag" typeface="Phagspa"/>
-        <a:font script="Syrn" typeface="Estrangelo Edessa"/>
-        <a:font script="Syrj" typeface="Estrangelo Edessa"/>
-        <a:font script="Syre" typeface="Estrangelo Edessa"/>
-        <a:font script="Sora" typeface="Nirmala UI"/>
-        <a:font script="Tale" typeface="Microsoft Tai Le"/>
-        <a:font script="Talu" typeface="Microsoft New Tai Lue"/>
-        <a:font script="Tfng" typeface="Ebrima"/>
       </a:minorFont>
     </a:fontScheme>
     <a:fmtScheme name="Office">
@@ -6236,11 +5255,26 @@
       </a:style>
     </a:lnDef>
   </a:objectDefaults>
-  <a:extraClrSchemeLst/>
-  <a:extLst>
-    <a:ext uri="{05A4C25C-085E-4340-85A3-A5531E510DB2}">
-      <thm15:themeFamily xmlns:thm15="http://schemas.microsoft.com/office/thememl/2012/main" name="Office Theme" id="{2E142A2C-CD16-42D6-873A-C26D2A0506FA}" vid="{1BDDFF52-6CD6-40A5-AB3C-68EB2F1E4D0A}"/>
-    </a:ext>
-  </a:extLst>
 </a:theme>
+</file>
+
+<file path=customXml/item1.xml><?xml version="1.0" encoding="utf-8"?>
+<s:customData xmlns="http://www.wps.cn/officeDocument/2013/wpsCustomData" xmlns:s="http://www.wps.cn/officeDocument/2013/wpsCustomData">
+  <customSectProps>
+    <customSectPr/>
+  </customSectProps>
+  <customShpExts>
+    <customShpInfo spid="_x0000_s1026"/>
+    <customShpInfo spid="_x0000_s1027"/>
+    <customShpInfo spid="_x0000_s1025"/>
+  </customShpExts>
+</s:customData>
+</file>
+
+<file path=customXml/itemProps1.xml><?xml version="1.0" encoding="utf-8"?>
+<ds:datastoreItem xmlns:ds="http://schemas.openxmlformats.org/officeDocument/2006/customXml" ds:itemID="{B1977F7D-205B-4081-913C-38D41E755F92}">
+  <ds:schemaRefs>
+    <ds:schemaRef ds:uri="http://www.wps.cn/officeDocument/2013/wpsCustomData"/>
+  </ds:schemaRefs>
+</ds:datastoreItem>
 </file>
</xml_diff>